<commit_message>
docs: continue research section
</commit_message>
<xml_diff>
--- a/Project Report.docx
+++ b/Project Report.docx
@@ -227,7 +227,7 @@
           <w:r>
             <w:fldChar w:fldCharType="separate"/>
           </w:r>
-          <w:hyperlink w:anchor="_Toc223389251" w:history="1">
+          <w:hyperlink w:anchor="_Toc223514209" w:history="1">
             <w:r>
               <w:rPr>
                 <w:rStyle w:val="Hyperlink"/>
@@ -254,7 +254,7 @@
                 <w:noProof/>
                 <w:webHidden/>
               </w:rPr>
-              <w:instrText xml:space="preserve"> PAGEREF _Toc223389251 \h </w:instrText>
+              <w:instrText xml:space="preserve"> PAGEREF _Toc223514209 \h </w:instrText>
             </w:r>
             <w:r>
               <w:rPr>
@@ -298,7 +298,7 @@
               <w14:ligatures w14:val="standardContextual"/>
             </w:rPr>
           </w:pPr>
-          <w:hyperlink w:anchor="_Toc223389252" w:history="1">
+          <w:hyperlink w:anchor="_Toc223514210" w:history="1">
             <w:r>
               <w:rPr>
                 <w:rStyle w:val="Hyperlink"/>
@@ -325,7 +325,7 @@
                 <w:noProof/>
                 <w:webHidden/>
               </w:rPr>
-              <w:instrText xml:space="preserve"> PAGEREF _Toc223389252 \h </w:instrText>
+              <w:instrText xml:space="preserve"> PAGEREF _Toc223514210 \h </w:instrText>
             </w:r>
             <w:r>
               <w:rPr>
@@ -369,7 +369,7 @@
               <w14:ligatures w14:val="standardContextual"/>
             </w:rPr>
           </w:pPr>
-          <w:hyperlink w:anchor="_Toc223389253" w:history="1">
+          <w:hyperlink w:anchor="_Toc223514211" w:history="1">
             <w:r>
               <w:rPr>
                 <w:rStyle w:val="Hyperlink"/>
@@ -396,7 +396,7 @@
                 <w:noProof/>
                 <w:webHidden/>
               </w:rPr>
-              <w:instrText xml:space="preserve"> PAGEREF _Toc223389253 \h </w:instrText>
+              <w:instrText xml:space="preserve"> PAGEREF _Toc223514211 \h </w:instrText>
             </w:r>
             <w:r>
               <w:rPr>
@@ -440,7 +440,7 @@
               <w14:ligatures w14:val="standardContextual"/>
             </w:rPr>
           </w:pPr>
-          <w:hyperlink w:anchor="_Toc223389254" w:history="1">
+          <w:hyperlink w:anchor="_Toc223514212" w:history="1">
             <w:r>
               <w:rPr>
                 <w:rStyle w:val="Hyperlink"/>
@@ -467,7 +467,7 @@
                 <w:noProof/>
                 <w:webHidden/>
               </w:rPr>
-              <w:instrText xml:space="preserve"> PAGEREF _Toc223389254 \h </w:instrText>
+              <w:instrText xml:space="preserve"> PAGEREF _Toc223514212 \h </w:instrText>
             </w:r>
             <w:r>
               <w:rPr>
@@ -511,7 +511,7 @@
               <w14:ligatures w14:val="standardContextual"/>
             </w:rPr>
           </w:pPr>
-          <w:hyperlink w:anchor="_Toc223389255" w:history="1">
+          <w:hyperlink w:anchor="_Toc223514213" w:history="1">
             <w:r>
               <w:rPr>
                 <w:rStyle w:val="Hyperlink"/>
@@ -538,7 +538,7 @@
                 <w:noProof/>
                 <w:webHidden/>
               </w:rPr>
-              <w:instrText xml:space="preserve"> PAGEREF _Toc223389255 \h </w:instrText>
+              <w:instrText xml:space="preserve"> PAGEREF _Toc223514213 \h </w:instrText>
             </w:r>
             <w:r>
               <w:rPr>
@@ -582,7 +582,7 @@
               <w14:ligatures w14:val="standardContextual"/>
             </w:rPr>
           </w:pPr>
-          <w:hyperlink w:anchor="_Toc223389256" w:history="1">
+          <w:hyperlink w:anchor="_Toc223514214" w:history="1">
             <w:r>
               <w:rPr>
                 <w:rStyle w:val="Hyperlink"/>
@@ -609,7 +609,7 @@
                 <w:noProof/>
                 <w:webHidden/>
               </w:rPr>
-              <w:instrText xml:space="preserve"> PAGEREF _Toc223389256 \h </w:instrText>
+              <w:instrText xml:space="preserve"> PAGEREF _Toc223514214 \h </w:instrText>
             </w:r>
             <w:r>
               <w:rPr>
@@ -653,7 +653,7 @@
               <w14:ligatures w14:val="standardContextual"/>
             </w:rPr>
           </w:pPr>
-          <w:hyperlink w:anchor="_Toc223389257" w:history="1">
+          <w:hyperlink w:anchor="_Toc223514215" w:history="1">
             <w:r>
               <w:rPr>
                 <w:rStyle w:val="Hyperlink"/>
@@ -680,7 +680,7 @@
                 <w:noProof/>
                 <w:webHidden/>
               </w:rPr>
-              <w:instrText xml:space="preserve"> PAGEREF _Toc223389257 \h </w:instrText>
+              <w:instrText xml:space="preserve"> PAGEREF _Toc223514215 \h </w:instrText>
             </w:r>
             <w:r>
               <w:rPr>
@@ -724,7 +724,7 @@
               <w14:ligatures w14:val="standardContextual"/>
             </w:rPr>
           </w:pPr>
-          <w:hyperlink w:anchor="_Toc223389258" w:history="1">
+          <w:hyperlink w:anchor="_Toc223514216" w:history="1">
             <w:r>
               <w:rPr>
                 <w:rStyle w:val="Hyperlink"/>
@@ -751,7 +751,7 @@
                 <w:noProof/>
                 <w:webHidden/>
               </w:rPr>
-              <w:instrText xml:space="preserve"> PAGEREF _Toc223389258 \h </w:instrText>
+              <w:instrText xml:space="preserve"> PAGEREF _Toc223514216 \h </w:instrText>
             </w:r>
             <w:r>
               <w:rPr>
@@ -795,13 +795,27 @@
               <w14:ligatures w14:val="standardContextual"/>
             </w:rPr>
           </w:pPr>
-          <w:hyperlink w:anchor="_Toc223389259" w:history="1">
+          <w:hyperlink w:anchor="_Toc223514217" w:history="1">
             <w:r>
               <w:rPr>
                 <w:rStyle w:val="Hyperlink"/>
                 <w:noProof/>
               </w:rPr>
-              <w:t>Machine-Learning (ML) Algorithms</w:t>
+              <w:t>Machine-Learning (ML) Algo</w:t>
+            </w:r>
+            <w:r>
+              <w:rPr>
+                <w:rStyle w:val="Hyperlink"/>
+                <w:noProof/>
+              </w:rPr>
+              <w:t>r</w:t>
+            </w:r>
+            <w:r>
+              <w:rPr>
+                <w:rStyle w:val="Hyperlink"/>
+                <w:noProof/>
+              </w:rPr>
+              <w:t>ithms</w:t>
             </w:r>
             <w:r>
               <w:rPr>
@@ -822,7 +836,7 @@
                 <w:noProof/>
                 <w:webHidden/>
               </w:rPr>
-              <w:instrText xml:space="preserve"> PAGEREF _Toc223389259 \h </w:instrText>
+              <w:instrText xml:space="preserve"> PAGEREF _Toc223514217 \h </w:instrText>
             </w:r>
             <w:r>
               <w:rPr>
@@ -866,7 +880,7 @@
               <w14:ligatures w14:val="standardContextual"/>
             </w:rPr>
           </w:pPr>
-          <w:hyperlink w:anchor="_Toc223389260" w:history="1">
+          <w:hyperlink w:anchor="_Toc223514218" w:history="1">
             <w:r>
               <w:rPr>
                 <w:rStyle w:val="Hyperlink"/>
@@ -893,7 +907,7 @@
                 <w:noProof/>
                 <w:webHidden/>
               </w:rPr>
-              <w:instrText xml:space="preserve"> PAGEREF _Toc223389260 \h </w:instrText>
+              <w:instrText xml:space="preserve"> PAGEREF _Toc223514218 \h </w:instrText>
             </w:r>
             <w:r>
               <w:rPr>
@@ -913,7 +927,7 @@
                 <w:noProof/>
                 <w:webHidden/>
               </w:rPr>
-              <w:t>10</w:t>
+              <w:t>11</w:t>
             </w:r>
             <w:r>
               <w:rPr>
@@ -937,7 +951,7 @@
               <w14:ligatures w14:val="standardContextual"/>
             </w:rPr>
           </w:pPr>
-          <w:hyperlink w:anchor="_Toc223389261" w:history="1">
+          <w:hyperlink w:anchor="_Toc223514219" w:history="1">
             <w:r>
               <w:rPr>
                 <w:rStyle w:val="Hyperlink"/>
@@ -964,7 +978,7 @@
                 <w:noProof/>
                 <w:webHidden/>
               </w:rPr>
-              <w:instrText xml:space="preserve"> PAGEREF _Toc223389261 \h </w:instrText>
+              <w:instrText xml:space="preserve"> PAGEREF _Toc223514219 \h </w:instrText>
             </w:r>
             <w:r>
               <w:rPr>
@@ -984,7 +998,7 @@
                 <w:noProof/>
                 <w:webHidden/>
               </w:rPr>
-              <w:t>10</w:t>
+              <w:t>11</w:t>
             </w:r>
             <w:r>
               <w:rPr>
@@ -1008,7 +1022,7 @@
               <w14:ligatures w14:val="standardContextual"/>
             </w:rPr>
           </w:pPr>
-          <w:hyperlink w:anchor="_Toc223389262" w:history="1">
+          <w:hyperlink w:anchor="_Toc223514220" w:history="1">
             <w:r>
               <w:rPr>
                 <w:rStyle w:val="Hyperlink"/>
@@ -1035,7 +1049,7 @@
                 <w:noProof/>
                 <w:webHidden/>
               </w:rPr>
-              <w:instrText xml:space="preserve"> PAGEREF _Toc223389262 \h </w:instrText>
+              <w:instrText xml:space="preserve"> PAGEREF _Toc223514220 \h </w:instrText>
             </w:r>
             <w:r>
               <w:rPr>
@@ -1055,7 +1069,7 @@
                 <w:noProof/>
                 <w:webHidden/>
               </w:rPr>
-              <w:t>10</w:t>
+              <w:t>11</w:t>
             </w:r>
             <w:r>
               <w:rPr>
@@ -1079,7 +1093,7 @@
               <w14:ligatures w14:val="standardContextual"/>
             </w:rPr>
           </w:pPr>
-          <w:hyperlink w:anchor="_Toc223389263" w:history="1">
+          <w:hyperlink w:anchor="_Toc223514221" w:history="1">
             <w:r>
               <w:rPr>
                 <w:rStyle w:val="Hyperlink"/>
@@ -1106,7 +1120,7 @@
                 <w:noProof/>
                 <w:webHidden/>
               </w:rPr>
-              <w:instrText xml:space="preserve"> PAGEREF _Toc223389263 \h </w:instrText>
+              <w:instrText xml:space="preserve"> PAGEREF _Toc223514221 \h </w:instrText>
             </w:r>
             <w:r>
               <w:rPr>
@@ -1126,7 +1140,7 @@
                 <w:noProof/>
                 <w:webHidden/>
               </w:rPr>
-              <w:t>10</w:t>
+              <w:t>11</w:t>
             </w:r>
             <w:r>
               <w:rPr>
@@ -1150,7 +1164,7 @@
               <w14:ligatures w14:val="standardContextual"/>
             </w:rPr>
           </w:pPr>
-          <w:hyperlink w:anchor="_Toc223389264" w:history="1">
+          <w:hyperlink w:anchor="_Toc223514222" w:history="1">
             <w:r>
               <w:rPr>
                 <w:rStyle w:val="Hyperlink"/>
@@ -1177,7 +1191,7 @@
                 <w:noProof/>
                 <w:webHidden/>
               </w:rPr>
-              <w:instrText xml:space="preserve"> PAGEREF _Toc223389264 \h </w:instrText>
+              <w:instrText xml:space="preserve"> PAGEREF _Toc223514222 \h </w:instrText>
             </w:r>
             <w:r>
               <w:rPr>
@@ -1197,7 +1211,7 @@
                 <w:noProof/>
                 <w:webHidden/>
               </w:rPr>
-              <w:t>11</w:t>
+              <w:t>12</w:t>
             </w:r>
             <w:r>
               <w:rPr>
@@ -1247,7 +1261,7 @@
       <w:pPr>
         <w:pStyle w:val="Heading1"/>
       </w:pPr>
-      <w:bookmarkStart w:id="0" w:name="_Toc223389251"/>
+      <w:bookmarkStart w:id="0" w:name="_Toc223514209"/>
       <w:r>
         <w:lastRenderedPageBreak/>
         <w:t>Analysis</w:t>
@@ -1258,7 +1272,7 @@
       <w:pPr>
         <w:pStyle w:val="Heading2"/>
       </w:pPr>
-      <w:bookmarkStart w:id="1" w:name="_Toc223389252"/>
+      <w:bookmarkStart w:id="1" w:name="_Toc223514210"/>
       <w:r>
         <w:t>Problem Description</w:t>
       </w:r>
@@ -1377,7 +1391,7 @@
       <w:pPr>
         <w:pStyle w:val="Heading2"/>
       </w:pPr>
-      <w:bookmarkStart w:id="2" w:name="_Toc223389253"/>
+      <w:bookmarkStart w:id="2" w:name="_Toc223514211"/>
       <w:r>
         <w:lastRenderedPageBreak/>
         <w:t>Research</w:t>
@@ -1388,7 +1402,7 @@
       <w:pPr>
         <w:pStyle w:val="Heading3"/>
       </w:pPr>
-      <w:bookmarkStart w:id="3" w:name="_Toc223389254"/>
+      <w:bookmarkStart w:id="3" w:name="_Toc223514212"/>
       <w:r>
         <w:t>Evacuation Modelling Approach</w:t>
       </w:r>
@@ -1498,7 +1512,7 @@
       <w:pPr>
         <w:pStyle w:val="Heading3"/>
       </w:pPr>
-      <w:bookmarkStart w:id="4" w:name="_Toc223389255"/>
+      <w:bookmarkStart w:id="4" w:name="_Toc223514213"/>
       <w:r>
         <w:t>Multi-Agent Movement and Congestion/Conflict Resolution</w:t>
       </w:r>
@@ -1705,7 +1719,7 @@
       <w:pPr>
         <w:pStyle w:val="Heading3"/>
       </w:pPr>
-      <w:bookmarkStart w:id="5" w:name="_Toc223389256"/>
+      <w:bookmarkStart w:id="5" w:name="_Toc223514214"/>
       <w:r>
         <w:lastRenderedPageBreak/>
         <w:t>Hazard Representation</w:t>
@@ -1764,7 +1778,7 @@
       <w:pPr>
         <w:pStyle w:val="Heading3"/>
       </w:pPr>
-      <w:bookmarkStart w:id="6" w:name="_Toc223389257"/>
+      <w:bookmarkStart w:id="6" w:name="_Toc223514215"/>
       <w:r>
         <w:t>Pathfinding Algorithm</w:t>
       </w:r>
@@ -5104,7 +5118,7 @@
       <w:pPr>
         <w:pStyle w:val="Heading3"/>
       </w:pPr>
-      <w:bookmarkStart w:id="7" w:name="_Toc223389258"/>
+      <w:bookmarkStart w:id="7" w:name="_Toc223514216"/>
       <w:r>
         <w:lastRenderedPageBreak/>
         <w:t>Evaluation Metrics for Evacuation Outcomes and Algorithm Performance</w:t>
@@ -6370,7 +6384,7 @@
       <w:pPr>
         <w:pStyle w:val="Heading3"/>
       </w:pPr>
-      <w:bookmarkStart w:id="8" w:name="_Toc223389259"/>
+      <w:bookmarkStart w:id="8" w:name="_Toc223514217"/>
       <w:r>
         <w:lastRenderedPageBreak/>
         <w:t>Machine-Learning (ML) Algorithms</w:t>
@@ -6395,78 +6409,238 @@
     </w:p>
     <w:p>
       <w:r>
-        <w:t xml:space="preserve"> In supervised learning, a model learns a mapping from a set of features, </w:t>
+        <w:t>Machine learning algorithms can be broadly categorised into 3 types based on how they function:</w:t>
+      </w:r>
+    </w:p>
+    <w:p>
+      <w:pPr>
+        <w:pStyle w:val="ListParagraph"/>
+        <w:numPr>
+          <w:ilvl w:val="0"/>
+          <w:numId w:val="28"/>
+        </w:numPr>
+      </w:pPr>
+      <w:r>
+        <w:rPr>
+          <w:b/>
+          <w:bCs/>
+        </w:rPr>
+        <w:t xml:space="preserve">Supervised </w:t>
+      </w:r>
+      <w:proofErr w:type="gramStart"/>
+      <w:r>
+        <w:rPr>
+          <w:b/>
+          <w:bCs/>
+        </w:rPr>
+        <w:t>Learning</w:t>
+      </w:r>
+      <w:r>
+        <w:t>;</w:t>
+      </w:r>
+      <w:proofErr w:type="gramEnd"/>
+    </w:p>
+    <w:p>
+      <w:pPr>
+        <w:pStyle w:val="ListParagraph"/>
+      </w:pPr>
+      <w:r>
+        <w:t>where algorithms learn from labelled data, where the relationship between inputs and outputs are known.</w:t>
+      </w:r>
+    </w:p>
+    <w:p>
+      <w:pPr>
+        <w:pStyle w:val="ListParagraph"/>
+        <w:numPr>
+          <w:ilvl w:val="0"/>
+          <w:numId w:val="28"/>
+        </w:numPr>
+      </w:pPr>
+      <w:r>
+        <w:rPr>
+          <w:b/>
+          <w:bCs/>
+        </w:rPr>
+        <w:t xml:space="preserve">Unsupervised </w:t>
+      </w:r>
+      <w:proofErr w:type="gramStart"/>
+      <w:r>
+        <w:rPr>
+          <w:b/>
+          <w:bCs/>
+        </w:rPr>
+        <w:t>Learning</w:t>
+      </w:r>
+      <w:r>
+        <w:t>;</w:t>
+      </w:r>
+      <w:proofErr w:type="gramEnd"/>
+    </w:p>
+    <w:p>
+      <w:pPr>
+        <w:pStyle w:val="ListParagraph"/>
+      </w:pPr>
+      <w:r>
+        <w:t>where algorithms analyse unlabelled data to self-identify patterns or groupings.</w:t>
+      </w:r>
+    </w:p>
+    <w:p>
+      <w:pPr>
+        <w:pStyle w:val="ListParagraph"/>
+        <w:numPr>
+          <w:ilvl w:val="0"/>
+          <w:numId w:val="28"/>
+        </w:numPr>
+      </w:pPr>
+      <w:r>
+        <w:rPr>
+          <w:b/>
+          <w:bCs/>
+        </w:rPr>
+        <w:t xml:space="preserve">Reinforcement </w:t>
+      </w:r>
+      <w:proofErr w:type="gramStart"/>
+      <w:r>
+        <w:rPr>
+          <w:b/>
+          <w:bCs/>
+        </w:rPr>
+        <w:t>Learning</w:t>
+      </w:r>
+      <w:r>
+        <w:t>;</w:t>
+      </w:r>
+      <w:proofErr w:type="gramEnd"/>
+    </w:p>
+    <w:p>
+      <w:pPr>
+        <w:pStyle w:val="ListParagraph"/>
+      </w:pPr>
+      <w:r>
+        <w:t>where algorithms learn by interacting with an environment and discover patterns and behaviours through receiving feedback in the form of rewards or penalties.</w:t>
+      </w:r>
+    </w:p>
+    <w:p>
+      <w:pPr>
+        <w:pStyle w:val="ListParagraph"/>
+      </w:pPr>
+    </w:p>
+    <w:p>
+      <w:r>
+        <w:t xml:space="preserve">Supervised learning algorithms are trained on datasets </w:t>
+      </w:r>
+      <w:r>
+        <w:t>where each example provided (e.g., total evacuation time, exit throughput, average conflicts per tick, etc.) is paired with a target variable, known as the label (e.g., overall routing strategy score). The end-goal is to learn a mapping function between input data</w:t>
+      </w:r>
+      <w:r>
+        <w:t xml:space="preserve"> (commonly known as a feature)</w:t>
+      </w:r>
+      <w:r>
+        <w:t xml:space="preserve"> and output labels allowing for accurate predictions on unseen data.</w:t>
+      </w:r>
+    </w:p>
+    <w:p>
+      <w:r>
+        <w:t>This kind of ML algorithm can be further split into two subcategories: classification, and regression.</w:t>
+      </w:r>
+      <w:r>
+        <w:t xml:space="preserve"> </w:t>
+      </w:r>
+      <w:r>
+        <w:t>Linear r</w:t>
+      </w:r>
+      <w:r>
+        <w:t xml:space="preserve">egression predicts a continuous value by fitting a line of best fit between </w:t>
+      </w:r>
+      <w:r>
+        <w:t>features</w:t>
+      </w:r>
+      <w:r>
+        <w:t xml:space="preserve"> and</w:t>
+      </w:r>
+      <w:r>
+        <w:t xml:space="preserve"> labels</w:t>
+      </w:r>
+      <w:r>
+        <w:t>; t</w:t>
+      </w:r>
+      <w:r>
+        <w:t>his can also be extended to polynomial lines of greater degree, or even multiple lines at once</w:t>
+      </w:r>
+      <w:r>
+        <w:t xml:space="preserve">. It is up to the designer of the algorithm to decide upon the mathematical relationship that best describes a set of data (e.g. </w:t>
       </w:r>
       <m:oMath>
+        <m:sSub>
+          <m:sSubPr>
+            <m:ctrlPr>
+              <w:rPr>
+                <w:rFonts w:ascii="Cambria Math" w:hAnsi="Cambria Math"/>
+                <w:i/>
+              </w:rPr>
+            </m:ctrlPr>
+          </m:sSubPr>
+          <m:e>
+            <m:r>
+              <w:rPr>
+                <w:rFonts w:ascii="Cambria Math" w:hAnsi="Cambria Math"/>
+              </w:rPr>
+              <m:t>y</m:t>
+            </m:r>
+          </m:e>
+          <m:sub>
+            <m:r>
+              <w:rPr>
+                <w:rFonts w:ascii="Cambria Math" w:hAnsi="Cambria Math"/>
+              </w:rPr>
+              <m:t>target</m:t>
+            </m:r>
+          </m:sub>
+        </m:sSub>
         <m:r>
           <w:rPr>
             <w:rFonts w:ascii="Cambria Math" w:hAnsi="Cambria Math"/>
           </w:rPr>
-          <m:t>x</m:t>
+          <m:t>=a</m:t>
         </m:r>
-      </m:oMath>
-      <w:r>
-        <w:t xml:space="preserve">, to a label, </w:t>
-      </w:r>
-      <m:oMath>
+        <m:sSub>
+          <m:sSubPr>
+            <m:ctrlPr>
+              <w:rPr>
+                <w:rFonts w:ascii="Cambria Math" w:hAnsi="Cambria Math"/>
+                <w:i/>
+              </w:rPr>
+            </m:ctrlPr>
+          </m:sSubPr>
+          <m:e>
+            <m:r>
+              <w:rPr>
+                <w:rFonts w:ascii="Cambria Math" w:hAnsi="Cambria Math"/>
+              </w:rPr>
+              <m:t>x</m:t>
+            </m:r>
+          </m:e>
+          <m:sub>
+            <m:r>
+              <w:rPr>
+                <w:rFonts w:ascii="Cambria Math" w:hAnsi="Cambria Math"/>
+              </w:rPr>
+              <m:t>input</m:t>
+            </m:r>
+          </m:sub>
+        </m:sSub>
         <m:r>
           <w:rPr>
             <w:rFonts w:ascii="Cambria Math" w:hAnsi="Cambria Math"/>
           </w:rPr>
-          <m:t>y</m:t>
+          <m:t>+b</m:t>
         </m:r>
       </m:oMath>
       <w:r>
-        <w:t>.</w:t>
-      </w:r>
-      <w:r>
-        <w:t xml:space="preserve"> For this project in particular,</w:t>
+        <w:t>). A good example of where regression could be used in relation to my project might be predicting evacuation times based on number of hazards, number of agents, total grid area, etc.</w:t>
       </w:r>
       <w:r>
         <w:t xml:space="preserve"> </w:t>
-      </w:r>
-      <m:oMath>
-        <m:r>
-          <w:rPr>
-            <w:rFonts w:ascii="Cambria Math" w:hAnsi="Cambria Math"/>
-          </w:rPr>
-          <m:t>x=</m:t>
-        </m:r>
-        <m:r>
-          <m:rPr>
-            <m:sty m:val="p"/>
-          </m:rPr>
-          <w:rPr>
-            <w:rFonts w:ascii="Cambria Math" w:hAnsi="Cambria Math"/>
-          </w:rPr>
-          <m:t>scenario features</m:t>
-        </m:r>
-      </m:oMath>
-      <w:r>
-        <w:rPr>
-          <w:iCs/>
-        </w:rPr>
-        <w:t xml:space="preserve"> (density, exits, hazard proximity, etc.) and </w:t>
-      </w:r>
-      <m:oMath>
-        <m:r>
-          <w:rPr>
-            <w:rFonts w:ascii="Cambria Math" w:hAnsi="Cambria Math"/>
-          </w:rPr>
-          <m:t>y=</m:t>
-        </m:r>
-        <m:r>
-          <m:rPr>
-            <m:sty m:val="p"/>
-          </m:rPr>
-          <w:rPr>
-            <w:rFonts w:ascii="Cambria Math" w:hAnsi="Cambria Math"/>
-          </w:rPr>
-          <m:t>best strategy</m:t>
-        </m:r>
-      </m:oMath>
-      <w:r>
-        <w:t xml:space="preserve"> (Dijkstra, A*, JPS, etc.). Framing the advisor model as multiclass classification is simpler than trying to predict an exact evacuation time using regression.</w:t>
       </w:r>
     </w:p>
     <w:p>
@@ -6480,7 +6654,7 @@
             <w:fldChar w:fldCharType="begin"/>
           </w:r>
           <w:r>
-            <w:instrText xml:space="preserve"> CITATION Gup25 \l 2057 </w:instrText>
+            <w:instrText xml:space="preserve">CITATION Gup25 \l 2057 </w:instrText>
           </w:r>
           <w:r>
             <w:fldChar w:fldCharType="separate"/>
@@ -6489,13 +6663,264 @@
             <w:rPr>
               <w:noProof/>
             </w:rPr>
-            <w:t>(Gupta, 2025)</w:t>
+            <w:t>(Agarwaal, Machine Learning Algorithms, 2026)</w:t>
           </w:r>
           <w:r>
             <w:fldChar w:fldCharType="end"/>
           </w:r>
         </w:sdtContent>
       </w:sdt>
+    </w:p>
+    <w:p>
+      <w:r>
+        <w:t>On the other hand, classification is not used to predict a value, but rather to categorise data under different</w:t>
+      </w:r>
+      <w:r>
+        <w:t xml:space="preserve"> class labels</w:t>
+      </w:r>
+      <w:r>
+        <w:t xml:space="preserve">. Like regression, there are many kinds of algorithms that can be used; the simplest algorithm that could be used is logistic regression. This algorithm takes an input variable, however instead of </w:t>
+      </w:r>
+      <w:r>
+        <w:t>returning</w:t>
+      </w:r>
+      <w:r>
+        <w:t xml:space="preserve"> a </w:t>
+      </w:r>
+      <w:r>
+        <w:t xml:space="preserve">label that describes the data (e.g., whether an animal is a cat or not) it will output the probability that the data </w:t>
+      </w:r>
+      <w:r>
+        <w:lastRenderedPageBreak/>
+        <w:t>falls within that class. Logistic regression does this by modelling output probability labels against features using a sigmoid S-curve.</w:t>
+      </w:r>
+      <w:r>
+        <w:t xml:space="preserve"> </w:t>
+      </w:r>
+    </w:p>
+    <w:p>
+      <w:r>
+        <w:t>However, many problems might need data to be categorised against many classes, and so logistic regression can be further expanded to do this. The type of logistic regression I had just discussed was binomial logistic regression, where there are only two classes to match data with. Multinomial logistic regression deals with more than two unordered classes (e.g., a van, a lorry, a car, or a motorcycle), acting as an extension of binomial logistic regression. Ordinal linear regression</w:t>
+      </w:r>
+      <w:r>
+        <w:t xml:space="preserve"> involves more than two categories that are ordered (e.g., low, medium, and high).</w:t>
+      </w:r>
+    </w:p>
+    <w:p>
+      <w:sdt>
+        <w:sdtPr>
+          <w:id w:val="323933279"/>
+          <w:citation/>
+        </w:sdtPr>
+        <w:sdtContent>
+          <w:r>
+            <w:fldChar w:fldCharType="begin"/>
+          </w:r>
+          <w:r>
+            <w:instrText xml:space="preserve"> CITATION Aga25 \l 2057 </w:instrText>
+          </w:r>
+          <w:r>
+            <w:fldChar w:fldCharType="separate"/>
+          </w:r>
+          <w:r>
+            <w:rPr>
+              <w:noProof/>
+            </w:rPr>
+            <w:t>(Agarwaal, Logistic Regression in Machine Learning, 2025)</w:t>
+          </w:r>
+          <w:r>
+            <w:fldChar w:fldCharType="end"/>
+          </w:r>
+        </w:sdtContent>
+      </w:sdt>
+    </w:p>
+    <w:p>
+      <w:r>
+        <w:t xml:space="preserve">Another common machine learning algorithm is the </w:t>
+      </w:r>
+      <m:oMath>
+        <m:r>
+          <w:rPr>
+            <w:rFonts w:ascii="Cambria Math" w:hAnsi="Cambria Math"/>
+          </w:rPr>
+          <m:t>k</m:t>
+        </m:r>
+      </m:oMath>
+      <w:r>
+        <w:t>-Nearest Neighbours (</w:t>
+      </w:r>
+      <w:r>
+        <w:t>K</w:t>
+      </w:r>
+      <w:r>
+        <w:t xml:space="preserve">NN) algorithm. It is generally used for classification, however, can also be used for regression tasks. KNN works by finding the </w:t>
+      </w:r>
+      <m:oMath>
+        <m:r>
+          <w:rPr>
+            <w:rFonts w:ascii="Cambria Math" w:hAnsi="Cambria Math"/>
+          </w:rPr>
+          <m:t>k</m:t>
+        </m:r>
+      </m:oMath>
+      <w:r>
+        <w:t xml:space="preserve"> closest data points (neighbours) to a given input and makes predictions based on the majority class of its neighbours. Unlike the other algorithms mentioned, KNN makes no assumptions about the underlying data distribution (such as a mathematical relationship between features and labels).</w:t>
+      </w:r>
+      <w:r>
+        <w:t xml:space="preserve"> When the model makes predictions, the value of </w:t>
+      </w:r>
+      <m:oMath>
+        <m:r>
+          <w:rPr>
+            <w:rFonts w:ascii="Cambria Math" w:hAnsi="Cambria Math"/>
+          </w:rPr>
+          <m:t>k</m:t>
+        </m:r>
+      </m:oMath>
+      <w:r>
+        <w:t xml:space="preserve"> determines how many neighbours the algorithm will consider. Choosing a suitable value for </w:t>
+      </w:r>
+      <m:oMath>
+        <m:r>
+          <w:rPr>
+            <w:rFonts w:ascii="Cambria Math" w:hAnsi="Cambria Math"/>
+          </w:rPr>
+          <m:t>k</m:t>
+        </m:r>
+      </m:oMath>
+      <w:r>
+        <w:t xml:space="preserve"> is crucial, as while a larger </w:t>
+      </w:r>
+      <m:oMath>
+        <m:r>
+          <w:rPr>
+            <w:rFonts w:ascii="Cambria Math" w:hAnsi="Cambria Math"/>
+          </w:rPr>
+          <m:t>k</m:t>
+        </m:r>
+      </m:oMath>
+      <w:r>
+        <w:t xml:space="preserve"> can make predictions more stable where the data has many outliers or noise, too large of a value may result in the model underfitting (missing important patterns in the data).</w:t>
+      </w:r>
+    </w:p>
+    <w:p>
+      <w:r>
+        <w:t xml:space="preserve">Instead of setting a </w:t>
+      </w:r>
+      <m:oMath>
+        <m:r>
+          <w:rPr>
+            <w:rFonts w:ascii="Cambria Math" w:hAnsi="Cambria Math"/>
+          </w:rPr>
+          <m:t>k</m:t>
+        </m:r>
+      </m:oMath>
+      <w:r>
+        <w:t xml:space="preserve"> value directly, statistical methods can instead be used to determine a value of </w:t>
+      </w:r>
+      <m:oMath>
+        <m:r>
+          <w:rPr>
+            <w:rFonts w:ascii="Cambria Math" w:hAnsi="Cambria Math"/>
+          </w:rPr>
+          <m:t>k</m:t>
+        </m:r>
+      </m:oMath>
+      <w:r>
+        <w:t xml:space="preserve"> that is suitable for the dataset. For example, </w:t>
+      </w:r>
+      <m:oMath>
+        <m:r>
+          <w:rPr>
+            <w:rFonts w:ascii="Cambria Math" w:hAnsi="Cambria Math"/>
+          </w:rPr>
+          <m:t>k</m:t>
+        </m:r>
+      </m:oMath>
+      <w:r>
+        <w:t xml:space="preserve">-fold </w:t>
+      </w:r>
+      <w:r>
+        <w:t xml:space="preserve">cross-validation divides the dataset into </w:t>
+      </w:r>
+      <m:oMath>
+        <m:r>
+          <w:rPr>
+            <w:rFonts w:ascii="Cambria Math" w:hAnsi="Cambria Math"/>
+          </w:rPr>
+          <m:t>k</m:t>
+        </m:r>
+      </m:oMath>
+      <w:r>
+        <w:t xml:space="preserve"> parts; the model is trained on some of the dataset subdivisions and then tested on the remaining ones. The </w:t>
+      </w:r>
+      <m:oMath>
+        <m:r>
+          <w:rPr>
+            <w:rFonts w:ascii="Cambria Math" w:hAnsi="Cambria Math"/>
+          </w:rPr>
+          <m:t>k</m:t>
+        </m:r>
+      </m:oMath>
+      <w:r>
+        <w:t xml:space="preserve"> value that gives the highest average accuracy upon testing will usually be the best one to use. Alternatively, the elbow method works by drawing a graph showing the error rate against different </w:t>
+      </w:r>
+      <m:oMath>
+        <m:r>
+          <w:rPr>
+            <w:rFonts w:ascii="Cambria Math" w:hAnsi="Cambria Math"/>
+          </w:rPr>
+          <m:t>k</m:t>
+        </m:r>
+      </m:oMath>
+      <w:r>
+        <w:t xml:space="preserve"> values. As </w:t>
+      </w:r>
+      <m:oMath>
+        <m:r>
+          <w:rPr>
+            <w:rFonts w:ascii="Cambria Math" w:hAnsi="Cambria Math"/>
+          </w:rPr>
+          <m:t>k</m:t>
+        </m:r>
+      </m:oMath>
+      <w:r>
+        <w:t xml:space="preserve"> is incremented, error rate will drop at first until the graph reaches a turning point towards the bottom; this turning point (referred to as the “elbow” of the graph) is where the best </w:t>
+      </w:r>
+      <m:oMath>
+        <m:r>
+          <w:rPr>
+            <w:rFonts w:ascii="Cambria Math" w:hAnsi="Cambria Math"/>
+          </w:rPr>
+          <m:t>k</m:t>
+        </m:r>
+      </m:oMath>
+      <w:r>
+        <w:t xml:space="preserve"> value would lie. Another important consideration is how to handle ties/conflicts</w:t>
+      </w:r>
+      <w:r>
+        <w:t xml:space="preserve"> – </w:t>
+      </w:r>
+      <w:r>
+        <w:t>when there are an equal number of neighbours belonging to one majority class compared to another)</w:t>
+      </w:r>
+      <w:r>
+        <w:t xml:space="preserve"> –</w:t>
+      </w:r>
+      <w:r>
+        <w:t xml:space="preserve"> which will typically be dealt with by simply choosing an odd integer for </w:t>
+      </w:r>
+      <m:oMath>
+        <m:r>
+          <w:rPr>
+            <w:rFonts w:ascii="Cambria Math" w:hAnsi="Cambria Math"/>
+          </w:rPr>
+          <m:t>k</m:t>
+        </m:r>
+      </m:oMath>
+      <w:r>
+        <w:t>.</w:t>
+      </w:r>
     </w:p>
     <w:p>
       <w:pPr>
@@ -6506,27 +6931,845 @@
           <w:docGrid w:linePitch="360"/>
         </w:sectPr>
       </w:pPr>
-      <w:r>
-        <w:t>In my case, the advisor would have to both perform well on a small dataset</w:t>
-      </w:r>
-      <w:r>
-        <w:t xml:space="preserve"> (that I would </w:t>
-      </w:r>
-      <w:r>
-        <w:t xml:space="preserve">probably </w:t>
-      </w:r>
-      <w:r>
-        <w:t>have to construct myself)</w:t>
-      </w:r>
-      <w:r>
-        <w:t xml:space="preserve"> but also be simple enough to implement from scratch. </w:t>
-      </w:r>
+      <w:sdt>
+        <w:sdtPr>
+          <w:id w:val="243768895"/>
+          <w:citation/>
+        </w:sdtPr>
+        <w:sdtContent>
+          <w:r>
+            <w:fldChar w:fldCharType="begin"/>
+          </w:r>
+          <w:r>
+            <w:instrText xml:space="preserve"> CITATION Aga26 \l 2057 </w:instrText>
+          </w:r>
+          <w:r>
+            <w:fldChar w:fldCharType="separate"/>
+          </w:r>
+          <w:r>
+            <w:rPr>
+              <w:noProof/>
+            </w:rPr>
+            <w:t>(Agarwaal, K-Nearest Neighbor (KNN) Algorithm, 2026)</w:t>
+          </w:r>
+          <w:r>
+            <w:fldChar w:fldCharType="end"/>
+          </w:r>
+        </w:sdtContent>
+      </w:sdt>
+    </w:p>
+    <w:tbl>
+      <w:tblPr>
+        <w:tblStyle w:val="TableGrid"/>
+        <w:tblpPr w:leftFromText="180" w:rightFromText="180" w:vertAnchor="text" w:horzAnchor="margin" w:tblpY="-134"/>
+        <w:tblW w:w="14399" w:type="dxa"/>
+        <w:tblLook w:val="04A0" w:firstRow="1" w:lastRow="0" w:firstColumn="1" w:lastColumn="0" w:noHBand="0" w:noVBand="1"/>
+      </w:tblPr>
+      <w:tblGrid>
+        <w:gridCol w:w="2462"/>
+        <w:gridCol w:w="1620"/>
+        <w:gridCol w:w="2591"/>
+        <w:gridCol w:w="1761"/>
+        <w:gridCol w:w="2297"/>
+        <w:gridCol w:w="3668"/>
+      </w:tblGrid>
+      <w:tr>
+        <w:trPr>
+          <w:trHeight w:val="550"/>
+          <w:tblHeader/>
+        </w:trPr>
+        <w:tc>
+          <w:tcPr>
+            <w:tcW w:w="2462" w:type="dxa"/>
+            <w:vAlign w:val="center"/>
+          </w:tcPr>
+          <w:p>
+            <w:pPr>
+              <w:jc w:val="center"/>
+              <w:rPr>
+                <w:b/>
+                <w:bCs/>
+              </w:rPr>
+            </w:pPr>
+            <w:r>
+              <w:rPr>
+                <w:b/>
+                <w:bCs/>
+              </w:rPr>
+              <w:lastRenderedPageBreak/>
+              <w:t>Algorithm</w:t>
+            </w:r>
+          </w:p>
+        </w:tc>
+        <w:tc>
+          <w:tcPr>
+            <w:tcW w:w="1620" w:type="dxa"/>
+            <w:vAlign w:val="center"/>
+          </w:tcPr>
+          <w:p>
+            <w:pPr>
+              <w:jc w:val="center"/>
+              <w:rPr>
+                <w:b/>
+                <w:bCs/>
+              </w:rPr>
+            </w:pPr>
+            <w:r>
+              <w:rPr>
+                <w:b/>
+                <w:bCs/>
+              </w:rPr>
+              <w:t>Uses heuristic?</w:t>
+            </w:r>
+          </w:p>
+        </w:tc>
+        <w:tc>
+          <w:tcPr>
+            <w:tcW w:w="2591" w:type="dxa"/>
+            <w:vAlign w:val="center"/>
+          </w:tcPr>
+          <w:p>
+            <w:pPr>
+              <w:jc w:val="center"/>
+              <w:rPr>
+                <w:b/>
+                <w:bCs/>
+              </w:rPr>
+            </w:pPr>
+            <w:r>
+              <w:rPr>
+                <w:b/>
+                <w:bCs/>
+              </w:rPr>
+              <w:t>Edge weights allowed</w:t>
+            </w:r>
+          </w:p>
+        </w:tc>
+        <w:tc>
+          <w:tcPr>
+            <w:tcW w:w="1761" w:type="dxa"/>
+            <w:vAlign w:val="center"/>
+          </w:tcPr>
+          <w:p>
+            <w:pPr>
+              <w:jc w:val="center"/>
+              <w:rPr>
+                <w:b/>
+                <w:bCs/>
+              </w:rPr>
+            </w:pPr>
+            <w:r>
+              <w:rPr>
+                <w:b/>
+                <w:bCs/>
+              </w:rPr>
+              <w:t>Complete?</w:t>
+            </w:r>
+          </w:p>
+        </w:tc>
+        <w:tc>
+          <w:tcPr>
+            <w:tcW w:w="2297" w:type="dxa"/>
+            <w:vAlign w:val="center"/>
+          </w:tcPr>
+          <w:p>
+            <w:pPr>
+              <w:jc w:val="center"/>
+              <w:rPr>
+                <w:b/>
+                <w:bCs/>
+              </w:rPr>
+            </w:pPr>
+            <w:r>
+              <w:rPr>
+                <w:b/>
+                <w:bCs/>
+              </w:rPr>
+              <w:t>Optimal?</w:t>
+            </w:r>
+          </w:p>
+        </w:tc>
+        <w:tc>
+          <w:tcPr>
+            <w:tcW w:w="3668" w:type="dxa"/>
+            <w:vAlign w:val="center"/>
+          </w:tcPr>
+          <w:p>
+            <w:pPr>
+              <w:jc w:val="center"/>
+              <w:rPr>
+                <w:b/>
+                <w:bCs/>
+              </w:rPr>
+            </w:pPr>
+            <w:r>
+              <w:rPr>
+                <w:b/>
+                <w:bCs/>
+              </w:rPr>
+              <w:t>Relevance</w:t>
+            </w:r>
+          </w:p>
+        </w:tc>
+      </w:tr>
+      <w:tr>
+        <w:trPr>
+          <w:trHeight w:val="550"/>
+        </w:trPr>
+        <w:tc>
+          <w:tcPr>
+            <w:tcW w:w="2462" w:type="dxa"/>
+            <w:vAlign w:val="center"/>
+          </w:tcPr>
+          <w:p>
+            <w:pPr>
+              <w:jc w:val="center"/>
+            </w:pPr>
+            <w:r>
+              <w:t>BFS (Breadth First Search)</w:t>
+            </w:r>
+          </w:p>
+        </w:tc>
+        <w:tc>
+          <w:tcPr>
+            <w:tcW w:w="1620" w:type="dxa"/>
+            <w:vAlign w:val="center"/>
+          </w:tcPr>
+          <w:p>
+            <w:pPr>
+              <w:jc w:val="center"/>
+            </w:pPr>
+            <w:r>
+              <w:t>No</w:t>
+            </w:r>
+          </w:p>
+        </w:tc>
+        <w:tc>
+          <w:tcPr>
+            <w:tcW w:w="2591" w:type="dxa"/>
+            <w:vAlign w:val="center"/>
+          </w:tcPr>
+          <w:p>
+            <w:pPr>
+              <w:jc w:val="center"/>
+            </w:pPr>
+            <w:r>
+              <w:t>Unweighted / Equal weights</w:t>
+            </w:r>
+          </w:p>
+        </w:tc>
+        <w:tc>
+          <w:tcPr>
+            <w:tcW w:w="1761" w:type="dxa"/>
+            <w:vAlign w:val="center"/>
+          </w:tcPr>
+          <w:p>
+            <w:pPr>
+              <w:jc w:val="center"/>
+            </w:pPr>
+            <w:r>
+              <w:t>Yes</w:t>
+            </w:r>
+          </w:p>
+        </w:tc>
+        <w:tc>
+          <w:tcPr>
+            <w:tcW w:w="2297" w:type="dxa"/>
+            <w:vAlign w:val="center"/>
+          </w:tcPr>
+          <w:p>
+            <w:pPr>
+              <w:jc w:val="center"/>
+            </w:pPr>
+            <w:r>
+              <w:t xml:space="preserve"> Yes </w:t>
+            </w:r>
+          </w:p>
+        </w:tc>
+        <w:tc>
+          <w:tcPr>
+            <w:tcW w:w="3668" w:type="dxa"/>
+            <w:vAlign w:val="center"/>
+          </w:tcPr>
+          <w:p>
+            <w:pPr>
+              <w:jc w:val="center"/>
+            </w:pPr>
+            <w:r>
+              <w:t>Baseline for uniform-cost movement (fast and simple).</w:t>
+            </w:r>
+          </w:p>
+        </w:tc>
+      </w:tr>
+      <w:tr>
+        <w:trPr>
+          <w:trHeight w:val="550"/>
+        </w:trPr>
+        <w:tc>
+          <w:tcPr>
+            <w:tcW w:w="2462" w:type="dxa"/>
+            <w:vAlign w:val="center"/>
+          </w:tcPr>
+          <w:p>
+            <w:pPr>
+              <w:jc w:val="center"/>
+            </w:pPr>
+            <w:r>
+              <w:t>DFS (Depth First Search)</w:t>
+            </w:r>
+          </w:p>
+        </w:tc>
+        <w:tc>
+          <w:tcPr>
+            <w:tcW w:w="1620" w:type="dxa"/>
+            <w:vAlign w:val="center"/>
+          </w:tcPr>
+          <w:p>
+            <w:pPr>
+              <w:jc w:val="center"/>
+            </w:pPr>
+            <w:r>
+              <w:t>No</w:t>
+            </w:r>
+          </w:p>
+        </w:tc>
+        <w:tc>
+          <w:tcPr>
+            <w:tcW w:w="2591" w:type="dxa"/>
+            <w:vAlign w:val="center"/>
+          </w:tcPr>
+          <w:p>
+            <w:pPr>
+              <w:jc w:val="center"/>
+            </w:pPr>
+            <w:r>
+              <w:t>Any (but not a shortest-path method)</w:t>
+            </w:r>
+          </w:p>
+        </w:tc>
+        <w:tc>
+          <w:tcPr>
+            <w:tcW w:w="1761" w:type="dxa"/>
+            <w:vAlign w:val="center"/>
+          </w:tcPr>
+          <w:p>
+            <w:pPr>
+              <w:jc w:val="center"/>
+            </w:pPr>
+            <w:r>
+              <w:t>Not guaranteed</w:t>
+            </w:r>
+          </w:p>
+        </w:tc>
+        <w:tc>
+          <w:tcPr>
+            <w:tcW w:w="2297" w:type="dxa"/>
+            <w:vAlign w:val="center"/>
+          </w:tcPr>
+          <w:p>
+            <w:pPr>
+              <w:jc w:val="center"/>
+            </w:pPr>
+            <w:r>
+              <w:t>No</w:t>
+            </w:r>
+          </w:p>
+        </w:tc>
+        <w:tc>
+          <w:tcPr>
+            <w:tcW w:w="3668" w:type="dxa"/>
+            <w:vAlign w:val="center"/>
+          </w:tcPr>
+          <w:p>
+            <w:pPr>
+              <w:jc w:val="center"/>
+            </w:pPr>
+            <w:r>
+              <w:t>Useful as a contrast – shows why finding any path does not equate to the best evacuation route.</w:t>
+            </w:r>
+          </w:p>
+        </w:tc>
+      </w:tr>
+      <w:tr>
+        <w:trPr>
+          <w:trHeight w:val="550"/>
+        </w:trPr>
+        <w:tc>
+          <w:tcPr>
+            <w:tcW w:w="2462" w:type="dxa"/>
+            <w:vAlign w:val="center"/>
+          </w:tcPr>
+          <w:p>
+            <w:pPr>
+              <w:jc w:val="center"/>
+            </w:pPr>
+            <w:r>
+              <w:t>Dijkstra</w:t>
+            </w:r>
+          </w:p>
+        </w:tc>
+        <w:tc>
+          <w:tcPr>
+            <w:tcW w:w="1620" w:type="dxa"/>
+            <w:vAlign w:val="center"/>
+          </w:tcPr>
+          <w:p>
+            <w:pPr>
+              <w:jc w:val="center"/>
+            </w:pPr>
+            <w:r>
+              <w:t>No</w:t>
+            </w:r>
+          </w:p>
+        </w:tc>
+        <w:tc>
+          <w:tcPr>
+            <w:tcW w:w="2591" w:type="dxa"/>
+            <w:vAlign w:val="center"/>
+          </w:tcPr>
+          <w:p>
+            <w:pPr>
+              <w:jc w:val="center"/>
+            </w:pPr>
+            <w:r>
+              <w:t>Non-negative weights</w:t>
+            </w:r>
+          </w:p>
+        </w:tc>
+        <w:tc>
+          <w:tcPr>
+            <w:tcW w:w="1761" w:type="dxa"/>
+            <w:vAlign w:val="center"/>
+          </w:tcPr>
+          <w:p>
+            <w:pPr>
+              <w:jc w:val="center"/>
+            </w:pPr>
+            <w:r>
+              <w:t>Yes</w:t>
+            </w:r>
+          </w:p>
+        </w:tc>
+        <w:tc>
+          <w:tcPr>
+            <w:tcW w:w="2297" w:type="dxa"/>
+            <w:vAlign w:val="center"/>
+          </w:tcPr>
+          <w:p>
+            <w:pPr>
+              <w:jc w:val="center"/>
+            </w:pPr>
+            <w:r>
+              <w:t>Yes</w:t>
+            </w:r>
+          </w:p>
+        </w:tc>
+        <w:tc>
+          <w:tcPr>
+            <w:tcW w:w="3668" w:type="dxa"/>
+            <w:vAlign w:val="center"/>
+          </w:tcPr>
+          <w:p>
+            <w:pPr>
+              <w:jc w:val="center"/>
+            </w:pPr>
+            <w:r>
+              <w:t>Strong baseline for weighted costs; can compute distances to all cells from exits.</w:t>
+            </w:r>
+          </w:p>
+        </w:tc>
+      </w:tr>
+      <w:tr>
+        <w:trPr>
+          <w:trHeight w:val="550"/>
+        </w:trPr>
+        <w:tc>
+          <w:tcPr>
+            <w:tcW w:w="2462" w:type="dxa"/>
+            <w:vAlign w:val="center"/>
+          </w:tcPr>
+          <w:p>
+            <w:pPr>
+              <w:jc w:val="center"/>
+            </w:pPr>
+            <w:r>
+              <w:t>A*</w:t>
+            </w:r>
+          </w:p>
+        </w:tc>
+        <w:tc>
+          <w:tcPr>
+            <w:tcW w:w="1620" w:type="dxa"/>
+            <w:vAlign w:val="center"/>
+          </w:tcPr>
+          <w:p>
+            <w:pPr>
+              <w:jc w:val="center"/>
+            </w:pPr>
+            <w:r>
+              <w:t>Yes</w:t>
+            </w:r>
+          </w:p>
+        </w:tc>
+        <w:tc>
+          <w:tcPr>
+            <w:tcW w:w="2591" w:type="dxa"/>
+            <w:vAlign w:val="center"/>
+          </w:tcPr>
+          <w:p>
+            <w:pPr>
+              <w:jc w:val="center"/>
+            </w:pPr>
+            <w:r>
+              <w:t>Non-negative weights</w:t>
+            </w:r>
+          </w:p>
+        </w:tc>
+        <w:tc>
+          <w:tcPr>
+            <w:tcW w:w="1761" w:type="dxa"/>
+            <w:vAlign w:val="center"/>
+          </w:tcPr>
+          <w:p>
+            <w:pPr>
+              <w:jc w:val="center"/>
+            </w:pPr>
+            <w:r>
+              <w:t>Yes</w:t>
+            </w:r>
+          </w:p>
+        </w:tc>
+        <w:tc>
+          <w:tcPr>
+            <w:tcW w:w="2297" w:type="dxa"/>
+            <w:vAlign w:val="center"/>
+          </w:tcPr>
+          <w:p>
+            <w:pPr>
+              <w:jc w:val="center"/>
+            </w:pPr>
+            <w:r>
+              <w:t>Yes, if heuristic admissible</w:t>
+            </w:r>
+          </w:p>
+        </w:tc>
+        <w:tc>
+          <w:tcPr>
+            <w:tcW w:w="3668" w:type="dxa"/>
+            <w:vAlign w:val="center"/>
+          </w:tcPr>
+          <w:p>
+            <w:pPr>
+              <w:jc w:val="center"/>
+            </w:pPr>
+            <w:r>
+              <w:t>Main informed shortest-path method; allows for controlled comparisons of heuristics.</w:t>
+            </w:r>
+          </w:p>
+        </w:tc>
+      </w:tr>
+      <w:tr>
+        <w:trPr>
+          <w:trHeight w:val="550"/>
+        </w:trPr>
+        <w:tc>
+          <w:tcPr>
+            <w:tcW w:w="2462" w:type="dxa"/>
+            <w:vAlign w:val="center"/>
+          </w:tcPr>
+          <w:p>
+            <w:pPr>
+              <w:jc w:val="center"/>
+            </w:pPr>
+            <w:r>
+              <w:t>Greedy Best-First</w:t>
+            </w:r>
+          </w:p>
+        </w:tc>
+        <w:tc>
+          <w:tcPr>
+            <w:tcW w:w="1620" w:type="dxa"/>
+            <w:vAlign w:val="center"/>
+          </w:tcPr>
+          <w:p>
+            <w:pPr>
+              <w:jc w:val="center"/>
+            </w:pPr>
+            <w:r>
+              <w:t xml:space="preserve">Yes (only </w:t>
+            </w:r>
+            <m:oMath>
+              <m:r>
+                <w:rPr>
+                  <w:rFonts w:ascii="Cambria Math" w:hAnsi="Cambria Math"/>
+                </w:rPr>
+                <m:t>h</m:t>
+              </m:r>
+            </m:oMath>
+            <w:r>
+              <w:t>)</w:t>
+            </w:r>
+          </w:p>
+        </w:tc>
+        <w:tc>
+          <w:tcPr>
+            <w:tcW w:w="2591" w:type="dxa"/>
+            <w:vAlign w:val="center"/>
+          </w:tcPr>
+          <w:p>
+            <w:pPr>
+              <w:jc w:val="center"/>
+            </w:pPr>
+            <w:r>
+              <w:t>Non-negative weights</w:t>
+            </w:r>
+          </w:p>
+        </w:tc>
+        <w:tc>
+          <w:tcPr>
+            <w:tcW w:w="1761" w:type="dxa"/>
+            <w:vAlign w:val="center"/>
+          </w:tcPr>
+          <w:p>
+            <w:pPr>
+              <w:jc w:val="center"/>
+            </w:pPr>
+            <w:r>
+              <w:t>Often</w:t>
+            </w:r>
+          </w:p>
+        </w:tc>
+        <w:tc>
+          <w:tcPr>
+            <w:tcW w:w="2297" w:type="dxa"/>
+            <w:vAlign w:val="center"/>
+          </w:tcPr>
+          <w:p>
+            <w:pPr>
+              <w:jc w:val="center"/>
+            </w:pPr>
+            <w:r>
+              <w:t>No</w:t>
+            </w:r>
+          </w:p>
+        </w:tc>
+        <w:tc>
+          <w:tcPr>
+            <w:tcW w:w="3668" w:type="dxa"/>
+            <w:vAlign w:val="center"/>
+          </w:tcPr>
+          <w:p>
+            <w:pPr>
+              <w:jc w:val="center"/>
+            </w:pPr>
+            <w:r>
+              <w:t>Demonstrates “goal-seeking” behaviour.</w:t>
+            </w:r>
+          </w:p>
+        </w:tc>
+      </w:tr>
+      <w:tr>
+        <w:trPr>
+          <w:trHeight w:val="550"/>
+        </w:trPr>
+        <w:tc>
+          <w:tcPr>
+            <w:tcW w:w="2462" w:type="dxa"/>
+            <w:vAlign w:val="center"/>
+          </w:tcPr>
+          <w:p>
+            <w:pPr>
+              <w:jc w:val="center"/>
+            </w:pPr>
+            <w:r>
+              <w:t>Weighted A*</w:t>
+            </w:r>
+          </w:p>
+        </w:tc>
+        <w:tc>
+          <w:tcPr>
+            <w:tcW w:w="1620" w:type="dxa"/>
+            <w:vAlign w:val="center"/>
+          </w:tcPr>
+          <w:p>
+            <w:pPr>
+              <w:jc w:val="center"/>
+            </w:pPr>
+            <w:r>
+              <w:t>Yes (scaled)</w:t>
+            </w:r>
+          </w:p>
+        </w:tc>
+        <w:tc>
+          <w:tcPr>
+            <w:tcW w:w="2591" w:type="dxa"/>
+            <w:vAlign w:val="center"/>
+          </w:tcPr>
+          <w:p>
+            <w:pPr>
+              <w:jc w:val="center"/>
+            </w:pPr>
+            <w:r>
+              <w:t>Non-negative weights</w:t>
+            </w:r>
+          </w:p>
+        </w:tc>
+        <w:tc>
+          <w:tcPr>
+            <w:tcW w:w="1761" w:type="dxa"/>
+            <w:vAlign w:val="center"/>
+          </w:tcPr>
+          <w:p>
+            <w:pPr>
+              <w:jc w:val="center"/>
+            </w:pPr>
+            <w:r>
+              <w:t>Yes</w:t>
+            </w:r>
+          </w:p>
+        </w:tc>
+        <w:tc>
+          <w:tcPr>
+            <w:tcW w:w="2297" w:type="dxa"/>
+            <w:vAlign w:val="center"/>
+          </w:tcPr>
+          <w:p>
+            <w:pPr>
+              <w:jc w:val="center"/>
+            </w:pPr>
+            <w:r>
+              <w:t xml:space="preserve">Not necessarily </w:t>
+            </w:r>
+          </w:p>
+        </w:tc>
+        <w:tc>
+          <w:tcPr>
+            <w:tcW w:w="3668" w:type="dxa"/>
+            <w:vAlign w:val="center"/>
+          </w:tcPr>
+          <w:p>
+            <w:pPr>
+              <w:jc w:val="center"/>
+            </w:pPr>
+            <w:r>
+              <w:t>Useful when many agents require paths quickly; speed-quality trade-off.</w:t>
+            </w:r>
+          </w:p>
+        </w:tc>
+      </w:tr>
+      <w:tr>
+        <w:trPr>
+          <w:trHeight w:val="550"/>
+        </w:trPr>
+        <w:tc>
+          <w:tcPr>
+            <w:tcW w:w="2462" w:type="dxa"/>
+            <w:vAlign w:val="center"/>
+          </w:tcPr>
+          <w:p>
+            <w:pPr>
+              <w:jc w:val="center"/>
+            </w:pPr>
+            <w:r>
+              <w:t>Bidirectional search (concept)</w:t>
+            </w:r>
+          </w:p>
+        </w:tc>
+        <w:tc>
+          <w:tcPr>
+            <w:tcW w:w="1620" w:type="dxa"/>
+            <w:vAlign w:val="center"/>
+          </w:tcPr>
+          <w:p>
+            <w:pPr>
+              <w:jc w:val="center"/>
+            </w:pPr>
+            <w:r>
+              <w:t>Optional</w:t>
+            </w:r>
+          </w:p>
+        </w:tc>
+        <w:tc>
+          <w:tcPr>
+            <w:tcW w:w="2591" w:type="dxa"/>
+            <w:vAlign w:val="center"/>
+          </w:tcPr>
+          <w:p>
+            <w:pPr>
+              <w:jc w:val="center"/>
+            </w:pPr>
+            <w:proofErr w:type="gramStart"/>
+            <w:r>
+              <w:t>Usually</w:t>
+            </w:r>
+            <w:proofErr w:type="gramEnd"/>
+            <w:r>
+              <w:t xml:space="preserve"> non-negative</w:t>
+            </w:r>
+          </w:p>
+        </w:tc>
+        <w:tc>
+          <w:tcPr>
+            <w:tcW w:w="1761" w:type="dxa"/>
+            <w:vAlign w:val="center"/>
+          </w:tcPr>
+          <w:p>
+            <w:pPr>
+              <w:jc w:val="center"/>
+            </w:pPr>
+            <w:r>
+              <w:t>Yes</w:t>
+            </w:r>
+          </w:p>
+        </w:tc>
+        <w:tc>
+          <w:tcPr>
+            <w:tcW w:w="2297" w:type="dxa"/>
+            <w:vAlign w:val="center"/>
+          </w:tcPr>
+          <w:p>
+            <w:pPr>
+              <w:jc w:val="center"/>
+            </w:pPr>
+            <w:r>
+              <w:t>Depends (directional Dijkstra/A*)</w:t>
+            </w:r>
+          </w:p>
+        </w:tc>
+        <w:tc>
+          <w:tcPr>
+            <w:tcW w:w="3668" w:type="dxa"/>
+            <w:vAlign w:val="center"/>
+          </w:tcPr>
+          <w:p>
+            <w:pPr>
+              <w:jc w:val="center"/>
+            </w:pPr>
+            <w:r>
+              <w:t>Can reduce explored area when start/goal are fixed and known.</w:t>
+            </w:r>
+          </w:p>
+        </w:tc>
+      </w:tr>
+    </w:tbl>
+    <w:p/>
+    <w:p/>
+    <w:p/>
+    <w:p>
+      <w:pPr>
+        <w:sectPr>
+          <w:pgSz w:w="16838" w:h="11906" w:orient="landscape"/>
+          <w:pgMar w:top="1440" w:right="1440" w:bottom="1440" w:left="1440" w:header="708" w:footer="708" w:gutter="0"/>
+          <w:cols w:space="708"/>
+          <w:docGrid w:linePitch="360"/>
+        </w:sectPr>
+      </w:pPr>
     </w:p>
     <w:p>
       <w:pPr>
         <w:pStyle w:val="Heading2"/>
       </w:pPr>
-      <w:bookmarkStart w:id="9" w:name="_Toc223389260"/>
+      <w:bookmarkStart w:id="9" w:name="_Toc223514218"/>
       <w:r>
         <w:lastRenderedPageBreak/>
         <w:t>Current Systems</w:t>
@@ -6537,7 +7780,7 @@
       <w:pPr>
         <w:pStyle w:val="Heading3"/>
       </w:pPr>
-      <w:bookmarkStart w:id="10" w:name="_Toc223389261"/>
+      <w:bookmarkStart w:id="10" w:name="_Toc223514219"/>
       <w:r>
         <w:t>Pathfinder</w:t>
       </w:r>
@@ -6608,7 +7851,7 @@
       <w:pPr>
         <w:pStyle w:val="Heading3"/>
       </w:pPr>
-      <w:bookmarkStart w:id="11" w:name="_Toc223389262"/>
+      <w:bookmarkStart w:id="11" w:name="_Toc223514220"/>
       <w:r>
         <w:t xml:space="preserve">FDS / </w:t>
       </w:r>
@@ -6691,7 +7934,7 @@
       <w:pPr>
         <w:pStyle w:val="Heading3"/>
       </w:pPr>
-      <w:bookmarkStart w:id="12" w:name="_Toc223389263"/>
+      <w:bookmarkStart w:id="12" w:name="_Toc223514221"/>
       <w:r>
         <w:t>Pathfinding Visualizer (</w:t>
       </w:r>
@@ -6753,7 +7996,7 @@
         </w:sdtContent>
       </w:sdt>
     </w:p>
-    <w:bookmarkStart w:id="13" w:name="_Toc223389264" w:displacedByCustomXml="next"/>
+    <w:bookmarkStart w:id="13" w:name="_Toc223514222" w:displacedByCustomXml="next"/>
     <w:sdt>
       <w:sdtPr>
         <w:rPr>
@@ -6803,6 +8046,64 @@
               <w:r>
                 <w:fldChar w:fldCharType="separate"/>
               </w:r>
+              <w:r>
+                <w:rPr>
+                  <w:noProof/>
+                </w:rPr>
+                <w:t xml:space="preserve">Agarwaal, K. (2025, December). </w:t>
+              </w:r>
+              <w:r>
+                <w:rPr>
+                  <w:i/>
+                  <w:iCs/>
+                  <w:noProof/>
+                </w:rPr>
+                <w:t>Logistic Regression in Machine Learning</w:t>
+              </w:r>
+              <w:r>
+                <w:rPr>
+                  <w:noProof/>
+                </w:rPr>
+                <w:t>. Retrieved from GeeksForGeeks: https://www.geeksforgeeks.org/machine-learning/understanding-logistic-regression/</w:t>
+              </w:r>
+            </w:p>
+            <w:p>
+              <w:pPr>
+                <w:pStyle w:val="Bibliography"/>
+                <w:ind w:left="720" w:hanging="720"/>
+                <w:rPr>
+                  <w:noProof/>
+                </w:rPr>
+              </w:pPr>
+              <w:r>
+                <w:rPr>
+                  <w:noProof/>
+                </w:rPr>
+                <w:t xml:space="preserve">Agarwaal, K. (2026, January). </w:t>
+              </w:r>
+              <w:r>
+                <w:rPr>
+                  <w:i/>
+                  <w:iCs/>
+                  <w:noProof/>
+                </w:rPr>
+                <w:t>Machine Learning Algorithms</w:t>
+              </w:r>
+              <w:r>
+                <w:rPr>
+                  <w:noProof/>
+                </w:rPr>
+                <w:t>. Retrieved from GeeksForGeeks: https://www.geeksforgeeks.org/machine-learning/machine-learning-algorithms/</w:t>
+              </w:r>
+            </w:p>
+            <w:p>
+              <w:pPr>
+                <w:pStyle w:val="Bibliography"/>
+                <w:ind w:left="720" w:hanging="720"/>
+                <w:rPr>
+                  <w:noProof/>
+                </w:rPr>
+              </w:pPr>
               <w:r>
                 <w:rPr>
                   <w:noProof/>
@@ -6952,35 +8253,6 @@
                 <w:rPr>
                   <w:noProof/>
                 </w:rPr>
-                <w:t xml:space="preserve">Gupta, M. (2025, September). </w:t>
-              </w:r>
-              <w:r>
-                <w:rPr>
-                  <w:i/>
-                  <w:iCs/>
-                  <w:noProof/>
-                </w:rPr>
-                <w:t>Supervised Machine Learning</w:t>
-              </w:r>
-              <w:r>
-                <w:rPr>
-                  <w:noProof/>
-                </w:rPr>
-                <w:t>. Retrieved from https://www.geeksforgeeks.org/machine-learning/supervised-machine-learning/</w:t>
-              </w:r>
-            </w:p>
-            <w:p>
-              <w:pPr>
-                <w:pStyle w:val="Bibliography"/>
-                <w:ind w:left="720" w:hanging="720"/>
-                <w:rPr>
-                  <w:noProof/>
-                </w:rPr>
-              </w:pPr>
-              <w:r>
-                <w:rPr>
-                  <w:noProof/>
-                </w:rPr>
                 <w:t xml:space="preserve">Harabor, D., &amp; Grastien, A. (2011). </w:t>
               </w:r>
               <w:r>
@@ -7097,6 +8369,7 @@
                 <w:rPr>
                   <w:noProof/>
                 </w:rPr>
+                <w:lastRenderedPageBreak/>
                 <w:t xml:space="preserve">Mihailescu, C. (2016, December). </w:t>
               </w:r>
               <w:r>
@@ -7126,7 +8399,6 @@
                 <w:rPr>
                   <w:noProof/>
                 </w:rPr>
-                <w:lastRenderedPageBreak/>
                 <w:t xml:space="preserve">MIT OpenCourseWare, Department of Electrical Engineering and Computer Science. (2011, October). </w:t>
               </w:r>
               <w:r>
@@ -7446,6 +8718,7 @@
                 <w:rPr>
                   <w:noProof/>
                 </w:rPr>
+                <w:lastRenderedPageBreak/>
                 <w:t xml:space="preserve">Weisstein, E. W. (2026, February). </w:t>
               </w:r>
               <w:r>
@@ -7470,7 +8743,6 @@
                   <w:bCs/>
                   <w:noProof/>
                 </w:rPr>
-                <w:lastRenderedPageBreak/>
                 <w:fldChar w:fldCharType="end"/>
               </w:r>
             </w:p>
@@ -13367,6 +14639,7 @@
   <w:style w:type="character" w:default="1" w:styleId="DefaultParagraphFont">
     <w:name w:val="Default Paragraph Font"/>
     <w:uiPriority w:val="1"/>
+    <w:semiHidden/>
     <w:unhideWhenUsed/>
   </w:style>
   <w:style w:type="table" w:default="1" w:styleId="TableNormal">
@@ -14232,20 +15505,20 @@
 </file>
 
 <file path=customXml/item1.xml><?xml version="1.0" encoding="utf-8"?>
+<p:properties xmlns:p="http://schemas.microsoft.com/office/2006/metadata/properties" xmlns:xsi="http://www.w3.org/2001/XMLSchema-instance" xmlns:pc="http://schemas.microsoft.com/office/infopath/2007/PartnerControls">
+  <documentManagement>
+    <_activity xmlns="5f4a01da-b34a-4766-b768-c35ceb02cbc3" xsi:nil="true"/>
+  </documentManagement>
+</p:properties>
+</file>
+
+<file path=customXml/item2.xml><?xml version="1.0" encoding="utf-8"?>
 <?mso-contentType ?>
 <FormTemplates xmlns="http://schemas.microsoft.com/sharepoint/v3/contenttype/forms">
   <Display>DocumentLibraryForm</Display>
   <Edit>DocumentLibraryForm</Edit>
   <New>DocumentLibraryForm</New>
 </FormTemplates>
-</file>
-
-<file path=customXml/item2.xml><?xml version="1.0" encoding="utf-8"?>
-<p:properties xmlns:p="http://schemas.microsoft.com/office/2006/metadata/properties" xmlns:xsi="http://www.w3.org/2001/XMLSchema-instance" xmlns:pc="http://schemas.microsoft.com/office/infopath/2007/PartnerControls">
-  <documentManagement>
-    <_activity xmlns="5f4a01da-b34a-4766-b768-c35ceb02cbc3" xsi:nil="true"/>
-  </documentManagement>
-</p:properties>
 </file>
 
 <file path=customXml/item3.xml><?xml version="1.0" encoding="utf-8"?>
@@ -14938,7 +16211,7 @@
     <b:Year>2025</b:Year>
     <b:Month>November</b:Month>
     <b:URL>https://www.nist.gov/services-resources/software/fds-and-smokeview</b:URL>
-    <b:RefOrder>22</b:RefOrder>
+    <b:RefOrder>24</b:RefOrder>
   </b:Source>
   <b:Source>
     <b:Tag>Mih16</b:Tag>
@@ -14958,45 +16231,88 @@
         </b:NameList>
       </b:Author>
     </b:Author>
-    <b:RefOrder>23</b:RefOrder>
+    <b:RefOrder>25</b:RefOrder>
+  </b:Source>
+  <b:Source>
+    <b:Tag>Aga25</b:Tag>
+    <b:SourceType>InternetSite</b:SourceType>
+    <b:Guid>{7EF38476-1196-46AC-86C6-07468D0B3B3F}</b:Guid>
+    <b:Author>
+      <b:Author>
+        <b:NameList>
+          <b:Person>
+            <b:Last>Agarwaal</b:Last>
+            <b:First>Kartik</b:First>
+          </b:Person>
+        </b:NameList>
+      </b:Author>
+    </b:Author>
+    <b:Title>Logistic Regression in Machine Learning</b:Title>
+    <b:InternetSiteTitle>GeeksForGeeks</b:InternetSiteTitle>
+    <b:Year>2025</b:Year>
+    <b:Month>December</b:Month>
+    <b:URL>https://www.geeksforgeeks.org/machine-learning/understanding-logistic-regression/</b:URL>
+    <b:RefOrder>22</b:RefOrder>
   </b:Source>
   <b:Source>
     <b:Tag>Gup25</b:Tag>
     <b:SourceType>InternetSite</b:SourceType>
-    <b:Guid>{A09D694F-714F-40AC-A538-D42D42822FEB}</b:Guid>
+    <b:Guid>{081FED7C-1353-420D-80C7-14DFD75D545C}</b:Guid>
     <b:Author>
       <b:Author>
         <b:NameList>
           <b:Person>
-            <b:Last>Gupta</b:Last>
-            <b:First>Mohit</b:First>
+            <b:Last>Agarwaal</b:Last>
+            <b:First>Kartik</b:First>
           </b:Person>
         </b:NameList>
       </b:Author>
     </b:Author>
-    <b:Title>Supervised Machine Learning</b:Title>
-    <b:Year>2025</b:Year>
-    <b:Month>September</b:Month>
-    <b:URL>https://www.geeksforgeeks.org/machine-learning/supervised-machine-learning/</b:URL>
+    <b:Title>Machine Learning Algorithms</b:Title>
+    <b:Year>2026</b:Year>
+    <b:Month>January</b:Month>
+    <b:URL>https://www.geeksforgeeks.org/machine-learning/machine-learning-algorithms/</b:URL>
+    <b:InternetSiteTitle>GeeksForGeeks</b:InternetSiteTitle>
     <b:RefOrder>21</b:RefOrder>
+  </b:Source>
+  <b:Source>
+    <b:Tag>Aga26</b:Tag>
+    <b:SourceType>InternetSite</b:SourceType>
+    <b:Guid>{9E319EF9-1137-4A9B-B92D-B198377D7EA7}</b:Guid>
+    <b:Author>
+      <b:Author>
+        <b:NameList>
+          <b:Person>
+            <b:Last>Agarwaal</b:Last>
+            <b:First>Kartik</b:First>
+          </b:Person>
+        </b:NameList>
+      </b:Author>
+    </b:Author>
+    <b:Title>K-Nearest Neighbor (KNN) Algorithm</b:Title>
+    <b:InternetSiteTitle>GeeksForGeeks</b:InternetSiteTitle>
+    <b:Year>2026</b:Year>
+    <b:Month>February</b:Month>
+    <b:URL>https://www.geeksforgeeks.org/machine-learning/k-nearest-neighbours/</b:URL>
+    <b:RefOrder>23</b:RefOrder>
   </b:Source>
 </b:Sources>
 </file>
 
 <file path=customXml/itemProps1.xml><?xml version="1.0" encoding="utf-8"?>
-<ds:datastoreItem xmlns:ds="http://schemas.openxmlformats.org/officeDocument/2006/customXml" ds:itemID="{915FD409-9B20-470D-AC90-3D4035788ECE}">
+<ds:datastoreItem xmlns:ds="http://schemas.openxmlformats.org/officeDocument/2006/customXml" ds:itemID="{42527EE8-AF54-48EF-AE79-A35F49790338}">
   <ds:schemaRefs>
-    <ds:schemaRef ds:uri="http://schemas.microsoft.com/sharepoint/v3/contenttype/forms"/>
+    <ds:schemaRef ds:uri="http://schemas.microsoft.com/office/2006/metadata/properties"/>
+    <ds:schemaRef ds:uri="http://schemas.microsoft.com/office/infopath/2007/PartnerControls"/>
+    <ds:schemaRef ds:uri="5f4a01da-b34a-4766-b768-c35ceb02cbc3"/>
   </ds:schemaRefs>
 </ds:datastoreItem>
 </file>
 
 <file path=customXml/itemProps2.xml><?xml version="1.0" encoding="utf-8"?>
-<ds:datastoreItem xmlns:ds="http://schemas.openxmlformats.org/officeDocument/2006/customXml" ds:itemID="{42527EE8-AF54-48EF-AE79-A35F49790338}">
+<ds:datastoreItem xmlns:ds="http://schemas.openxmlformats.org/officeDocument/2006/customXml" ds:itemID="{915FD409-9B20-470D-AC90-3D4035788ECE}">
   <ds:schemaRefs>
-    <ds:schemaRef ds:uri="http://schemas.microsoft.com/office/2006/metadata/properties"/>
-    <ds:schemaRef ds:uri="http://schemas.microsoft.com/office/infopath/2007/PartnerControls"/>
-    <ds:schemaRef ds:uri="5f4a01da-b34a-4766-b768-c35ceb02cbc3"/>
+    <ds:schemaRef ds:uri="http://schemas.microsoft.com/sharepoint/v3/contenttype/forms"/>
   </ds:schemaRefs>
 </ds:datastoreItem>
 </file>
@@ -15021,7 +16337,7 @@
 </file>
 
 <file path=customXml/itemProps4.xml><?xml version="1.0" encoding="utf-8"?>
-<ds:datastoreItem xmlns:ds="http://schemas.openxmlformats.org/officeDocument/2006/customXml" ds:itemID="{BF4966B2-DDB6-4454-9B2E-F720FD9F1422}">
+<ds:datastoreItem xmlns:ds="http://schemas.openxmlformats.org/officeDocument/2006/customXml" ds:itemID="{59E72B8F-2551-49E5-8B89-0012624BE923}">
   <ds:schemaRefs>
     <ds:schemaRef ds:uri="http://schemas.openxmlformats.org/officeDocument/2006/bibliography"/>
   </ds:schemaRefs>

</xml_diff>

<commit_message>
docs: finalise project objectives; begin design section
</commit_message>
<xml_diff>
--- a/Project Report.docx
+++ b/Project Report.docx
@@ -178,9 +178,6 @@
     <w:sdt>
       <w:sdtPr>
         <w:rPr>
-          <w:b w:val="0"/>
-          <w:bCs w:val="0"/>
-          <w:smallCaps w:val="0"/>
           <w:spacing w:val="0"/>
           <w:sz w:val="24"/>
           <w:szCs w:val="24"/>
@@ -193,6 +190,9 @@
       </w:sdtPr>
       <w:sdtEndPr>
         <w:rPr>
+          <w:b w:val="0"/>
+          <w:bCs w:val="0"/>
+          <w:smallCaps w:val="0"/>
           <w:noProof/>
         </w:rPr>
       </w:sdtEndPr>
@@ -227,7 +227,7 @@
           <w:r>
             <w:fldChar w:fldCharType="separate"/>
           </w:r>
-          <w:hyperlink w:anchor="_Toc223895410" w:history="1">
+          <w:hyperlink w:anchor="_Toc223914832" w:history="1">
             <w:r>
               <w:rPr>
                 <w:rStyle w:val="Hyperlink"/>
@@ -254,7 +254,7 @@
                 <w:noProof/>
                 <w:webHidden/>
               </w:rPr>
-              <w:instrText xml:space="preserve"> PAGEREF _Toc223895410 \h </w:instrText>
+              <w:instrText xml:space="preserve"> PAGEREF _Toc223914832 \h </w:instrText>
             </w:r>
             <w:r>
               <w:rPr>
@@ -298,7 +298,7 @@
               <w14:ligatures w14:val="standardContextual"/>
             </w:rPr>
           </w:pPr>
-          <w:hyperlink w:anchor="_Toc223895411" w:history="1">
+          <w:hyperlink w:anchor="_Toc223914833" w:history="1">
             <w:r>
               <w:rPr>
                 <w:rStyle w:val="Hyperlink"/>
@@ -325,7 +325,7 @@
                 <w:noProof/>
                 <w:webHidden/>
               </w:rPr>
-              <w:instrText xml:space="preserve"> PAGEREF _Toc223895411 \h </w:instrText>
+              <w:instrText xml:space="preserve"> PAGEREF _Toc223914833 \h </w:instrText>
             </w:r>
             <w:r>
               <w:rPr>
@@ -345,7 +345,7 @@
                 <w:noProof/>
                 <w:webHidden/>
               </w:rPr>
-              <w:t>1</w:t>
+              <w:t>2</w:t>
             </w:r>
             <w:r>
               <w:rPr>
@@ -369,7 +369,7 @@
               <w14:ligatures w14:val="standardContextual"/>
             </w:rPr>
           </w:pPr>
-          <w:hyperlink w:anchor="_Toc223895412" w:history="1">
+          <w:hyperlink w:anchor="_Toc223914834" w:history="1">
             <w:r>
               <w:rPr>
                 <w:rStyle w:val="Hyperlink"/>
@@ -396,7 +396,7 @@
                 <w:noProof/>
                 <w:webHidden/>
               </w:rPr>
-              <w:instrText xml:space="preserve"> PAGEREF _Toc223895412 \h </w:instrText>
+              <w:instrText xml:space="preserve"> PAGEREF _Toc223914834 \h </w:instrText>
             </w:r>
             <w:r>
               <w:rPr>
@@ -416,7 +416,7 @@
                 <w:noProof/>
                 <w:webHidden/>
               </w:rPr>
-              <w:t>2</w:t>
+              <w:t>3</w:t>
             </w:r>
             <w:r>
               <w:rPr>
@@ -440,7 +440,7 @@
               <w14:ligatures w14:val="standardContextual"/>
             </w:rPr>
           </w:pPr>
-          <w:hyperlink w:anchor="_Toc223895413" w:history="1">
+          <w:hyperlink w:anchor="_Toc223914835" w:history="1">
             <w:r>
               <w:rPr>
                 <w:rStyle w:val="Hyperlink"/>
@@ -467,7 +467,7 @@
                 <w:noProof/>
                 <w:webHidden/>
               </w:rPr>
-              <w:instrText xml:space="preserve"> PAGEREF _Toc223895413 \h </w:instrText>
+              <w:instrText xml:space="preserve"> PAGEREF _Toc223914835 \h </w:instrText>
             </w:r>
             <w:r>
               <w:rPr>
@@ -487,7 +487,7 @@
                 <w:noProof/>
                 <w:webHidden/>
               </w:rPr>
-              <w:t>2</w:t>
+              <w:t>3</w:t>
             </w:r>
             <w:r>
               <w:rPr>
@@ -511,7 +511,7 @@
               <w14:ligatures w14:val="standardContextual"/>
             </w:rPr>
           </w:pPr>
-          <w:hyperlink w:anchor="_Toc223895414" w:history="1">
+          <w:hyperlink w:anchor="_Toc223914836" w:history="1">
             <w:r>
               <w:rPr>
                 <w:rStyle w:val="Hyperlink"/>
@@ -538,7 +538,7 @@
                 <w:noProof/>
                 <w:webHidden/>
               </w:rPr>
-              <w:instrText xml:space="preserve"> PAGEREF _Toc223895414 \h </w:instrText>
+              <w:instrText xml:space="preserve"> PAGEREF _Toc223914836 \h </w:instrText>
             </w:r>
             <w:r>
               <w:rPr>
@@ -558,7 +558,7 @@
                 <w:noProof/>
                 <w:webHidden/>
               </w:rPr>
-              <w:t>2</w:t>
+              <w:t>3</w:t>
             </w:r>
             <w:r>
               <w:rPr>
@@ -582,7 +582,7 @@
               <w14:ligatures w14:val="standardContextual"/>
             </w:rPr>
           </w:pPr>
-          <w:hyperlink w:anchor="_Toc223895415" w:history="1">
+          <w:hyperlink w:anchor="_Toc223914837" w:history="1">
             <w:r>
               <w:rPr>
                 <w:rStyle w:val="Hyperlink"/>
@@ -609,7 +609,7 @@
                 <w:noProof/>
                 <w:webHidden/>
               </w:rPr>
-              <w:instrText xml:space="preserve"> PAGEREF _Toc223895415 \h </w:instrText>
+              <w:instrText xml:space="preserve"> PAGEREF _Toc223914837 \h </w:instrText>
             </w:r>
             <w:r>
               <w:rPr>
@@ -629,7 +629,7 @@
                 <w:noProof/>
                 <w:webHidden/>
               </w:rPr>
-              <w:t>3</w:t>
+              <w:t>4</w:t>
             </w:r>
             <w:r>
               <w:rPr>
@@ -653,7 +653,7 @@
               <w14:ligatures w14:val="standardContextual"/>
             </w:rPr>
           </w:pPr>
-          <w:hyperlink w:anchor="_Toc223895416" w:history="1">
+          <w:hyperlink w:anchor="_Toc223914838" w:history="1">
             <w:r>
               <w:rPr>
                 <w:rStyle w:val="Hyperlink"/>
@@ -680,7 +680,7 @@
                 <w:noProof/>
                 <w:webHidden/>
               </w:rPr>
-              <w:instrText xml:space="preserve"> PAGEREF _Toc223895416 \h </w:instrText>
+              <w:instrText xml:space="preserve"> PAGEREF _Toc223914838 \h </w:instrText>
             </w:r>
             <w:r>
               <w:rPr>
@@ -700,7 +700,7 @@
                 <w:noProof/>
                 <w:webHidden/>
               </w:rPr>
-              <w:t>3</w:t>
+              <w:t>4</w:t>
             </w:r>
             <w:r>
               <w:rPr>
@@ -724,7 +724,7 @@
               <w14:ligatures w14:val="standardContextual"/>
             </w:rPr>
           </w:pPr>
-          <w:hyperlink w:anchor="_Toc223895417" w:history="1">
+          <w:hyperlink w:anchor="_Toc223914839" w:history="1">
             <w:r>
               <w:rPr>
                 <w:rStyle w:val="Hyperlink"/>
@@ -751,7 +751,7 @@
                 <w:noProof/>
                 <w:webHidden/>
               </w:rPr>
-              <w:instrText xml:space="preserve"> PAGEREF _Toc223895417 \h </w:instrText>
+              <w:instrText xml:space="preserve"> PAGEREF _Toc223914839 \h </w:instrText>
             </w:r>
             <w:r>
               <w:rPr>
@@ -771,7 +771,7 @@
                 <w:noProof/>
                 <w:webHidden/>
               </w:rPr>
-              <w:t>7</w:t>
+              <w:t>8</w:t>
             </w:r>
             <w:r>
               <w:rPr>
@@ -795,7 +795,7 @@
               <w14:ligatures w14:val="standardContextual"/>
             </w:rPr>
           </w:pPr>
-          <w:hyperlink w:anchor="_Toc223895418" w:history="1">
+          <w:hyperlink w:anchor="_Toc223914840" w:history="1">
             <w:r>
               <w:rPr>
                 <w:rStyle w:val="Hyperlink"/>
@@ -822,7 +822,7 @@
                 <w:noProof/>
                 <w:webHidden/>
               </w:rPr>
-              <w:instrText xml:space="preserve"> PAGEREF _Toc223895418 \h </w:instrText>
+              <w:instrText xml:space="preserve"> PAGEREF _Toc223914840 \h </w:instrText>
             </w:r>
             <w:r>
               <w:rPr>
@@ -842,7 +842,7 @@
                 <w:noProof/>
                 <w:webHidden/>
               </w:rPr>
-              <w:t>9</w:t>
+              <w:t>10</w:t>
             </w:r>
             <w:r>
               <w:rPr>
@@ -866,7 +866,7 @@
               <w14:ligatures w14:val="standardContextual"/>
             </w:rPr>
           </w:pPr>
-          <w:hyperlink w:anchor="_Toc223895419" w:history="1">
+          <w:hyperlink w:anchor="_Toc223914841" w:history="1">
             <w:r>
               <w:rPr>
                 <w:rStyle w:val="Hyperlink"/>
@@ -893,7 +893,7 @@
                 <w:noProof/>
                 <w:webHidden/>
               </w:rPr>
-              <w:instrText xml:space="preserve"> PAGEREF _Toc223895419 \h </w:instrText>
+              <w:instrText xml:space="preserve"> PAGEREF _Toc223914841 \h </w:instrText>
             </w:r>
             <w:r>
               <w:rPr>
@@ -913,7 +913,7 @@
                 <w:noProof/>
                 <w:webHidden/>
               </w:rPr>
-              <w:t>13</w:t>
+              <w:t>14</w:t>
             </w:r>
             <w:r>
               <w:rPr>
@@ -937,7 +937,7 @@
               <w14:ligatures w14:val="standardContextual"/>
             </w:rPr>
           </w:pPr>
-          <w:hyperlink w:anchor="_Toc223895420" w:history="1">
+          <w:hyperlink w:anchor="_Toc223914842" w:history="1">
             <w:r>
               <w:rPr>
                 <w:rStyle w:val="Hyperlink"/>
@@ -964,7 +964,7 @@
                 <w:noProof/>
                 <w:webHidden/>
               </w:rPr>
-              <w:instrText xml:space="preserve"> PAGEREF _Toc223895420 \h </w:instrText>
+              <w:instrText xml:space="preserve"> PAGEREF _Toc223914842 \h </w:instrText>
             </w:r>
             <w:r>
               <w:rPr>
@@ -984,7 +984,7 @@
                 <w:noProof/>
                 <w:webHidden/>
               </w:rPr>
-              <w:t>13</w:t>
+              <w:t>14</w:t>
             </w:r>
             <w:r>
               <w:rPr>
@@ -1008,7 +1008,7 @@
               <w14:ligatures w14:val="standardContextual"/>
             </w:rPr>
           </w:pPr>
-          <w:hyperlink w:anchor="_Toc223895421" w:history="1">
+          <w:hyperlink w:anchor="_Toc223914843" w:history="1">
             <w:r>
               <w:rPr>
                 <w:rStyle w:val="Hyperlink"/>
@@ -1035,7 +1035,7 @@
                 <w:noProof/>
                 <w:webHidden/>
               </w:rPr>
-              <w:instrText xml:space="preserve"> PAGEREF _Toc223895421 \h </w:instrText>
+              <w:instrText xml:space="preserve"> PAGEREF _Toc223914843 \h </w:instrText>
             </w:r>
             <w:r>
               <w:rPr>
@@ -1055,7 +1055,7 @@
                 <w:noProof/>
                 <w:webHidden/>
               </w:rPr>
-              <w:t>13</w:t>
+              <w:t>14</w:t>
             </w:r>
             <w:r>
               <w:rPr>
@@ -1079,7 +1079,7 @@
               <w14:ligatures w14:val="standardContextual"/>
             </w:rPr>
           </w:pPr>
-          <w:hyperlink w:anchor="_Toc223895422" w:history="1">
+          <w:hyperlink w:anchor="_Toc223914844" w:history="1">
             <w:r>
               <w:rPr>
                 <w:rStyle w:val="Hyperlink"/>
@@ -1106,7 +1106,7 @@
                 <w:noProof/>
                 <w:webHidden/>
               </w:rPr>
-              <w:instrText xml:space="preserve"> PAGEREF _Toc223895422 \h </w:instrText>
+              <w:instrText xml:space="preserve"> PAGEREF _Toc223914844 \h </w:instrText>
             </w:r>
             <w:r>
               <w:rPr>
@@ -1126,7 +1126,7 @@
                 <w:noProof/>
                 <w:webHidden/>
               </w:rPr>
-              <w:t>13</w:t>
+              <w:t>14</w:t>
             </w:r>
             <w:r>
               <w:rPr>
@@ -1150,7 +1150,7 @@
               <w14:ligatures w14:val="standardContextual"/>
             </w:rPr>
           </w:pPr>
-          <w:hyperlink w:anchor="_Toc223895423" w:history="1">
+          <w:hyperlink w:anchor="_Toc223914845" w:history="1">
             <w:r>
               <w:rPr>
                 <w:rStyle w:val="Hyperlink"/>
@@ -1177,7 +1177,7 @@
                 <w:noProof/>
                 <w:webHidden/>
               </w:rPr>
-              <w:instrText xml:space="preserve"> PAGEREF _Toc223895423 \h </w:instrText>
+              <w:instrText xml:space="preserve"> PAGEREF _Toc223914845 \h </w:instrText>
             </w:r>
             <w:r>
               <w:rPr>
@@ -1197,7 +1197,7 @@
                 <w:noProof/>
                 <w:webHidden/>
               </w:rPr>
-              <w:t>14</w:t>
+              <w:t>15</w:t>
             </w:r>
             <w:r>
               <w:rPr>
@@ -1221,7 +1221,7 @@
               <w14:ligatures w14:val="standardContextual"/>
             </w:rPr>
           </w:pPr>
-          <w:hyperlink w:anchor="_Toc223895424" w:history="1">
+          <w:hyperlink w:anchor="_Toc223914846" w:history="1">
             <w:r>
               <w:rPr>
                 <w:rStyle w:val="Hyperlink"/>
@@ -1248,7 +1248,7 @@
                 <w:noProof/>
                 <w:webHidden/>
               </w:rPr>
-              <w:instrText xml:space="preserve"> PAGEREF _Toc223895424 \h </w:instrText>
+              <w:instrText xml:space="preserve"> PAGEREF _Toc223914846 \h </w:instrText>
             </w:r>
             <w:r>
               <w:rPr>
@@ -1268,7 +1268,291 @@
                 <w:noProof/>
                 <w:webHidden/>
               </w:rPr>
-              <w:t>14</w:t>
+              <w:t>15</w:t>
+            </w:r>
+            <w:r>
+              <w:rPr>
+                <w:noProof/>
+                <w:webHidden/>
+              </w:rPr>
+              <w:fldChar w:fldCharType="end"/>
+            </w:r>
+          </w:hyperlink>
+        </w:p>
+        <w:p>
+          <w:pPr>
+            <w:pStyle w:val="TOC2"/>
+            <w:tabs>
+              <w:tab w:val="right" w:leader="dot" w:pos="9016"/>
+            </w:tabs>
+            <w:rPr>
+              <w:noProof/>
+              <w:kern w:val="2"/>
+              <w:lang w:eastAsia="en-GB"/>
+              <w14:ligatures w14:val="standardContextual"/>
+            </w:rPr>
+          </w:pPr>
+          <w:hyperlink w:anchor="_Toc223914847" w:history="1">
+            <w:r>
+              <w:rPr>
+                <w:rStyle w:val="Hyperlink"/>
+                <w:noProof/>
+              </w:rPr>
+              <w:t>Justification of Design Choices and Limitations</w:t>
+            </w:r>
+            <w:r>
+              <w:rPr>
+                <w:noProof/>
+                <w:webHidden/>
+              </w:rPr>
+              <w:tab/>
+            </w:r>
+            <w:r>
+              <w:rPr>
+                <w:noProof/>
+                <w:webHidden/>
+              </w:rPr>
+              <w:fldChar w:fldCharType="begin"/>
+            </w:r>
+            <w:r>
+              <w:rPr>
+                <w:noProof/>
+                <w:webHidden/>
+              </w:rPr>
+              <w:instrText xml:space="preserve"> PAGEREF _Toc223914847 \h </w:instrText>
+            </w:r>
+            <w:r>
+              <w:rPr>
+                <w:noProof/>
+                <w:webHidden/>
+              </w:rPr>
+            </w:r>
+            <w:r>
+              <w:rPr>
+                <w:noProof/>
+                <w:webHidden/>
+              </w:rPr>
+              <w:fldChar w:fldCharType="separate"/>
+            </w:r>
+            <w:r>
+              <w:rPr>
+                <w:noProof/>
+                <w:webHidden/>
+              </w:rPr>
+              <w:t>23</w:t>
+            </w:r>
+            <w:r>
+              <w:rPr>
+                <w:noProof/>
+                <w:webHidden/>
+              </w:rPr>
+              <w:fldChar w:fldCharType="end"/>
+            </w:r>
+          </w:hyperlink>
+        </w:p>
+        <w:p>
+          <w:pPr>
+            <w:pStyle w:val="TOC3"/>
+            <w:tabs>
+              <w:tab w:val="right" w:leader="dot" w:pos="9016"/>
+            </w:tabs>
+            <w:rPr>
+              <w:noProof/>
+              <w:kern w:val="2"/>
+              <w:lang w:eastAsia="en-GB"/>
+              <w14:ligatures w14:val="standardContextual"/>
+            </w:rPr>
+          </w:pPr>
+          <w:hyperlink w:anchor="_Toc223914848" w:history="1">
+            <w:r>
+              <w:rPr>
+                <w:rStyle w:val="Hyperlink"/>
+                <w:noProof/>
+              </w:rPr>
+              <w:t>Machine Learning</w:t>
+            </w:r>
+            <w:r>
+              <w:rPr>
+                <w:noProof/>
+                <w:webHidden/>
+              </w:rPr>
+              <w:tab/>
+            </w:r>
+            <w:r>
+              <w:rPr>
+                <w:noProof/>
+                <w:webHidden/>
+              </w:rPr>
+              <w:fldChar w:fldCharType="begin"/>
+            </w:r>
+            <w:r>
+              <w:rPr>
+                <w:noProof/>
+                <w:webHidden/>
+              </w:rPr>
+              <w:instrText xml:space="preserve"> PAGEREF _Toc223914848 \h </w:instrText>
+            </w:r>
+            <w:r>
+              <w:rPr>
+                <w:noProof/>
+                <w:webHidden/>
+              </w:rPr>
+            </w:r>
+            <w:r>
+              <w:rPr>
+                <w:noProof/>
+                <w:webHidden/>
+              </w:rPr>
+              <w:fldChar w:fldCharType="separate"/>
+            </w:r>
+            <w:r>
+              <w:rPr>
+                <w:noProof/>
+                <w:webHidden/>
+              </w:rPr>
+              <w:t>23</w:t>
+            </w:r>
+            <w:r>
+              <w:rPr>
+                <w:noProof/>
+                <w:webHidden/>
+              </w:rPr>
+              <w:fldChar w:fldCharType="end"/>
+            </w:r>
+          </w:hyperlink>
+        </w:p>
+        <w:p>
+          <w:pPr>
+            <w:pStyle w:val="TOC3"/>
+            <w:tabs>
+              <w:tab w:val="right" w:leader="dot" w:pos="9016"/>
+            </w:tabs>
+            <w:rPr>
+              <w:noProof/>
+              <w:kern w:val="2"/>
+              <w:lang w:eastAsia="en-GB"/>
+              <w14:ligatures w14:val="standardContextual"/>
+            </w:rPr>
+          </w:pPr>
+          <w:hyperlink w:anchor="_Toc223914849" w:history="1">
+            <w:r>
+              <w:rPr>
+                <w:rStyle w:val="Hyperlink"/>
+                <w:noProof/>
+              </w:rPr>
+              <w:t>Pathfinding / Traversal Algorithms</w:t>
+            </w:r>
+            <w:r>
+              <w:rPr>
+                <w:noProof/>
+                <w:webHidden/>
+              </w:rPr>
+              <w:tab/>
+            </w:r>
+            <w:r>
+              <w:rPr>
+                <w:noProof/>
+                <w:webHidden/>
+              </w:rPr>
+              <w:fldChar w:fldCharType="begin"/>
+            </w:r>
+            <w:r>
+              <w:rPr>
+                <w:noProof/>
+                <w:webHidden/>
+              </w:rPr>
+              <w:instrText xml:space="preserve"> PAGEREF _Toc223914849 \h </w:instrText>
+            </w:r>
+            <w:r>
+              <w:rPr>
+                <w:noProof/>
+                <w:webHidden/>
+              </w:rPr>
+            </w:r>
+            <w:r>
+              <w:rPr>
+                <w:noProof/>
+                <w:webHidden/>
+              </w:rPr>
+              <w:fldChar w:fldCharType="separate"/>
+            </w:r>
+            <w:r>
+              <w:rPr>
+                <w:noProof/>
+                <w:webHidden/>
+              </w:rPr>
+              <w:t>23</w:t>
+            </w:r>
+            <w:r>
+              <w:rPr>
+                <w:noProof/>
+                <w:webHidden/>
+              </w:rPr>
+              <w:fldChar w:fldCharType="end"/>
+            </w:r>
+          </w:hyperlink>
+        </w:p>
+        <w:p>
+          <w:pPr>
+            <w:pStyle w:val="TOC2"/>
+            <w:tabs>
+              <w:tab w:val="right" w:leader="dot" w:pos="9016"/>
+            </w:tabs>
+            <w:rPr>
+              <w:noProof/>
+              <w:kern w:val="2"/>
+              <w:lang w:eastAsia="en-GB"/>
+              <w14:ligatures w14:val="standardContextual"/>
+            </w:rPr>
+          </w:pPr>
+          <w:hyperlink w:anchor="_Toc223914850" w:history="1">
+            <w:r>
+              <w:rPr>
+                <w:rStyle w:val="Hyperlink"/>
+                <w:noProof/>
+              </w:rPr>
+              <w:t>Project Objectives</w:t>
+            </w:r>
+            <w:r>
+              <w:rPr>
+                <w:noProof/>
+                <w:webHidden/>
+              </w:rPr>
+              <w:tab/>
+            </w:r>
+            <w:r>
+              <w:rPr>
+                <w:noProof/>
+                <w:webHidden/>
+              </w:rPr>
+              <w:fldChar w:fldCharType="begin"/>
+            </w:r>
+            <w:r>
+              <w:rPr>
+                <w:noProof/>
+                <w:webHidden/>
+              </w:rPr>
+              <w:instrText xml:space="preserve"> PAGEREF _Toc223914850 \h </w:instrText>
+            </w:r>
+            <w:r>
+              <w:rPr>
+                <w:noProof/>
+                <w:webHidden/>
+              </w:rPr>
+            </w:r>
+            <w:r>
+              <w:rPr>
+                <w:noProof/>
+                <w:webHidden/>
+              </w:rPr>
+              <w:fldChar w:fldCharType="separate"/>
+            </w:r>
+            <w:r>
+              <w:rPr>
+                <w:noProof/>
+                <w:webHidden/>
+              </w:rPr>
+              <w:t>25</w:t>
             </w:r>
             <w:r>
               <w:rPr>
@@ -1292,13 +1576,13 @@
               <w14:ligatures w14:val="standardContextual"/>
             </w:rPr>
           </w:pPr>
-          <w:hyperlink w:anchor="_Toc223895425" w:history="1">
+          <w:hyperlink w:anchor="_Toc223914851" w:history="1">
             <w:r>
               <w:rPr>
                 <w:rStyle w:val="Hyperlink"/>
                 <w:noProof/>
               </w:rPr>
-              <w:t>References</w:t>
+              <w:t>Design</w:t>
             </w:r>
             <w:r>
               <w:rPr>
@@ -1319,7 +1603,7 @@
                 <w:noProof/>
                 <w:webHidden/>
               </w:rPr>
-              <w:instrText xml:space="preserve"> PAGEREF _Toc223895425 \h </w:instrText>
+              <w:instrText xml:space="preserve"> PAGEREF _Toc223914851 \h </w:instrText>
             </w:r>
             <w:r>
               <w:rPr>
@@ -1339,7 +1623,504 @@
                 <w:noProof/>
                 <w:webHidden/>
               </w:rPr>
-              <w:t>20</w:t>
+              <w:t>27</w:t>
+            </w:r>
+            <w:r>
+              <w:rPr>
+                <w:noProof/>
+                <w:webHidden/>
+              </w:rPr>
+              <w:fldChar w:fldCharType="end"/>
+            </w:r>
+          </w:hyperlink>
+        </w:p>
+        <w:p>
+          <w:pPr>
+            <w:pStyle w:val="TOC2"/>
+            <w:tabs>
+              <w:tab w:val="right" w:leader="dot" w:pos="9016"/>
+            </w:tabs>
+            <w:rPr>
+              <w:noProof/>
+              <w:kern w:val="2"/>
+              <w:lang w:eastAsia="en-GB"/>
+              <w14:ligatures w14:val="standardContextual"/>
+            </w:rPr>
+          </w:pPr>
+          <w:hyperlink w:anchor="_Toc223914852" w:history="1">
+            <w:r>
+              <w:rPr>
+                <w:rStyle w:val="Hyperlink"/>
+                <w:noProof/>
+              </w:rPr>
+              <w:t>Description</w:t>
+            </w:r>
+            <w:r>
+              <w:rPr>
+                <w:noProof/>
+                <w:webHidden/>
+              </w:rPr>
+              <w:tab/>
+            </w:r>
+            <w:r>
+              <w:rPr>
+                <w:noProof/>
+                <w:webHidden/>
+              </w:rPr>
+              <w:fldChar w:fldCharType="begin"/>
+            </w:r>
+            <w:r>
+              <w:rPr>
+                <w:noProof/>
+                <w:webHidden/>
+              </w:rPr>
+              <w:instrText xml:space="preserve"> PAGEREF _Toc223914852 \h </w:instrText>
+            </w:r>
+            <w:r>
+              <w:rPr>
+                <w:noProof/>
+                <w:webHidden/>
+              </w:rPr>
+            </w:r>
+            <w:r>
+              <w:rPr>
+                <w:noProof/>
+                <w:webHidden/>
+              </w:rPr>
+              <w:fldChar w:fldCharType="separate"/>
+            </w:r>
+            <w:r>
+              <w:rPr>
+                <w:noProof/>
+                <w:webHidden/>
+              </w:rPr>
+              <w:t>28</w:t>
+            </w:r>
+            <w:r>
+              <w:rPr>
+                <w:noProof/>
+                <w:webHidden/>
+              </w:rPr>
+              <w:fldChar w:fldCharType="end"/>
+            </w:r>
+          </w:hyperlink>
+        </w:p>
+        <w:p>
+          <w:pPr>
+            <w:pStyle w:val="TOC2"/>
+            <w:tabs>
+              <w:tab w:val="right" w:leader="dot" w:pos="9016"/>
+            </w:tabs>
+            <w:rPr>
+              <w:noProof/>
+              <w:kern w:val="2"/>
+              <w:lang w:eastAsia="en-GB"/>
+              <w14:ligatures w14:val="standardContextual"/>
+            </w:rPr>
+          </w:pPr>
+          <w:hyperlink w:anchor="_Toc223914853" w:history="1">
+            <w:r>
+              <w:rPr>
+                <w:rStyle w:val="Hyperlink"/>
+                <w:noProof/>
+              </w:rPr>
+              <w:t>Data Design</w:t>
+            </w:r>
+            <w:r>
+              <w:rPr>
+                <w:noProof/>
+                <w:webHidden/>
+              </w:rPr>
+              <w:tab/>
+            </w:r>
+            <w:r>
+              <w:rPr>
+                <w:noProof/>
+                <w:webHidden/>
+              </w:rPr>
+              <w:fldChar w:fldCharType="begin"/>
+            </w:r>
+            <w:r>
+              <w:rPr>
+                <w:noProof/>
+                <w:webHidden/>
+              </w:rPr>
+              <w:instrText xml:space="preserve"> PAGEREF _Toc223914853 \h </w:instrText>
+            </w:r>
+            <w:r>
+              <w:rPr>
+                <w:noProof/>
+                <w:webHidden/>
+              </w:rPr>
+            </w:r>
+            <w:r>
+              <w:rPr>
+                <w:noProof/>
+                <w:webHidden/>
+              </w:rPr>
+              <w:fldChar w:fldCharType="separate"/>
+            </w:r>
+            <w:r>
+              <w:rPr>
+                <w:noProof/>
+                <w:webHidden/>
+              </w:rPr>
+              <w:t>29</w:t>
+            </w:r>
+            <w:r>
+              <w:rPr>
+                <w:noProof/>
+                <w:webHidden/>
+              </w:rPr>
+              <w:fldChar w:fldCharType="end"/>
+            </w:r>
+          </w:hyperlink>
+        </w:p>
+        <w:p>
+          <w:pPr>
+            <w:pStyle w:val="TOC3"/>
+            <w:tabs>
+              <w:tab w:val="right" w:leader="dot" w:pos="9016"/>
+            </w:tabs>
+            <w:rPr>
+              <w:noProof/>
+              <w:kern w:val="2"/>
+              <w:lang w:eastAsia="en-GB"/>
+              <w14:ligatures w14:val="standardContextual"/>
+            </w:rPr>
+          </w:pPr>
+          <w:hyperlink w:anchor="_Toc223914854" w:history="1">
+            <w:r>
+              <w:rPr>
+                <w:rStyle w:val="Hyperlink"/>
+                <w:noProof/>
+              </w:rPr>
+              <w:t>Grid Representation</w:t>
+            </w:r>
+            <w:r>
+              <w:rPr>
+                <w:noProof/>
+                <w:webHidden/>
+              </w:rPr>
+              <w:tab/>
+            </w:r>
+            <w:r>
+              <w:rPr>
+                <w:noProof/>
+                <w:webHidden/>
+              </w:rPr>
+              <w:fldChar w:fldCharType="begin"/>
+            </w:r>
+            <w:r>
+              <w:rPr>
+                <w:noProof/>
+                <w:webHidden/>
+              </w:rPr>
+              <w:instrText xml:space="preserve"> PAGEREF _Toc223914854 \h </w:instrText>
+            </w:r>
+            <w:r>
+              <w:rPr>
+                <w:noProof/>
+                <w:webHidden/>
+              </w:rPr>
+            </w:r>
+            <w:r>
+              <w:rPr>
+                <w:noProof/>
+                <w:webHidden/>
+              </w:rPr>
+              <w:fldChar w:fldCharType="separate"/>
+            </w:r>
+            <w:r>
+              <w:rPr>
+                <w:noProof/>
+                <w:webHidden/>
+              </w:rPr>
+              <w:t>29</w:t>
+            </w:r>
+            <w:r>
+              <w:rPr>
+                <w:noProof/>
+                <w:webHidden/>
+              </w:rPr>
+              <w:fldChar w:fldCharType="end"/>
+            </w:r>
+          </w:hyperlink>
+        </w:p>
+        <w:p>
+          <w:pPr>
+            <w:pStyle w:val="TOC3"/>
+            <w:tabs>
+              <w:tab w:val="right" w:leader="dot" w:pos="9016"/>
+            </w:tabs>
+            <w:rPr>
+              <w:noProof/>
+              <w:kern w:val="2"/>
+              <w:lang w:eastAsia="en-GB"/>
+              <w14:ligatures w14:val="standardContextual"/>
+            </w:rPr>
+          </w:pPr>
+          <w:hyperlink w:anchor="_Toc223914855" w:history="1">
+            <w:r>
+              <w:rPr>
+                <w:rStyle w:val="Hyperlink"/>
+                <w:noProof/>
+              </w:rPr>
+              <w:t>Agent Representation</w:t>
+            </w:r>
+            <w:r>
+              <w:rPr>
+                <w:noProof/>
+                <w:webHidden/>
+              </w:rPr>
+              <w:tab/>
+            </w:r>
+            <w:r>
+              <w:rPr>
+                <w:noProof/>
+                <w:webHidden/>
+              </w:rPr>
+              <w:fldChar w:fldCharType="begin"/>
+            </w:r>
+            <w:r>
+              <w:rPr>
+                <w:noProof/>
+                <w:webHidden/>
+              </w:rPr>
+              <w:instrText xml:space="preserve"> PAGEREF _Toc223914855 \h </w:instrText>
+            </w:r>
+            <w:r>
+              <w:rPr>
+                <w:noProof/>
+                <w:webHidden/>
+              </w:rPr>
+            </w:r>
+            <w:r>
+              <w:rPr>
+                <w:noProof/>
+                <w:webHidden/>
+              </w:rPr>
+              <w:fldChar w:fldCharType="separate"/>
+            </w:r>
+            <w:r>
+              <w:rPr>
+                <w:noProof/>
+                <w:webHidden/>
+              </w:rPr>
+              <w:t>29</w:t>
+            </w:r>
+            <w:r>
+              <w:rPr>
+                <w:noProof/>
+                <w:webHidden/>
+              </w:rPr>
+              <w:fldChar w:fldCharType="end"/>
+            </w:r>
+          </w:hyperlink>
+        </w:p>
+        <w:p>
+          <w:pPr>
+            <w:pStyle w:val="TOC3"/>
+            <w:tabs>
+              <w:tab w:val="right" w:leader="dot" w:pos="9016"/>
+            </w:tabs>
+            <w:rPr>
+              <w:noProof/>
+              <w:kern w:val="2"/>
+              <w:lang w:eastAsia="en-GB"/>
+              <w14:ligatures w14:val="standardContextual"/>
+            </w:rPr>
+          </w:pPr>
+          <w:hyperlink w:anchor="_Toc223914856" w:history="1">
+            <w:r>
+              <w:rPr>
+                <w:rStyle w:val="Hyperlink"/>
+                <w:noProof/>
+              </w:rPr>
+              <w:t>Hazard Representation</w:t>
+            </w:r>
+            <w:r>
+              <w:rPr>
+                <w:noProof/>
+                <w:webHidden/>
+              </w:rPr>
+              <w:tab/>
+            </w:r>
+            <w:r>
+              <w:rPr>
+                <w:noProof/>
+                <w:webHidden/>
+              </w:rPr>
+              <w:fldChar w:fldCharType="begin"/>
+            </w:r>
+            <w:r>
+              <w:rPr>
+                <w:noProof/>
+                <w:webHidden/>
+              </w:rPr>
+              <w:instrText xml:space="preserve"> PAGEREF _Toc223914856 \h </w:instrText>
+            </w:r>
+            <w:r>
+              <w:rPr>
+                <w:noProof/>
+                <w:webHidden/>
+              </w:rPr>
+            </w:r>
+            <w:r>
+              <w:rPr>
+                <w:noProof/>
+                <w:webHidden/>
+              </w:rPr>
+              <w:fldChar w:fldCharType="separate"/>
+            </w:r>
+            <w:r>
+              <w:rPr>
+                <w:noProof/>
+                <w:webHidden/>
+              </w:rPr>
+              <w:t>29</w:t>
+            </w:r>
+            <w:r>
+              <w:rPr>
+                <w:noProof/>
+                <w:webHidden/>
+              </w:rPr>
+              <w:fldChar w:fldCharType="end"/>
+            </w:r>
+          </w:hyperlink>
+        </w:p>
+        <w:p>
+          <w:pPr>
+            <w:pStyle w:val="TOC3"/>
+            <w:tabs>
+              <w:tab w:val="right" w:leader="dot" w:pos="9016"/>
+            </w:tabs>
+            <w:rPr>
+              <w:noProof/>
+              <w:kern w:val="2"/>
+              <w:lang w:eastAsia="en-GB"/>
+              <w14:ligatures w14:val="standardContextual"/>
+            </w:rPr>
+          </w:pPr>
+          <w:hyperlink w:anchor="_Toc223914857" w:history="1">
+            <w:r>
+              <w:rPr>
+                <w:rStyle w:val="Hyperlink"/>
+                <w:noProof/>
+              </w:rPr>
+              <w:t>Simulation State and Metrics</w:t>
+            </w:r>
+            <w:r>
+              <w:rPr>
+                <w:noProof/>
+                <w:webHidden/>
+              </w:rPr>
+              <w:tab/>
+            </w:r>
+            <w:r>
+              <w:rPr>
+                <w:noProof/>
+                <w:webHidden/>
+              </w:rPr>
+              <w:fldChar w:fldCharType="begin"/>
+            </w:r>
+            <w:r>
+              <w:rPr>
+                <w:noProof/>
+                <w:webHidden/>
+              </w:rPr>
+              <w:instrText xml:space="preserve"> PAGEREF _Toc223914857 \h </w:instrText>
+            </w:r>
+            <w:r>
+              <w:rPr>
+                <w:noProof/>
+                <w:webHidden/>
+              </w:rPr>
+            </w:r>
+            <w:r>
+              <w:rPr>
+                <w:noProof/>
+                <w:webHidden/>
+              </w:rPr>
+              <w:fldChar w:fldCharType="separate"/>
+            </w:r>
+            <w:r>
+              <w:rPr>
+                <w:noProof/>
+                <w:webHidden/>
+              </w:rPr>
+              <w:t>29</w:t>
+            </w:r>
+            <w:r>
+              <w:rPr>
+                <w:noProof/>
+                <w:webHidden/>
+              </w:rPr>
+              <w:fldChar w:fldCharType="end"/>
+            </w:r>
+          </w:hyperlink>
+        </w:p>
+        <w:p>
+          <w:pPr>
+            <w:pStyle w:val="TOC2"/>
+            <w:tabs>
+              <w:tab w:val="right" w:leader="dot" w:pos="9016"/>
+            </w:tabs>
+            <w:rPr>
+              <w:noProof/>
+              <w:kern w:val="2"/>
+              <w:lang w:eastAsia="en-GB"/>
+              <w14:ligatures w14:val="standardContextual"/>
+            </w:rPr>
+          </w:pPr>
+          <w:hyperlink w:anchor="_Toc223914858" w:history="1">
+            <w:r>
+              <w:rPr>
+                <w:rStyle w:val="Hyperlink"/>
+                <w:noProof/>
+              </w:rPr>
+              <w:t>Simulation Design</w:t>
+            </w:r>
+            <w:r>
+              <w:rPr>
+                <w:noProof/>
+                <w:webHidden/>
+              </w:rPr>
+              <w:tab/>
+            </w:r>
+            <w:r>
+              <w:rPr>
+                <w:noProof/>
+                <w:webHidden/>
+              </w:rPr>
+              <w:fldChar w:fldCharType="begin"/>
+            </w:r>
+            <w:r>
+              <w:rPr>
+                <w:noProof/>
+                <w:webHidden/>
+              </w:rPr>
+              <w:instrText xml:space="preserve"> PAGEREF _Toc223914858 \h </w:instrText>
+            </w:r>
+            <w:r>
+              <w:rPr>
+                <w:noProof/>
+                <w:webHidden/>
+              </w:rPr>
+            </w:r>
+            <w:r>
+              <w:rPr>
+                <w:noProof/>
+                <w:webHidden/>
+              </w:rPr>
+              <w:fldChar w:fldCharType="separate"/>
+            </w:r>
+            <w:r>
+              <w:rPr>
+                <w:noProof/>
+                <w:webHidden/>
+              </w:rPr>
+              <w:t>30</w:t>
             </w:r>
             <w:r>
               <w:rPr>
@@ -1363,13 +2144,13 @@
               <w14:ligatures w14:val="standardContextual"/>
             </w:rPr>
           </w:pPr>
-          <w:hyperlink w:anchor="_Toc223895426" w:history="1">
+          <w:hyperlink w:anchor="_Toc223914859" w:history="1">
             <w:r>
               <w:rPr>
                 <w:rStyle w:val="Hyperlink"/>
                 <w:noProof/>
               </w:rPr>
-              <w:t>Table of Figures</w:t>
+              <w:t>References</w:t>
             </w:r>
             <w:r>
               <w:rPr>
@@ -1390,7 +2171,7 @@
                 <w:noProof/>
                 <w:webHidden/>
               </w:rPr>
-              <w:instrText xml:space="preserve"> PAGEREF _Toc223895426 \h </w:instrText>
+              <w:instrText xml:space="preserve"> PAGEREF _Toc223914859 \h </w:instrText>
             </w:r>
             <w:r>
               <w:rPr>
@@ -1410,7 +2191,78 @@
                 <w:noProof/>
                 <w:webHidden/>
               </w:rPr>
-              <w:t>23</w:t>
+              <w:t>31</w:t>
+            </w:r>
+            <w:r>
+              <w:rPr>
+                <w:noProof/>
+                <w:webHidden/>
+              </w:rPr>
+              <w:fldChar w:fldCharType="end"/>
+            </w:r>
+          </w:hyperlink>
+        </w:p>
+        <w:p>
+          <w:pPr>
+            <w:pStyle w:val="TOC1"/>
+            <w:tabs>
+              <w:tab w:val="right" w:leader="dot" w:pos="9016"/>
+            </w:tabs>
+            <w:rPr>
+              <w:noProof/>
+              <w:kern w:val="2"/>
+              <w:lang w:eastAsia="en-GB"/>
+              <w14:ligatures w14:val="standardContextual"/>
+            </w:rPr>
+          </w:pPr>
+          <w:hyperlink w:anchor="_Toc223914860" w:history="1">
+            <w:r>
+              <w:rPr>
+                <w:rStyle w:val="Hyperlink"/>
+                <w:noProof/>
+              </w:rPr>
+              <w:t>Table of Figures</w:t>
+            </w:r>
+            <w:r>
+              <w:rPr>
+                <w:noProof/>
+                <w:webHidden/>
+              </w:rPr>
+              <w:tab/>
+            </w:r>
+            <w:r>
+              <w:rPr>
+                <w:noProof/>
+                <w:webHidden/>
+              </w:rPr>
+              <w:fldChar w:fldCharType="begin"/>
+            </w:r>
+            <w:r>
+              <w:rPr>
+                <w:noProof/>
+                <w:webHidden/>
+              </w:rPr>
+              <w:instrText xml:space="preserve"> PAGEREF _Toc223914860 \h </w:instrText>
+            </w:r>
+            <w:r>
+              <w:rPr>
+                <w:noProof/>
+                <w:webHidden/>
+              </w:rPr>
+            </w:r>
+            <w:r>
+              <w:rPr>
+                <w:noProof/>
+                <w:webHidden/>
+              </w:rPr>
+              <w:fldChar w:fldCharType="separate"/>
+            </w:r>
+            <w:r>
+              <w:rPr>
+                <w:noProof/>
+                <w:webHidden/>
+              </w:rPr>
+              <w:t>34</w:t>
             </w:r>
             <w:r>
               <w:rPr>
@@ -1434,7 +2286,7 @@
               <w14:ligatures w14:val="standardContextual"/>
             </w:rPr>
           </w:pPr>
-          <w:hyperlink w:anchor="_Toc223895427" w:history="1">
+          <w:hyperlink w:anchor="_Toc223914861" w:history="1">
             <w:r>
               <w:rPr>
                 <w:rStyle w:val="Hyperlink"/>
@@ -1461,7 +2313,7 @@
                 <w:noProof/>
                 <w:webHidden/>
               </w:rPr>
-              <w:instrText xml:space="preserve"> PAGEREF _Toc223895427 \h </w:instrText>
+              <w:instrText xml:space="preserve"> PAGEREF _Toc223914861 \h </w:instrText>
             </w:r>
             <w:r>
               <w:rPr>
@@ -1481,7 +2333,7 @@
                 <w:noProof/>
                 <w:webHidden/>
               </w:rPr>
-              <w:t>23</w:t>
+              <w:t>34</w:t>
             </w:r>
             <w:r>
               <w:rPr>
@@ -1505,7 +2357,7 @@
               <w14:ligatures w14:val="standardContextual"/>
             </w:rPr>
           </w:pPr>
-          <w:hyperlink w:anchor="_Toc223895428" w:history="1">
+          <w:hyperlink w:anchor="_Toc223914862" w:history="1">
             <w:r>
               <w:rPr>
                 <w:rStyle w:val="Hyperlink"/>
@@ -1532,7 +2384,7 @@
                 <w:noProof/>
                 <w:webHidden/>
               </w:rPr>
-              <w:instrText xml:space="preserve"> PAGEREF _Toc223895428 \h </w:instrText>
+              <w:instrText xml:space="preserve"> PAGEREF _Toc223914862 \h </w:instrText>
             </w:r>
             <w:r>
               <w:rPr>
@@ -1552,7 +2404,7 @@
                 <w:noProof/>
                 <w:webHidden/>
               </w:rPr>
-              <w:t>23</w:t>
+              <w:t>34</w:t>
             </w:r>
             <w:r>
               <w:rPr>
@@ -1602,119 +2454,20 @@
       <w:pPr>
         <w:pStyle w:val="Heading1"/>
       </w:pPr>
-      <w:bookmarkStart w:id="0" w:name="_Toc223895410"/>
-      <w:r>
-        <w:lastRenderedPageBreak/>
-        <w:t>Analysis</w:t>
-      </w:r>
-      <w:bookmarkEnd w:id="0"/>
     </w:p>
     <w:p>
       <w:pPr>
-        <w:pStyle w:val="Heading2"/>
-      </w:pPr>
-      <w:bookmarkStart w:id="1" w:name="_Toc223895411"/>
-      <w:r>
-        <w:t>Problem Description</w:t>
-      </w:r>
-      <w:bookmarkEnd w:id="1"/>
+        <w:pStyle w:val="Heading1"/>
+      </w:pPr>
     </w:p>
     <w:p>
-      <w:r>
-        <w:t>Evacuation planning</w:t>
-      </w:r>
-      <w:r>
-        <w:t xml:space="preserve"> is a highly important step in making workplaces and public spaces safe in the event of an emergency</w:t>
-      </w:r>
-      <w:r>
-        <w:t>;</w:t>
-      </w:r>
-      <w:r>
-        <w:t xml:space="preserve"> </w:t>
-      </w:r>
-      <w:r>
-        <w:t>i</w:t>
-      </w:r>
-      <w:r>
-        <w:t xml:space="preserve">t </w:t>
-      </w:r>
-      <w:r>
-        <w:t xml:space="preserve">means </w:t>
-      </w:r>
-      <w:r>
-        <w:t>that people can leave quickly and</w:t>
-      </w:r>
-      <w:r>
-        <w:t xml:space="preserve"> casualties are minimised</w:t>
-      </w:r>
-      <w:r>
-        <w:t>. Planning turns a high-stress, chaotic situation into a clear set of rehearsed steps to result in</w:t>
-      </w:r>
-      <w:r>
-        <w:t xml:space="preserve"> faster movement, fewer mistakes, clear roles, and better communication.</w:t>
-      </w:r>
+      <w:pPr>
+        <w:pStyle w:val="Heading1"/>
+      </w:pPr>
     </w:p>
     <w:p>
-      <w:r>
-        <w:t>A crucial aspect of this problem involves emergency routing. This requires plenty of logistic planning and potentially even a team of people (especially for larger buildings/areas) to come up with suitable exit routes</w:t>
-      </w:r>
-      <w:r>
-        <w:t>, taking time and resources.</w:t>
-      </w:r>
-    </w:p>
-    <w:p>
-      <w:r>
-        <w:t>To solve this problem, I will build a program that allows a user to create or enter grid floorplans, exits, and hazards to simulate emergency scenarios, find/test potential evacuation routes, and allow comparison of routing strategies.</w:t>
-      </w:r>
-    </w:p>
-    <w:p>
-      <w:r>
-        <w:t>Before designing the solution, I will research</w:t>
-      </w:r>
-    </w:p>
-    <w:p>
-      <w:pPr>
-        <w:pStyle w:val="ListParagraph"/>
-        <w:numPr>
-          <w:ilvl w:val="0"/>
-          <w:numId w:val="30"/>
-        </w:numPr>
-      </w:pPr>
-      <w:r>
-        <w:t>how evacuation is commonly simplified into grid/agent models,</w:t>
-      </w:r>
-    </w:p>
-    <w:p>
-      <w:pPr>
-        <w:pStyle w:val="ListParagraph"/>
-        <w:numPr>
-          <w:ilvl w:val="0"/>
-          <w:numId w:val="30"/>
-        </w:numPr>
-      </w:pPr>
-      <w:r>
-        <w:t>which routing algorithms are appropriate and what heuristics they require,</w:t>
-      </w:r>
-    </w:p>
-    <w:p>
-      <w:pPr>
-        <w:pStyle w:val="ListParagraph"/>
-        <w:numPr>
-          <w:ilvl w:val="0"/>
-          <w:numId w:val="30"/>
-        </w:numPr>
-      </w:pPr>
-      <w:r>
-        <w:t>which metrics are used to compare evacuation outcomes and algorithm performance, and</w:t>
-      </w:r>
-    </w:p>
-    <w:p>
-      <w:pPr>
-        <w:pStyle w:val="ListParagraph"/>
-        <w:numPr>
-          <w:ilvl w:val="0"/>
-          <w:numId w:val="30"/>
-        </w:numPr>
+      <w:pPr>
+        <w:pStyle w:val="Heading1"/>
         <w:sectPr>
           <w:footerReference w:type="default" r:id="rId12"/>
           <w:pgSz w:w="11906" w:h="16838"/>
@@ -1724,15 +2477,135 @@
           <w:docGrid w:linePitch="360"/>
         </w:sectPr>
       </w:pPr>
-      <w:r>
-        <w:t>how a lightweight ML method can recommend a strategy based on scenario features</w:t>
-      </w:r>
+      <w:bookmarkStart w:id="0" w:name="_Toc223914832"/>
+      <w:r>
+        <w:t>Analysis</w:t>
+      </w:r>
+      <w:bookmarkEnd w:id="0"/>
     </w:p>
     <w:p>
       <w:pPr>
         <w:pStyle w:val="Heading2"/>
       </w:pPr>
-      <w:bookmarkStart w:id="2" w:name="_Toc223895412"/>
+      <w:bookmarkStart w:id="1" w:name="_Toc223914833"/>
+      <w:r>
+        <w:lastRenderedPageBreak/>
+        <w:t>Problem Description</w:t>
+      </w:r>
+      <w:bookmarkEnd w:id="1"/>
+    </w:p>
+    <w:p>
+      <w:r>
+        <w:t>Evacuation planning</w:t>
+      </w:r>
+      <w:r>
+        <w:t xml:space="preserve"> is a highly important step in making workplaces and public spaces safe in the event of an emergency</w:t>
+      </w:r>
+      <w:r>
+        <w:t>;</w:t>
+      </w:r>
+      <w:r>
+        <w:t xml:space="preserve"> </w:t>
+      </w:r>
+      <w:r>
+        <w:t>i</w:t>
+      </w:r>
+      <w:r>
+        <w:t xml:space="preserve">t </w:t>
+      </w:r>
+      <w:r>
+        <w:t xml:space="preserve">means </w:t>
+      </w:r>
+      <w:r>
+        <w:t>that people can leave quickly and</w:t>
+      </w:r>
+      <w:r>
+        <w:t xml:space="preserve"> casualties are minimised</w:t>
+      </w:r>
+      <w:r>
+        <w:t>. Planning turns a high-stress, chaotic situation into a clear set of rehearsed steps to result in</w:t>
+      </w:r>
+      <w:r>
+        <w:t xml:space="preserve"> faster movement, fewer mistakes, clear roles, and better communication.</w:t>
+      </w:r>
+    </w:p>
+    <w:p>
+      <w:r>
+        <w:t>A crucial aspect of this problem involves emergency routing. This requires plenty of logistic planning and potentially even a team of people (especially for larger buildings/areas) to come up with suitable exit routes</w:t>
+      </w:r>
+      <w:r>
+        <w:t>, taking time and resources.</w:t>
+      </w:r>
+    </w:p>
+    <w:p>
+      <w:r>
+        <w:t>To solve this problem, I will build a program that allows a user to create or enter grid floorplans, exits, and hazards to simulate emergency scenarios, find/test potential evacuation routes, and allow comparison of routing strategies.</w:t>
+      </w:r>
+    </w:p>
+    <w:p>
+      <w:r>
+        <w:t>Before designing the solution, I will research</w:t>
+      </w:r>
+    </w:p>
+    <w:p>
+      <w:pPr>
+        <w:pStyle w:val="ListParagraph"/>
+        <w:numPr>
+          <w:ilvl w:val="0"/>
+          <w:numId w:val="30"/>
+        </w:numPr>
+      </w:pPr>
+      <w:r>
+        <w:t>how evacuation is commonly simplified into grid/agent models,</w:t>
+      </w:r>
+    </w:p>
+    <w:p>
+      <w:pPr>
+        <w:pStyle w:val="ListParagraph"/>
+        <w:numPr>
+          <w:ilvl w:val="0"/>
+          <w:numId w:val="30"/>
+        </w:numPr>
+      </w:pPr>
+      <w:r>
+        <w:t>which routing algorithms are appropriate and what heuristics they require,</w:t>
+      </w:r>
+    </w:p>
+    <w:p>
+      <w:pPr>
+        <w:pStyle w:val="ListParagraph"/>
+        <w:numPr>
+          <w:ilvl w:val="0"/>
+          <w:numId w:val="30"/>
+        </w:numPr>
+      </w:pPr>
+      <w:r>
+        <w:t>which metrics are used to compare evacuation outcomes and algorithm performance, and</w:t>
+      </w:r>
+    </w:p>
+    <w:p>
+      <w:pPr>
+        <w:pStyle w:val="ListParagraph"/>
+        <w:numPr>
+          <w:ilvl w:val="0"/>
+          <w:numId w:val="30"/>
+        </w:numPr>
+        <w:sectPr>
+          <w:pgSz w:w="11906" w:h="16838"/>
+          <w:pgMar w:top="1440" w:right="1440" w:bottom="1440" w:left="1440" w:header="708" w:footer="708" w:gutter="0"/>
+          <w:cols w:space="708"/>
+          <w:docGrid w:linePitch="360"/>
+        </w:sectPr>
+      </w:pPr>
+      <w:r>
+        <w:t>how a lightweight ML method can recommend a strategy based on scenario features</w:t>
+      </w:r>
+    </w:p>
+    <w:p>
+      <w:pPr>
+        <w:pStyle w:val="Heading2"/>
+      </w:pPr>
+      <w:bookmarkStart w:id="2" w:name="_Toc223914834"/>
       <w:r>
         <w:lastRenderedPageBreak/>
         <w:t>Research</w:t>
@@ -1743,7 +2616,7 @@
       <w:pPr>
         <w:pStyle w:val="Heading3"/>
       </w:pPr>
-      <w:bookmarkStart w:id="3" w:name="_Toc223895413"/>
+      <w:bookmarkStart w:id="3" w:name="_Toc223914835"/>
       <w:r>
         <w:t>Evacuation Modelling Approach</w:t>
       </w:r>
@@ -1853,7 +2726,7 @@
       <w:pPr>
         <w:pStyle w:val="Heading3"/>
       </w:pPr>
-      <w:bookmarkStart w:id="4" w:name="_Toc223895414"/>
+      <w:bookmarkStart w:id="4" w:name="_Toc223914836"/>
       <w:r>
         <w:t>Multi-Agent Movement and Congestion/Conflict Resolution</w:t>
       </w:r>
@@ -2060,7 +2933,7 @@
       <w:pPr>
         <w:pStyle w:val="Heading3"/>
       </w:pPr>
-      <w:bookmarkStart w:id="5" w:name="_Toc223895415"/>
+      <w:bookmarkStart w:id="5" w:name="_Toc223914837"/>
       <w:r>
         <w:lastRenderedPageBreak/>
         <w:t>Hazard Representation</w:t>
@@ -2119,7 +2992,7 @@
       <w:pPr>
         <w:pStyle w:val="Heading3"/>
       </w:pPr>
-      <w:bookmarkStart w:id="6" w:name="_Toc223895416"/>
+      <w:bookmarkStart w:id="6" w:name="_Toc223914838"/>
       <w:r>
         <w:t>Pathfinding Algorithm</w:t>
       </w:r>
@@ -3593,6 +4466,12 @@
             <w:r>
               <w:t>BFS (Breadth First Search)</w:t>
             </w:r>
+            <w:r>
+              <w:rPr>
+                <w:rStyle w:val="FootnoteReference"/>
+              </w:rPr>
+              <w:footnoteReference w:id="1"/>
+            </w:r>
           </w:p>
         </w:tc>
         <w:tc>
@@ -3964,6 +4843,12 @@
             <w:r>
               <w:t>Yes, if heuristic admissible</w:t>
             </w:r>
+            <w:r>
+              <w:rPr>
+                <w:rStyle w:val="FootnoteReference"/>
+              </w:rPr>
+              <w:footnoteReference w:id="2"/>
+            </w:r>
           </w:p>
         </w:tc>
         <w:tc>
@@ -4246,6 +5131,7 @@
               <w:jc w:val="center"/>
             </w:pPr>
             <w:r>
+              <w:lastRenderedPageBreak/>
               <w:t>Bidirectional search (concept)</w:t>
             </w:r>
           </w:p>
@@ -4350,7 +5236,6 @@
               <w:jc w:val="center"/>
             </w:pPr>
             <w:r>
-              <w:lastRenderedPageBreak/>
               <w:t>Jump Point Search (JPS)</w:t>
             </w:r>
           </w:p>
@@ -4765,7 +5650,7 @@
         </w:rPr>
       </w:pPr>
       <w:bookmarkStart w:id="7" w:name="_Toc223796647"/>
-      <w:bookmarkStart w:id="8" w:name="_Toc223898115"/>
+      <w:bookmarkStart w:id="8" w:name="_Toc223906943"/>
       <w:r>
         <w:t xml:space="preserve">Table </w:t>
       </w:r>
@@ -5482,7 +6367,7 @@
       <w:pPr>
         <w:pStyle w:val="Heading3"/>
       </w:pPr>
-      <w:bookmarkStart w:id="9" w:name="_Toc223895417"/>
+      <w:bookmarkStart w:id="9" w:name="_Toc223914839"/>
       <w:r>
         <w:lastRenderedPageBreak/>
         <w:t>Evaluation Metrics for Evacuation Outcomes and Algorithm Performance</w:t>
@@ -6513,7 +7398,7 @@
           <w:szCs w:val="20"/>
         </w:rPr>
       </w:pPr>
-      <w:bookmarkStart w:id="10" w:name="_Toc223898116"/>
+      <w:bookmarkStart w:id="10" w:name="_Toc223906944"/>
       <w:r>
         <w:t xml:space="preserve">Table </w:t>
       </w:r>
@@ -6766,7 +7651,7 @@
       <w:pPr>
         <w:pStyle w:val="Heading3"/>
       </w:pPr>
-      <w:bookmarkStart w:id="11" w:name="_Toc223895418"/>
+      <w:bookmarkStart w:id="11" w:name="_Toc223914840"/>
       <w:r>
         <w:lastRenderedPageBreak/>
         <w:t>Machine-Learning (ML) Algorithms</w:t>
@@ -6775,7 +7660,13 @@
     </w:p>
     <w:p>
       <w:r>
-        <w:t>While not necessary for the base function of the project (i.e. an evacuation simulator), ML is not required.</w:t>
+        <w:t>While not necessary for the base function of the project (i.e. an evacuation simulator),</w:t>
+      </w:r>
+      <w:r>
+        <w:t xml:space="preserve"> machine learning (ML) is a highly interesting topic that I would like to explore for my project</w:t>
+      </w:r>
+      <w:r>
+        <w:t>.</w:t>
       </w:r>
       <w:r>
         <w:t xml:space="preserve"> ML is used to learn a mapping from data so that a system can make decisions or predictions without explicit rules needing to be written for every scenario. In the case of this project, ML would be used to compare different routing algorithms and suggest the best routing strategy in any particular situation.</w:t>
@@ -7578,6 +8469,9 @@
             <w:r>
               <w:t>Classification</w:t>
             </w:r>
+            <w:r>
+              <w:t xml:space="preserve"> / Regression</w:t>
+            </w:r>
           </w:p>
         </w:tc>
         <w:tc>
@@ -8009,7 +8903,7 @@
         <w:pStyle w:val="Caption"/>
         <w:framePr w:w="13827" w:hSpace="180" w:wrap="around" w:vAnchor="text" w:hAnchor="margin" w:y="8024"/>
       </w:pPr>
-      <w:bookmarkStart w:id="12" w:name="_Toc223898117"/>
+      <w:bookmarkStart w:id="12" w:name="_Toc223906945"/>
       <w:r>
         <w:t xml:space="preserve">Table </w:t>
       </w:r>
@@ -8356,7 +9250,7 @@
       <w:pPr>
         <w:pStyle w:val="Heading2"/>
       </w:pPr>
-      <w:bookmarkStart w:id="13" w:name="_Toc223895419"/>
+      <w:bookmarkStart w:id="13" w:name="_Toc223914841"/>
       <w:r>
         <w:lastRenderedPageBreak/>
         <w:t>Current Systems</w:t>
@@ -8367,7 +9261,7 @@
       <w:pPr>
         <w:pStyle w:val="Heading3"/>
       </w:pPr>
-      <w:bookmarkStart w:id="14" w:name="_Toc223895420"/>
+      <w:bookmarkStart w:id="14" w:name="_Toc223914842"/>
       <w:r>
         <w:t>Pathfinder</w:t>
       </w:r>
@@ -8438,7 +9332,7 @@
       <w:pPr>
         <w:pStyle w:val="Heading3"/>
       </w:pPr>
-      <w:bookmarkStart w:id="15" w:name="_Toc223895421"/>
+      <w:bookmarkStart w:id="15" w:name="_Toc223914843"/>
       <w:r>
         <w:t>FDS / Smokeview and FDS+Evac (NIST)</w:t>
       </w:r>
@@ -8489,7 +9383,7 @@
       <w:pPr>
         <w:pStyle w:val="Heading3"/>
       </w:pPr>
-      <w:bookmarkStart w:id="16" w:name="_Toc223895422"/>
+      <w:bookmarkStart w:id="16" w:name="_Toc223914844"/>
       <w:r>
         <w:t>Pathfinding Visualizer (</w:t>
       </w:r>
@@ -8555,7 +9449,7 @@
       <w:pPr>
         <w:pStyle w:val="Heading2"/>
       </w:pPr>
-      <w:bookmarkStart w:id="17" w:name="_Toc223895423"/>
+      <w:bookmarkStart w:id="17" w:name="_Toc223914845"/>
       <w:r>
         <w:lastRenderedPageBreak/>
         <w:t>User Identification</w:t>
@@ -8567,6 +9461,9 @@
         <w:t>For this project, the primary intended users are A-level Computer Science students and teachers; the system will be designed as a classroom-based educational tool allowing students and teachers alike to put Computer Science into real-world contexts, such as evacuation planning. It will allow them to see how discrete mathematics (graphs and traversals)</w:t>
       </w:r>
       <w:r>
+        <w:t xml:space="preserve"> and Computer Science are tightly linked</w:t>
+      </w:r>
+      <w:r>
         <w:t>. Although, there may be some interest from secondary user groups like aspiring civil engineering students who could use the simulator to explore how building layout, hazards, and congestion affect evacuation outcomes.</w:t>
       </w:r>
     </w:p>
@@ -8574,7 +9471,7 @@
       <w:pPr>
         <w:pStyle w:val="Heading3"/>
       </w:pPr>
-      <w:bookmarkStart w:id="18" w:name="_Toc223895424"/>
+      <w:bookmarkStart w:id="18" w:name="_Toc223914846"/>
       <w:r>
         <w:t>Gathering User Requirements</w:t>
       </w:r>
@@ -8726,7 +9623,7 @@
                                 <w:noProof/>
                               </w:rPr>
                             </w:pPr>
-                            <w:bookmarkStart w:id="19" w:name="_Toc223897626"/>
+                            <w:bookmarkStart w:id="19" w:name="_Toc223906934"/>
                             <w:r>
                               <w:t xml:space="preserve">Figure </w:t>
                             </w:r>
@@ -8797,7 +9694,7 @@
                           <w:noProof/>
                         </w:rPr>
                       </w:pPr>
-                      <w:bookmarkStart w:id="20" w:name="_Toc223897626"/>
+                      <w:bookmarkStart w:id="20" w:name="_Toc223906934"/>
                       <w:r>
                         <w:t xml:space="preserve">Figure </w:t>
                       </w:r>
@@ -8940,7 +9837,7 @@
                                 <w:noProof/>
                               </w:rPr>
                             </w:pPr>
-                            <w:bookmarkStart w:id="21" w:name="_Toc223897627"/>
+                            <w:bookmarkStart w:id="21" w:name="_Toc223906935"/>
                             <w:r>
                               <w:t xml:space="preserve">Figure </w:t>
                             </w:r>
@@ -9007,7 +9904,7 @@
                           <w:noProof/>
                         </w:rPr>
                       </w:pPr>
-                      <w:bookmarkStart w:id="22" w:name="_Toc223897627"/>
+                      <w:bookmarkStart w:id="22" w:name="_Toc223906935"/>
                       <w:r>
                         <w:t xml:space="preserve">Figure </w:t>
                       </w:r>
@@ -9345,7 +10242,7 @@
                               </w:rPr>
                             </w:pPr>
                             <w:bookmarkStart w:id="23" w:name="_Ref223798313"/>
-                            <w:bookmarkStart w:id="24" w:name="_Toc223897628"/>
+                            <w:bookmarkStart w:id="24" w:name="_Toc223906936"/>
                             <w:r>
                               <w:t xml:space="preserve">Figure </w:t>
                             </w:r>
@@ -9408,7 +10305,7 @@
                         </w:rPr>
                       </w:pPr>
                       <w:bookmarkStart w:id="25" w:name="_Ref223798313"/>
-                      <w:bookmarkStart w:id="26" w:name="_Toc223897628"/>
+                      <w:bookmarkStart w:id="26" w:name="_Toc223906936"/>
                       <w:r>
                         <w:t xml:space="preserve">Figure </w:t>
                       </w:r>
@@ -9661,7 +10558,7 @@
         </w:sectPr>
       </w:pPr>
       <w:bookmarkStart w:id="27" w:name="_Ref223893678"/>
-      <w:bookmarkStart w:id="28" w:name="_Toc223897629"/>
+      <w:bookmarkStart w:id="28" w:name="_Toc223906937"/>
       <w:r>
         <w:t xml:space="preserve">Figure </w:t>
       </w:r>
@@ -9770,7 +10667,7 @@
                                 <w:noProof/>
                               </w:rPr>
                             </w:pPr>
-                            <w:bookmarkStart w:id="29" w:name="_Toc223897630"/>
+                            <w:bookmarkStart w:id="29" w:name="_Toc223906938"/>
                             <w:r>
                               <w:t xml:space="preserve">Figure </w:t>
                             </w:r>
@@ -9840,7 +10737,7 @@
                           <w:noProof/>
                         </w:rPr>
                       </w:pPr>
-                      <w:bookmarkStart w:id="30" w:name="_Toc223897630"/>
+                      <w:bookmarkStart w:id="30" w:name="_Toc223906938"/>
                       <w:r>
                         <w:t xml:space="preserve">Figure </w:t>
                       </w:r>
@@ -10007,7 +10904,7 @@
                                 <w:noProof/>
                               </w:rPr>
                             </w:pPr>
-                            <w:bookmarkStart w:id="31" w:name="_Toc223897631"/>
+                            <w:bookmarkStart w:id="31" w:name="_Toc223906939"/>
                             <w:r>
                               <w:t xml:space="preserve">Figure </w:t>
                             </w:r>
@@ -10077,7 +10974,7 @@
                           <w:noProof/>
                         </w:rPr>
                       </w:pPr>
-                      <w:bookmarkStart w:id="32" w:name="_Toc223897631"/>
+                      <w:bookmarkStart w:id="32" w:name="_Toc223906939"/>
                       <w:r>
                         <w:t xml:space="preserve">Figure </w:t>
                       </w:r>
@@ -10325,7 +11222,7 @@
           <w:bCs w:val="0"/>
         </w:rPr>
       </w:pPr>
-      <w:bookmarkStart w:id="33" w:name="_Toc223897632"/>
+      <w:bookmarkStart w:id="33" w:name="_Toc223906940"/>
       <w:r>
         <w:t xml:space="preserve">Figure </w:t>
       </w:r>
@@ -10449,7 +11346,7 @@
       <w:pPr>
         <w:pStyle w:val="Caption"/>
       </w:pPr>
-      <w:bookmarkStart w:id="34" w:name="_Toc223897633"/>
+      <w:bookmarkStart w:id="34" w:name="_Toc223906941"/>
       <w:r>
         <w:t xml:space="preserve">Figure </w:t>
       </w:r>
@@ -10552,7 +11449,7 @@
                                 <w:noProof/>
                               </w:rPr>
                             </w:pPr>
-                            <w:bookmarkStart w:id="35" w:name="_Toc223897634"/>
+                            <w:bookmarkStart w:id="35" w:name="_Toc223906942"/>
                             <w:r>
                               <w:t xml:space="preserve">Figure </w:t>
                             </w:r>
@@ -10622,7 +11519,7 @@
                           <w:noProof/>
                         </w:rPr>
                       </w:pPr>
-                      <w:bookmarkStart w:id="36" w:name="_Toc223897634"/>
+                      <w:bookmarkStart w:id="36" w:name="_Toc223906942"/>
                       <w:r>
                         <w:t xml:space="preserve">Figure </w:t>
                       </w:r>
@@ -11178,8 +12075,8 @@
           <w:bCs w:val="0"/>
         </w:rPr>
       </w:pPr>
-      <w:bookmarkStart w:id="37" w:name="_Toc223898118"/>
-      <w:bookmarkStart w:id="38" w:name="_Ref223898196"/>
+      <w:bookmarkStart w:id="37" w:name="_Ref223898196"/>
+      <w:bookmarkStart w:id="38" w:name="_Toc223906946"/>
       <w:r>
         <w:t xml:space="preserve">Table </w:t>
       </w:r>
@@ -11201,7 +12098,7 @@
       <w:r>
         <w:fldChar w:fldCharType="end"/>
       </w:r>
-      <w:bookmarkEnd w:id="38"/>
+      <w:bookmarkEnd w:id="37"/>
       <w:r>
         <w:t xml:space="preserve"> </w:t>
       </w:r>
@@ -11222,7 +12119,7 @@
         </w:rPr>
         <w:t>Analysis of free response themes from questionnaire</w:t>
       </w:r>
-      <w:bookmarkEnd w:id="37"/>
+      <w:bookmarkEnd w:id="38"/>
     </w:p>
     <w:p>
       <w:pPr>
@@ -11234,14 +12131,1242 @@
           <w:docGrid w:linePitch="360"/>
         </w:sectPr>
       </w:pPr>
+      <w:r>
+        <w:t>Overall, the questionnaire was successful in helping me connect with my target audience and understanding their needs.</w:t>
+      </w:r>
+      <w:r>
+        <w:t xml:space="preserve"> </w:t>
+      </w:r>
+      <w:r>
+        <w:t>The next stage is to translate my findings and questionnaire evidence into a clear set of measurable project objectives and ultimately a solid design for the final program.</w:t>
+      </w:r>
     </w:p>
-    <w:bookmarkStart w:id="39" w:name="_Toc223895425" w:displacedByCustomXml="next"/>
+    <w:p>
+      <w:pPr>
+        <w:pStyle w:val="Heading2"/>
+      </w:pPr>
+      <w:bookmarkStart w:id="39" w:name="_Toc223914847"/>
+      <w:r>
+        <w:lastRenderedPageBreak/>
+        <w:t>Justification of Design Choices and Limitations</w:t>
+      </w:r>
+      <w:bookmarkEnd w:id="39"/>
+    </w:p>
+    <w:p>
+      <w:pPr>
+        <w:pStyle w:val="Heading3"/>
+      </w:pPr>
+      <w:bookmarkStart w:id="40" w:name="_Toc223914848"/>
+      <w:r>
+        <w:t>Machine Learning</w:t>
+      </w:r>
+      <w:bookmarkEnd w:id="40"/>
+    </w:p>
+    <w:p>
+      <w:r>
+        <w:t>While machine learning is certainly an interesting topic that could be discussed and deliberated over at length, due to practical limitations (mainly a constraint of time and design complexity) it will simply not be possible to implement a highly complex model. To serve as the strategy recommendation advisor, I have chosen to use the K-Nearest Neighbours algorithm to predict the best strategy for dealing with any given scenario.</w:t>
+      </w:r>
+      <w:r>
+        <w:t xml:space="preserve"> It will be able to take various simulation parameters and predict the performance of each routing algorithm, determining its effectiveness based on both overall risk and evacuation speed.</w:t>
+      </w:r>
+      <w:r>
+        <w:t xml:space="preserve"> Note that this is still quite a limited </w:t>
+      </w:r>
+      <w:r>
+        <w:t>feature and</w:t>
+      </w:r>
+      <w:r>
+        <w:t xml:space="preserve"> will therefore stand as a secondary objective.</w:t>
+      </w:r>
+    </w:p>
+    <w:p>
+      <w:pPr>
+        <w:pStyle w:val="Heading3"/>
+      </w:pPr>
+      <w:bookmarkStart w:id="41" w:name="_Toc223914849"/>
+      <w:r>
+        <w:t>Pathfinding / Traversal Algorithms</w:t>
+      </w:r>
+      <w:bookmarkEnd w:id="41"/>
+    </w:p>
+    <w:p>
+      <w:r>
+        <w:t xml:space="preserve">Naturally, it is also practically impossible for me to implement a wide range of traversal algorithms in the program </w:t>
+      </w:r>
+      <w:r>
+        <w:t>given the scope of the project.</w:t>
+      </w:r>
+      <w:r>
+        <w:t xml:space="preserve"> However, </w:t>
+      </w:r>
+      <w:r>
+        <w:t>to keep the project manageable while still allowing meaningful comparisons, I</w:t>
+      </w:r>
+      <w:r>
+        <w:t xml:space="preserve"> can certainly include well-known algorithms (especially those covered by teachers and students). Therefore, I have </w:t>
+      </w:r>
+      <w:r>
+        <w:t>chosen to focus on four algorithms in particular:</w:t>
+      </w:r>
+    </w:p>
+    <w:p>
+      <w:pPr>
+        <w:pStyle w:val="ListParagraph"/>
+        <w:numPr>
+          <w:ilvl w:val="0"/>
+          <w:numId w:val="28"/>
+        </w:numPr>
+      </w:pPr>
+      <w:r>
+        <w:t xml:space="preserve">Breadth-First Search (BFS) is a common traversal algorithm that many students will encounter in their learning. It explores a graph level by level, visiting all cells (or vertices) at distance A from the start, then distance B, and so on, guaranteeing the shortest path. </w:t>
+      </w:r>
+      <w:r>
+        <w:t xml:space="preserve">It </w:t>
+      </w:r>
+      <w:r>
+        <w:t xml:space="preserve">is a useful baseline for simple evenly weighted evacuation scenarios (so routing paths are unaffected by movement weights and risk). When weights are introduced, BFS no longer guarantees a shortest path, clearly displaying its limitations to students. </w:t>
+      </w:r>
+    </w:p>
+    <w:p>
+      <w:pPr>
+        <w:pStyle w:val="ListParagraph"/>
+        <w:numPr>
+          <w:ilvl w:val="0"/>
+          <w:numId w:val="28"/>
+        </w:numPr>
+      </w:pPr>
+      <w:r>
+        <w:t>Unlike BFS, Dijkstra’s algorithm can guarantee the shortest path on a graph with non-negative, weighted edges. It repeatedly expands an unexplored vertex with the lowest known path cost from the start. Therefore, this makes it a suitable choice for the project as it can handle weighted grids where cells near hazards have higher risk costs or congested areas have greater movement penalties. Many students will have also already seen this algorithm discussed in lessons, and so it provides a familiar baseline for students.</w:t>
+      </w:r>
+    </w:p>
+    <w:p>
+      <w:pPr>
+        <w:pStyle w:val="ListParagraph"/>
+        <w:numPr>
+          <w:ilvl w:val="0"/>
+          <w:numId w:val="28"/>
+        </w:numPr>
+      </w:pPr>
+      <w:r>
+        <w:t xml:space="preserve">A* extends Dijkstra’s idea by additionally using a heuristic estimate of the remaining distance to the goal, usually written as </w:t>
+      </w:r>
+      <m:oMath>
+        <m:r>
+          <w:rPr>
+            <w:rFonts w:ascii="Cambria Math" w:hAnsi="Cambria Math"/>
+          </w:rPr>
+          <m:t>f</m:t>
+        </m:r>
+        <m:d>
+          <m:dPr>
+            <m:ctrlPr>
+              <w:rPr>
+                <w:rFonts w:ascii="Cambria Math" w:hAnsi="Cambria Math"/>
+                <w:i/>
+              </w:rPr>
+            </m:ctrlPr>
+          </m:dPr>
+          <m:e>
+            <m:r>
+              <w:rPr>
+                <w:rFonts w:ascii="Cambria Math" w:hAnsi="Cambria Math"/>
+              </w:rPr>
+              <m:t>n</m:t>
+            </m:r>
+          </m:e>
+        </m:d>
+        <m:r>
+          <w:rPr>
+            <w:rFonts w:ascii="Cambria Math" w:hAnsi="Cambria Math"/>
+          </w:rPr>
+          <m:t>=g</m:t>
+        </m:r>
+        <m:d>
+          <m:dPr>
+            <m:ctrlPr>
+              <w:rPr>
+                <w:rFonts w:ascii="Cambria Math" w:hAnsi="Cambria Math"/>
+                <w:i/>
+              </w:rPr>
+            </m:ctrlPr>
+          </m:dPr>
+          <m:e>
+            <m:r>
+              <w:rPr>
+                <w:rFonts w:ascii="Cambria Math" w:hAnsi="Cambria Math"/>
+              </w:rPr>
+              <m:t>n</m:t>
+            </m:r>
+          </m:e>
+        </m:d>
+        <m:r>
+          <w:rPr>
+            <w:rFonts w:ascii="Cambria Math" w:hAnsi="Cambria Math"/>
+          </w:rPr>
+          <m:t>+h(n)</m:t>
+        </m:r>
+      </m:oMath>
+      <w:r>
+        <w:t>, to guide the exploration of the graph. When the heuristic is admissible</w:t>
+      </w:r>
+      <w:r>
+        <w:t>, A* is optimal, and so it still finds the lowest-cost path while still exploring fewer nodes than Dijkstra’s algorithm. This makes it a great algorithm to show students the importan</w:t>
+      </w:r>
+      <w:r>
+        <w:t>ce</w:t>
+      </w:r>
+      <w:r>
+        <w:t xml:space="preserve"> of heuristics in search, and an even better direct comparison to Dijkstra’s algorithm. In the context of the project, A* can use a distance heuristic </w:t>
+      </w:r>
+      <w:r>
+        <w:lastRenderedPageBreak/>
+        <w:t>to guide agents toward exits more efficiently while still navigating around hazards and congestion.</w:t>
+      </w:r>
+    </w:p>
+    <w:p>
+      <w:pPr>
+        <w:pStyle w:val="ListParagraph"/>
+        <w:numPr>
+          <w:ilvl w:val="0"/>
+          <w:numId w:val="28"/>
+        </w:numPr>
+        <w:sectPr>
+          <w:pgSz w:w="11906" w:h="16838"/>
+          <w:pgMar w:top="1440" w:right="1440" w:bottom="1440" w:left="1440" w:header="708" w:footer="708" w:gutter="0"/>
+          <w:cols w:space="708"/>
+          <w:docGrid w:linePitch="360"/>
+        </w:sectPr>
+      </w:pPr>
+      <w:r>
+        <w:t>Greedy Best</w:t>
+      </w:r>
+      <w:r>
+        <w:t>-</w:t>
+      </w:r>
+      <w:r>
+        <w:t xml:space="preserve">First Search uses only the heuristic estimate to decide which node it should explore next, essentially prioritising </w:t>
+      </w:r>
+      <w:r>
+        <w:t>which nodes appear to be closer to the goal.</w:t>
+      </w:r>
+      <w:r>
+        <w:t xml:space="preserve"> This usually makes it faster in practice than Dijkstra or A*, however it does not guarantee the shortest or safest path; it is a good choice for this project as it demonstrates a clear trade-off between speed and the quality of the route</w:t>
+      </w:r>
+      <w:r>
+        <w:t>. In terms of the project, Greedy Best-First Search may quickly produce a route toward an exit, but it might often make poor decisions if the closest route passes through hazardous or congested areas; including this algorithm can show students that fast decision-making does not equate to good decision-making</w:t>
+      </w:r>
+      <w:r>
+        <w:t>.</w:t>
+      </w:r>
+    </w:p>
+    <w:p>
+      <w:pPr>
+        <w:pStyle w:val="Heading2"/>
+      </w:pPr>
+      <w:bookmarkStart w:id="42" w:name="_Toc223914850"/>
+      <w:r>
+        <w:lastRenderedPageBreak/>
+        <w:t>Project Objectives</w:t>
+      </w:r>
+      <w:bookmarkEnd w:id="42"/>
+    </w:p>
+    <w:p>
+      <w:pPr>
+        <w:pStyle w:val="ListParagraph"/>
+        <w:numPr>
+          <w:ilvl w:val="0"/>
+          <w:numId w:val="38"/>
+        </w:numPr>
+      </w:pPr>
+      <w:r>
+        <w:t>Scenario Representation</w:t>
+      </w:r>
+    </w:p>
+    <w:p>
+      <w:pPr>
+        <w:pStyle w:val="ListParagraph"/>
+        <w:numPr>
+          <w:ilvl w:val="1"/>
+          <w:numId w:val="38"/>
+        </w:numPr>
+      </w:pPr>
+      <w:r>
+        <w:t>Create a grid-based representation of evacuation environment</w:t>
+      </w:r>
+    </w:p>
+    <w:p>
+      <w:pPr>
+        <w:pStyle w:val="ListParagraph"/>
+        <w:numPr>
+          <w:ilvl w:val="2"/>
+          <w:numId w:val="38"/>
+        </w:numPr>
+      </w:pPr>
+      <w:r>
+        <w:t>Store the scenario using a two-dimensional grid data structure</w:t>
+      </w:r>
+    </w:p>
+    <w:p>
+      <w:pPr>
+        <w:pStyle w:val="ListParagraph"/>
+        <w:numPr>
+          <w:ilvl w:val="2"/>
+          <w:numId w:val="38"/>
+        </w:numPr>
+      </w:pPr>
+      <w:r>
+        <w:t>Create cell types</w:t>
+      </w:r>
+    </w:p>
+    <w:p>
+      <w:pPr>
+        <w:pStyle w:val="ListParagraph"/>
+        <w:numPr>
+          <w:ilvl w:val="3"/>
+          <w:numId w:val="38"/>
+        </w:numPr>
+      </w:pPr>
+      <w:r>
+        <w:t>Empty space</w:t>
+      </w:r>
+    </w:p>
+    <w:p>
+      <w:pPr>
+        <w:pStyle w:val="ListParagraph"/>
+        <w:numPr>
+          <w:ilvl w:val="3"/>
+          <w:numId w:val="38"/>
+        </w:numPr>
+      </w:pPr>
+      <w:r>
+        <w:t>Wall</w:t>
+      </w:r>
+    </w:p>
+    <w:p>
+      <w:pPr>
+        <w:pStyle w:val="ListParagraph"/>
+        <w:numPr>
+          <w:ilvl w:val="3"/>
+          <w:numId w:val="38"/>
+        </w:numPr>
+      </w:pPr>
+      <w:r>
+        <w:t>Exit</w:t>
+      </w:r>
+    </w:p>
+    <w:p>
+      <w:pPr>
+        <w:pStyle w:val="ListParagraph"/>
+        <w:numPr>
+          <w:ilvl w:val="3"/>
+          <w:numId w:val="38"/>
+        </w:numPr>
+      </w:pPr>
+      <w:r>
+        <w:t>Hazard</w:t>
+      </w:r>
+    </w:p>
+    <w:p>
+      <w:pPr>
+        <w:pStyle w:val="ListParagraph"/>
+        <w:numPr>
+          <w:ilvl w:val="3"/>
+          <w:numId w:val="38"/>
+        </w:numPr>
+      </w:pPr>
+      <w:r>
+        <w:t>Agent starting position</w:t>
+      </w:r>
+    </w:p>
+    <w:p>
+      <w:pPr>
+        <w:pStyle w:val="ListParagraph"/>
+        <w:numPr>
+          <w:ilvl w:val="2"/>
+          <w:numId w:val="38"/>
+        </w:numPr>
+      </w:pPr>
+      <w:r>
+        <w:t>Allow the grid to be resized for simulation and display</w:t>
+      </w:r>
+    </w:p>
+    <w:p>
+      <w:pPr>
+        <w:pStyle w:val="ListParagraph"/>
+        <w:numPr>
+          <w:ilvl w:val="1"/>
+          <w:numId w:val="38"/>
+        </w:numPr>
+      </w:pPr>
+      <w:r>
+        <w:t>Allow the user to create and edit evacuation scenarios</w:t>
+      </w:r>
+    </w:p>
+    <w:p>
+      <w:pPr>
+        <w:pStyle w:val="ListParagraph"/>
+        <w:numPr>
+          <w:ilvl w:val="2"/>
+          <w:numId w:val="38"/>
+        </w:numPr>
+      </w:pPr>
+      <w:r>
+        <w:t>Enable users to place and remove walls</w:t>
+      </w:r>
+    </w:p>
+    <w:p>
+      <w:pPr>
+        <w:pStyle w:val="ListParagraph"/>
+        <w:numPr>
+          <w:ilvl w:val="2"/>
+          <w:numId w:val="38"/>
+        </w:numPr>
+      </w:pPr>
+      <w:r>
+        <w:t>Enable users to place exits</w:t>
+      </w:r>
+    </w:p>
+    <w:p>
+      <w:pPr>
+        <w:pStyle w:val="ListParagraph"/>
+        <w:numPr>
+          <w:ilvl w:val="2"/>
+          <w:numId w:val="38"/>
+        </w:numPr>
+      </w:pPr>
+      <w:r>
+        <w:t>Enable users to place hazards</w:t>
+      </w:r>
+    </w:p>
+    <w:p>
+      <w:pPr>
+        <w:pStyle w:val="ListParagraph"/>
+        <w:numPr>
+          <w:ilvl w:val="2"/>
+          <w:numId w:val="38"/>
+        </w:numPr>
+      </w:pPr>
+      <w:r>
+        <w:t>Enable users to place one or more agent starting positions</w:t>
+      </w:r>
+    </w:p>
+    <w:p>
+      <w:pPr>
+        <w:pStyle w:val="ListParagraph"/>
+        <w:numPr>
+          <w:ilvl w:val="2"/>
+          <w:numId w:val="38"/>
+        </w:numPr>
+      </w:pPr>
+      <w:r>
+        <w:t>Provide a reset or clear function to quickly rebuild a scenario</w:t>
+      </w:r>
+    </w:p>
+    <w:p>
+      <w:pPr>
+        <w:pStyle w:val="ListParagraph"/>
+        <w:numPr>
+          <w:ilvl w:val="0"/>
+          <w:numId w:val="38"/>
+        </w:numPr>
+      </w:pPr>
+      <w:r>
+        <w:t>Evacuation Simulation</w:t>
+      </w:r>
+    </w:p>
+    <w:p>
+      <w:pPr>
+        <w:pStyle w:val="ListParagraph"/>
+        <w:numPr>
+          <w:ilvl w:val="1"/>
+          <w:numId w:val="38"/>
+        </w:numPr>
+      </w:pPr>
+      <w:r>
+        <w:t>Simulate the evacuation of multiple agents on the grid</w:t>
+      </w:r>
+    </w:p>
+    <w:p>
+      <w:pPr>
+        <w:pStyle w:val="ListParagraph"/>
+        <w:numPr>
+          <w:ilvl w:val="2"/>
+          <w:numId w:val="38"/>
+        </w:numPr>
+      </w:pPr>
+      <w:r>
+        <w:t>Represent each evacuee as an individual agent with its own position and state</w:t>
+      </w:r>
+    </w:p>
+    <w:p>
+      <w:pPr>
+        <w:pStyle w:val="ListParagraph"/>
+        <w:numPr>
+          <w:ilvl w:val="2"/>
+          <w:numId w:val="38"/>
+        </w:numPr>
+      </w:pPr>
+      <w:r>
+        <w:t>Update agent movement in discrete time steps</w:t>
+      </w:r>
+    </w:p>
+    <w:p>
+      <w:pPr>
+        <w:pStyle w:val="ListParagraph"/>
+        <w:numPr>
+          <w:ilvl w:val="2"/>
+          <w:numId w:val="38"/>
+        </w:numPr>
+      </w:pPr>
+      <w:r>
+        <w:t>Enforce occupancy rules so that no two agents can occupy the same cell at any given time</w:t>
+      </w:r>
+    </w:p>
+    <w:p>
+      <w:pPr>
+        <w:pStyle w:val="ListParagraph"/>
+        <w:numPr>
+          <w:ilvl w:val="1"/>
+          <w:numId w:val="38"/>
+        </w:numPr>
+      </w:pPr>
+      <w:r>
+        <w:t>Model congestion and movement conflicts</w:t>
+      </w:r>
+    </w:p>
+    <w:p>
+      <w:pPr>
+        <w:pStyle w:val="ListParagraph"/>
+        <w:numPr>
+          <w:ilvl w:val="2"/>
+          <w:numId w:val="38"/>
+        </w:numPr>
+      </w:pPr>
+      <w:r>
+        <w:t>Allow each agent to choose an intended move each tick</w:t>
+      </w:r>
+    </w:p>
+    <w:p>
+      <w:pPr>
+        <w:pStyle w:val="ListParagraph"/>
+        <w:numPr>
+          <w:ilvl w:val="2"/>
+          <w:numId w:val="38"/>
+        </w:numPr>
+      </w:pPr>
+      <w:r>
+        <w:t>Resolve conflicts when multiple agents choose the same cell</w:t>
+      </w:r>
+    </w:p>
+    <w:p>
+      <w:pPr>
+        <w:pStyle w:val="ListParagraph"/>
+        <w:numPr>
+          <w:ilvl w:val="2"/>
+          <w:numId w:val="38"/>
+        </w:numPr>
+      </w:pPr>
+      <w:r>
+        <w:t>Record waiting or blocked movement when an agent cannot move</w:t>
+      </w:r>
+    </w:p>
+    <w:p>
+      <w:pPr>
+        <w:pStyle w:val="ListParagraph"/>
+        <w:numPr>
+          <w:ilvl w:val="1"/>
+          <w:numId w:val="38"/>
+        </w:numPr>
+      </w:pPr>
+      <w:r>
+        <w:t>Include a simplified hazard model</w:t>
+      </w:r>
+    </w:p>
+    <w:p>
+      <w:pPr>
+        <w:pStyle w:val="ListParagraph"/>
+        <w:numPr>
+          <w:ilvl w:val="2"/>
+          <w:numId w:val="38"/>
+        </w:numPr>
+      </w:pPr>
+      <w:r>
+        <w:t>Represent hazards as sources of risk on the grid</w:t>
+      </w:r>
+    </w:p>
+    <w:p>
+      <w:pPr>
+        <w:pStyle w:val="ListParagraph"/>
+        <w:numPr>
+          <w:ilvl w:val="2"/>
+          <w:numId w:val="38"/>
+        </w:numPr>
+      </w:pPr>
+      <w:r>
+        <w:t>Make hazard risk decrease with distance from the hazard source</w:t>
+      </w:r>
+    </w:p>
+    <w:p>
+      <w:pPr>
+        <w:pStyle w:val="ListParagraph"/>
+        <w:numPr>
+          <w:ilvl w:val="2"/>
+          <w:numId w:val="38"/>
+        </w:numPr>
+      </w:pPr>
+      <w:r>
+        <w:t>Use hazard risk within the simulation to affect route quality and safety measurements</w:t>
+      </w:r>
+    </w:p>
+    <w:p>
+      <w:pPr>
+        <w:pStyle w:val="ListParagraph"/>
+        <w:numPr>
+          <w:ilvl w:val="0"/>
+          <w:numId w:val="38"/>
+        </w:numPr>
+      </w:pPr>
+      <w:r>
+        <w:t>Pathfinding / Routing Algorithms</w:t>
+      </w:r>
+    </w:p>
+    <w:p>
+      <w:pPr>
+        <w:pStyle w:val="ListParagraph"/>
+        <w:numPr>
+          <w:ilvl w:val="1"/>
+          <w:numId w:val="38"/>
+        </w:numPr>
+      </w:pPr>
+      <w:r>
+        <w:t>Implement a range of routing algorithms suitable for comparison</w:t>
+      </w:r>
+    </w:p>
+    <w:p>
+      <w:pPr>
+        <w:pStyle w:val="ListParagraph"/>
+        <w:numPr>
+          <w:ilvl w:val="2"/>
+          <w:numId w:val="38"/>
+        </w:numPr>
+      </w:pPr>
+      <w:r>
+        <w:t>Breadth-First Search (BFS)</w:t>
+      </w:r>
+    </w:p>
+    <w:p>
+      <w:pPr>
+        <w:pStyle w:val="ListParagraph"/>
+        <w:numPr>
+          <w:ilvl w:val="2"/>
+          <w:numId w:val="38"/>
+        </w:numPr>
+      </w:pPr>
+      <w:r>
+        <w:t>Dijkstra’s Algorithm</w:t>
+      </w:r>
+    </w:p>
+    <w:p>
+      <w:pPr>
+        <w:pStyle w:val="ListParagraph"/>
+        <w:numPr>
+          <w:ilvl w:val="2"/>
+          <w:numId w:val="38"/>
+        </w:numPr>
+      </w:pPr>
+      <w:r>
+        <w:t>A*</w:t>
+      </w:r>
+    </w:p>
+    <w:p>
+      <w:pPr>
+        <w:pStyle w:val="ListParagraph"/>
+        <w:numPr>
+          <w:ilvl w:val="2"/>
+          <w:numId w:val="38"/>
+        </w:numPr>
+      </w:pPr>
+      <w:r>
+        <w:t>Greedy Best-First Search</w:t>
+      </w:r>
+    </w:p>
+    <w:p>
+      <w:pPr>
+        <w:pStyle w:val="ListParagraph"/>
+        <w:numPr>
+          <w:ilvl w:val="1"/>
+          <w:numId w:val="38"/>
+        </w:numPr>
+      </w:pPr>
+      <w:r>
+        <w:t>Allow the user to select which routing algorithm is used</w:t>
+      </w:r>
+    </w:p>
+    <w:p>
+      <w:pPr>
+        <w:pStyle w:val="ListParagraph"/>
+        <w:numPr>
+          <w:ilvl w:val="2"/>
+          <w:numId w:val="38"/>
+        </w:numPr>
+      </w:pPr>
+      <w:r>
+        <w:t>Provide a clear interface control for selecting an algorithm</w:t>
+      </w:r>
+    </w:p>
+    <w:p>
+      <w:pPr>
+        <w:pStyle w:val="ListParagraph"/>
+        <w:numPr>
+          <w:ilvl w:val="2"/>
+          <w:numId w:val="38"/>
+        </w:numPr>
+      </w:pPr>
+      <w:r>
+        <w:lastRenderedPageBreak/>
+        <w:t>Allow the same scenario to be rerun with different algorithms for comparison</w:t>
+      </w:r>
+    </w:p>
+    <w:p>
+      <w:pPr>
+        <w:pStyle w:val="ListParagraph"/>
+        <w:numPr>
+          <w:ilvl w:val="0"/>
+          <w:numId w:val="38"/>
+        </w:numPr>
+      </w:pPr>
+      <w:r>
+        <w:t>Visualisation and User Interface</w:t>
+      </w:r>
+    </w:p>
+    <w:p>
+      <w:pPr>
+        <w:pStyle w:val="ListParagraph"/>
+        <w:numPr>
+          <w:ilvl w:val="1"/>
+          <w:numId w:val="38"/>
+        </w:numPr>
+      </w:pPr>
+      <w:r>
+        <w:t>Provide clear visualisation of the simulation</w:t>
+      </w:r>
+    </w:p>
+    <w:p>
+      <w:pPr>
+        <w:pStyle w:val="ListParagraph"/>
+        <w:numPr>
+          <w:ilvl w:val="2"/>
+          <w:numId w:val="38"/>
+        </w:numPr>
+      </w:pPr>
+      <w:r>
+        <w:t>Include a step-by-step mode so users can observe how algorithms behave</w:t>
+      </w:r>
+    </w:p>
+    <w:p>
+      <w:pPr>
+        <w:pStyle w:val="ListParagraph"/>
+        <w:numPr>
+          <w:ilvl w:val="2"/>
+          <w:numId w:val="38"/>
+        </w:numPr>
+      </w:pPr>
+      <w:r>
+        <w:t>Include an instant-result mode so users can quickly compare outcomes</w:t>
+      </w:r>
+    </w:p>
+    <w:p>
+      <w:pPr>
+        <w:pStyle w:val="ListParagraph"/>
+        <w:numPr>
+          <w:ilvl w:val="2"/>
+          <w:numId w:val="38"/>
+        </w:numPr>
+      </w:pPr>
+      <w:r>
+        <w:t>Allow the user to control simulation speed</w:t>
+      </w:r>
+    </w:p>
+    <w:p>
+      <w:pPr>
+        <w:pStyle w:val="ListParagraph"/>
+        <w:numPr>
+          <w:ilvl w:val="1"/>
+          <w:numId w:val="38"/>
+        </w:numPr>
+      </w:pPr>
+      <w:r>
+        <w:t>Create an interface suitable for primary users</w:t>
+      </w:r>
+    </w:p>
+    <w:p>
+      <w:pPr>
+        <w:pStyle w:val="ListParagraph"/>
+        <w:numPr>
+          <w:ilvl w:val="2"/>
+          <w:numId w:val="38"/>
+        </w:numPr>
+      </w:pPr>
+      <w:r>
+        <w:t>Use clear and consistent colour coding for cell and agent states</w:t>
+      </w:r>
+    </w:p>
+    <w:p>
+      <w:pPr>
+        <w:pStyle w:val="ListParagraph"/>
+        <w:numPr>
+          <w:ilvl w:val="2"/>
+          <w:numId w:val="38"/>
+        </w:numPr>
+      </w:pPr>
+      <w:r>
+        <w:t>Include labels, tooltips, or a legend so that users can understand controls and outputs</w:t>
+      </w:r>
+    </w:p>
+    <w:p>
+      <w:pPr>
+        <w:pStyle w:val="ListParagraph"/>
+        <w:numPr>
+          <w:ilvl w:val="2"/>
+          <w:numId w:val="38"/>
+        </w:numPr>
+      </w:pPr>
+      <w:r>
+        <w:t>Include example pre-made scenarios to help classroom use and demonstration</w:t>
+      </w:r>
+    </w:p>
+    <w:p>
+      <w:pPr>
+        <w:pStyle w:val="ListParagraph"/>
+        <w:numPr>
+          <w:ilvl w:val="0"/>
+          <w:numId w:val="38"/>
+        </w:numPr>
+      </w:pPr>
+      <w:r>
+        <w:t>Metrics and Comparison</w:t>
+      </w:r>
+    </w:p>
+    <w:p>
+      <w:pPr>
+        <w:pStyle w:val="ListParagraph"/>
+        <w:numPr>
+          <w:ilvl w:val="1"/>
+          <w:numId w:val="38"/>
+        </w:numPr>
+      </w:pPr>
+      <w:r>
+        <w:t>Calculate and display evacuation outcome metrics</w:t>
+      </w:r>
+    </w:p>
+    <w:p>
+      <w:pPr>
+        <w:pStyle w:val="ListParagraph"/>
+        <w:numPr>
+          <w:ilvl w:val="2"/>
+          <w:numId w:val="38"/>
+        </w:numPr>
+      </w:pPr>
+      <w:r>
+        <w:t>Display total evacuation time</w:t>
+      </w:r>
+    </w:p>
+    <w:p>
+      <w:pPr>
+        <w:pStyle w:val="ListParagraph"/>
+        <w:numPr>
+          <w:ilvl w:val="2"/>
+          <w:numId w:val="38"/>
+        </w:numPr>
+      </w:pPr>
+      <w:r>
+        <w:t>Display average waiting time or congestion-related information</w:t>
+      </w:r>
+    </w:p>
+    <w:p>
+      <w:pPr>
+        <w:pStyle w:val="ListParagraph"/>
+        <w:numPr>
+          <w:ilvl w:val="2"/>
+          <w:numId w:val="38"/>
+        </w:numPr>
+      </w:pPr>
+      <w:r>
+        <w:t>Display a safety or risk-related measure for hazardous scenarios</w:t>
+      </w:r>
+    </w:p>
+    <w:p>
+      <w:pPr>
+        <w:pStyle w:val="ListParagraph"/>
+        <w:numPr>
+          <w:ilvl w:val="2"/>
+          <w:numId w:val="38"/>
+        </w:numPr>
+      </w:pPr>
+      <w:r>
+        <w:t>Display evacuation completion information</w:t>
+      </w:r>
+    </w:p>
+    <w:p>
+      <w:pPr>
+        <w:pStyle w:val="ListParagraph"/>
+        <w:numPr>
+          <w:ilvl w:val="1"/>
+          <w:numId w:val="38"/>
+        </w:numPr>
+      </w:pPr>
+      <w:r>
+        <w:t>Calculate and display algorithm performance metrics</w:t>
+      </w:r>
+    </w:p>
+    <w:p>
+      <w:pPr>
+        <w:pStyle w:val="ListParagraph"/>
+        <w:numPr>
+          <w:ilvl w:val="2"/>
+          <w:numId w:val="38"/>
+        </w:numPr>
+      </w:pPr>
+      <w:r>
+        <w:t>Display runtime for each algorithm</w:t>
+      </w:r>
+    </w:p>
+    <w:p>
+      <w:pPr>
+        <w:pStyle w:val="ListParagraph"/>
+        <w:numPr>
+          <w:ilvl w:val="2"/>
+          <w:numId w:val="38"/>
+        </w:numPr>
+      </w:pPr>
+      <w:r>
+        <w:t>Display the number of nodes/cells explored where appropriate</w:t>
+      </w:r>
+    </w:p>
+    <w:p>
+      <w:pPr>
+        <w:pStyle w:val="ListParagraph"/>
+        <w:numPr>
+          <w:ilvl w:val="2"/>
+          <w:numId w:val="38"/>
+        </w:numPr>
+      </w:pPr>
+      <w:r>
+        <w:t>Present results in a form that allows the user to compare algorithms</w:t>
+      </w:r>
+    </w:p>
+    <w:p>
+      <w:pPr>
+        <w:pStyle w:val="ListParagraph"/>
+        <w:numPr>
+          <w:ilvl w:val="0"/>
+          <w:numId w:val="38"/>
+        </w:numPr>
+      </w:pPr>
+      <w:r>
+        <w:t>Educational Use</w:t>
+      </w:r>
+    </w:p>
+    <w:p>
+      <w:pPr>
+        <w:pStyle w:val="ListParagraph"/>
+        <w:numPr>
+          <w:ilvl w:val="1"/>
+          <w:numId w:val="38"/>
+        </w:numPr>
+      </w:pPr>
+      <w:r>
+        <w:t>Ensure the program supports learning as well as simulation</w:t>
+      </w:r>
+    </w:p>
+    <w:p>
+      <w:pPr>
+        <w:pStyle w:val="ListParagraph"/>
+        <w:numPr>
+          <w:ilvl w:val="2"/>
+          <w:numId w:val="38"/>
+        </w:numPr>
+      </w:pPr>
+      <w:r>
+        <w:t>Make it possible for users to see how different routing algorithms behave on the same scenario</w:t>
+      </w:r>
+    </w:p>
+    <w:p>
+      <w:pPr>
+        <w:pStyle w:val="ListParagraph"/>
+        <w:numPr>
+          <w:ilvl w:val="2"/>
+          <w:numId w:val="38"/>
+        </w:numPr>
+      </w:pPr>
+      <w:r>
+        <w:t xml:space="preserve">Present outputs clearly </w:t>
+      </w:r>
+      <w:r>
+        <w:t xml:space="preserve">enough that </w:t>
+      </w:r>
+      <w:r>
+        <w:t xml:space="preserve">A-Level Computer Science students and teachers </w:t>
+      </w:r>
+      <w:r>
+        <w:t>can use the program as an educational tool</w:t>
+      </w:r>
+    </w:p>
+    <w:p>
+      <w:pPr>
+        <w:pStyle w:val="ListParagraph"/>
+        <w:numPr>
+          <w:ilvl w:val="0"/>
+          <w:numId w:val="38"/>
+        </w:numPr>
+      </w:pPr>
+      <w:r>
+        <w:t xml:space="preserve">Recommendation System </w:t>
+      </w:r>
+      <w:r>
+        <w:rPr>
+          <w:b/>
+          <w:bCs/>
+        </w:rPr>
+        <w:t>SECONDARY</w:t>
+      </w:r>
+    </w:p>
+    <w:p>
+      <w:pPr>
+        <w:pStyle w:val="ListParagraph"/>
+        <w:numPr>
+          <w:ilvl w:val="1"/>
+          <w:numId w:val="38"/>
+        </w:numPr>
+      </w:pPr>
+      <w:r>
+        <w:t>Implement a limited recommendation feature to suggest a suitable routing strategy for a scenario</w:t>
+      </w:r>
+    </w:p>
+    <w:p>
+      <w:pPr>
+        <w:pStyle w:val="ListParagraph"/>
+        <w:numPr>
+          <w:ilvl w:val="2"/>
+          <w:numId w:val="38"/>
+        </w:numPr>
+      </w:pPr>
+      <w:r>
+        <w:t>Base the recommendation on both evacuation speed and safety</w:t>
+      </w:r>
+    </w:p>
+    <w:p>
+      <w:pPr>
+        <w:pStyle w:val="ListParagraph"/>
+        <w:numPr>
+          <w:ilvl w:val="2"/>
+          <w:numId w:val="38"/>
+        </w:numPr>
+      </w:pPr>
+      <w:r>
+        <w:t>Use scenario features and recorded simulation outcomes as the basis for recommendation</w:t>
+      </w:r>
+    </w:p>
+    <w:p>
+      <w:pPr>
+        <w:pStyle w:val="ListParagraph"/>
+        <w:numPr>
+          <w:ilvl w:val="2"/>
+          <w:numId w:val="38"/>
+        </w:numPr>
+        <w:sectPr>
+          <w:pgSz w:w="11906" w:h="16838"/>
+          <w:pgMar w:top="1440" w:right="1440" w:bottom="1440" w:left="1440" w:header="708" w:footer="708" w:gutter="0"/>
+          <w:cols w:space="708"/>
+          <w:docGrid w:linePitch="360"/>
+        </w:sectPr>
+      </w:pPr>
+      <w:r>
+        <w:t>Use K-Nearest Neighbours (KNN) as a simple machine-learning method to make predictions</w:t>
+      </w:r>
+    </w:p>
+    <w:p>
+      <w:pPr>
+        <w:pStyle w:val="Heading1"/>
+      </w:pPr>
+    </w:p>
+    <w:p>
+      <w:pPr>
+        <w:pStyle w:val="Heading1"/>
+      </w:pPr>
+    </w:p>
+    <w:p>
+      <w:pPr>
+        <w:pStyle w:val="Heading1"/>
+      </w:pPr>
+    </w:p>
+    <w:p>
+      <w:pPr>
+        <w:pStyle w:val="Heading1"/>
+        <w:sectPr>
+          <w:pgSz w:w="11906" w:h="16838"/>
+          <w:pgMar w:top="1440" w:right="1440" w:bottom="1440" w:left="1440" w:header="708" w:footer="708" w:gutter="0"/>
+          <w:cols w:space="708"/>
+          <w:docGrid w:linePitch="360"/>
+        </w:sectPr>
+      </w:pPr>
+      <w:bookmarkStart w:id="43" w:name="_Toc223914851"/>
+      <w:r>
+        <w:t>Design</w:t>
+      </w:r>
+      <w:bookmarkEnd w:id="43"/>
+    </w:p>
+    <w:p>
+      <w:pPr>
+        <w:pStyle w:val="Heading2"/>
+      </w:pPr>
+      <w:bookmarkStart w:id="44" w:name="_Toc223914852"/>
+      <w:r>
+        <w:lastRenderedPageBreak/>
+        <w:t>Description</w:t>
+      </w:r>
+      <w:bookmarkEnd w:id="44"/>
+    </w:p>
+    <w:p>
+      <w:r>
+        <w:t>The final program will be a grid-based evacuation simulator designed as an educational tool for A-Level Computer Science students and teachers. Users will be able to create or edit a floorplan by placing walls, exits, hazards, and agent starting positions on a two-dimensional grid, then run an evacuation simulation after choosing one of four routing algorithms: BFS, A*, Dijkstra’s, or Greedy Best-First.</w:t>
+      </w:r>
+      <w:r>
+        <w:t xml:space="preserve"> The simulator will support both step-by-step and instant modes of visualisation, allowing users to either watch how each algorithm behaves in detail or quickly compare simulation outcomes.</w:t>
+      </w:r>
+    </w:p>
+    <w:p>
+      <w:r>
+        <w:t>Certain aspects of the project are intentionally simplified to keep the project scope realistic while still retaining usefulness. As opposed to attempting a highly detailed fire and smoke model, the program will use grid representation with discrete agents, simple congestion rules, and a basic hazard-risk model, taking after my previous research on fine-grid and cellular automata approaches for modelling movement and congestion.</w:t>
+      </w:r>
+    </w:p>
+    <w:p>
+      <w:pPr>
+        <w:sectPr>
+          <w:pgSz w:w="11906" w:h="16838"/>
+          <w:pgMar w:top="1440" w:right="1440" w:bottom="1440" w:left="1440" w:header="708" w:footer="708" w:gutter="0"/>
+          <w:cols w:space="708"/>
+          <w:docGrid w:linePitch="360"/>
+        </w:sectPr>
+      </w:pPr>
+      <w:r>
+        <w:t>The four traversal algorithms selected for comparison are Breadth-First Search (BFS), Dijkstra’s algorithm, A*, and Greedy Best-First Search. Combined, they provide a useful educational foundation: BFS acts as a simple baseline, Dijkstra’s is a step up and handles weighted routing, A* demonstrates the strength of heuristics while staying optimal, and Greedy Best-First Search presents the trade-off between speed and path quality. At the end of each simulation, the system will show the user both evacuation outcome metrics and algorithm-performance metrics so that the user can compare which routes were found and how efficiently they were found.</w:t>
+      </w:r>
+    </w:p>
+    <w:p>
+      <w:pPr>
+        <w:pStyle w:val="Heading2"/>
+      </w:pPr>
+      <w:bookmarkStart w:id="45" w:name="_Toc223914853"/>
+      <w:r>
+        <w:lastRenderedPageBreak/>
+        <w:t>Data Design</w:t>
+      </w:r>
+      <w:bookmarkEnd w:id="45"/>
+    </w:p>
+    <w:p>
+      <w:pPr>
+        <w:pStyle w:val="Heading3"/>
+      </w:pPr>
+      <w:bookmarkStart w:id="46" w:name="_Toc223914854"/>
+      <w:r>
+        <w:t>Grid Representation</w:t>
+      </w:r>
+      <w:bookmarkEnd w:id="46"/>
+    </w:p>
+    <w:p>
+      <w:r>
+        <w:t>The main scenario will be stored as a two-dimensional grid; each element will represent one cell of space in the environment and will hold information required for both display and simulation. Each cell will need to store its type (e.g., empty space, wall, exit, hazard, or agent spawn point), whether it is currently occupied by an agent, and any risk associated with the cell. One cell can only hold one occupant at any given time.</w:t>
+      </w:r>
+    </w:p>
+    <w:p>
+      <w:r>
+        <w:t>With the routing (or pathfinding/traversal) algorithms, each walkable cell can be treated as a vertex in a graph, with edges linking it to neighbouring walkable cells.</w:t>
+      </w:r>
+      <w:r>
+        <w:t xml:space="preserve"> This means that the same representation can be used by the routing algorithms </w:t>
+      </w:r>
+      <w:r>
+        <w:t>the same</w:t>
+      </w:r>
+      <w:r>
+        <w:t>, with only cost calculation and node-selection logic changing between algorithms; this reduces data redundancy and makes the program more modular.</w:t>
+      </w:r>
+    </w:p>
+    <w:p>
+      <w:pPr>
+        <w:pStyle w:val="Heading3"/>
+      </w:pPr>
+      <w:bookmarkStart w:id="47" w:name="_Toc223914855"/>
+      <w:r>
+        <w:t>Agent Representation</w:t>
+      </w:r>
+      <w:bookmarkEnd w:id="47"/>
+    </w:p>
+    <w:p>
+      <w:r>
+        <w:t>Each evacuee will be represented as an agent object or record, storing the agent’s current row and column position, whether the agent has evacuated, the current path being followed, and measures collected during runtime (e.g., waiting time and cumulative risk exposure). This is necessary as the program must simulate the movement of multiple “people”, who may block each other, queue at exits, or be exposed to varying degrees of risk depending on their route, at once.</w:t>
+      </w:r>
+    </w:p>
+    <w:p>
+      <w:pPr>
+        <w:pStyle w:val="Heading3"/>
+      </w:pPr>
+      <w:bookmarkStart w:id="48" w:name="_Toc223914856"/>
+      <w:r>
+        <w:t>Hazard Representation</w:t>
+      </w:r>
+      <w:bookmarkEnd w:id="48"/>
+    </w:p>
+    <w:p>
+      <w:r>
+        <w:t>Hazards will be represented as risk sources placed by the user on the grid. As opposed to modelling smoke and fire, each hazard will contribute to a “field of risk” across nearby cells, with risk decreasing with distance from the source/hazard. This provides a simple yet effective way of allowing hazardous areas to influence routing logic without adding unnecessary complexity.</w:t>
+      </w:r>
+    </w:p>
+    <w:p>
+      <w:pPr>
+        <w:pStyle w:val="Heading3"/>
+      </w:pPr>
+      <w:bookmarkStart w:id="49" w:name="_Toc223914857"/>
+      <w:r>
+        <w:t>Simulation State and Metrics</w:t>
+      </w:r>
+      <w:bookmarkEnd w:id="49"/>
+    </w:p>
+    <w:p>
+      <w:pPr>
+        <w:sectPr>
+          <w:pgSz w:w="11906" w:h="16838"/>
+          <w:pgMar w:top="1440" w:right="1440" w:bottom="1440" w:left="1440" w:header="708" w:footer="708" w:gutter="0"/>
+          <w:cols w:space="708"/>
+          <w:docGrid w:linePitch="360"/>
+        </w:sectPr>
+      </w:pPr>
+      <w:r>
+        <w:t>The whole simulation will require a set of globally accessible state variables, including the current tick number, the selected routing algorithm, the current visualisation mode, and collections of all active agents and cell types. In conjunction with this, the program will also store and maintain metrics such as total evacuation time, number of agents evacuated, average waiting time, and risk-related measures. Separate algorithm-performance metrics will also be stored (e.g., algorithm runtime and nodes explored).</w:t>
+      </w:r>
+    </w:p>
+    <w:p>
+      <w:pPr>
+        <w:pStyle w:val="Heading2"/>
+        <w:sectPr>
+          <w:pgSz w:w="11906" w:h="16838"/>
+          <w:pgMar w:top="1440" w:right="1440" w:bottom="1440" w:left="1440" w:header="708" w:footer="708" w:gutter="0"/>
+          <w:cols w:space="708"/>
+          <w:docGrid w:linePitch="360"/>
+        </w:sectPr>
+      </w:pPr>
+      <w:bookmarkStart w:id="50" w:name="_Toc223914858"/>
+      <w:r>
+        <w:lastRenderedPageBreak/>
+        <w:t>Simulation Design</w:t>
+      </w:r>
+      <w:bookmarkEnd w:id="50"/>
+    </w:p>
+    <w:bookmarkStart w:id="51" w:name="_Toc223914859" w:displacedByCustomXml="next"/>
     <w:sdt>
       <w:sdtPr>
         <w:rPr>
-          <w:b w:val="0"/>
-          <w:bCs w:val="0"/>
-          <w:smallCaps w:val="0"/>
           <w:spacing w:val="0"/>
           <w:sz w:val="24"/>
           <w:szCs w:val="24"/>
@@ -11252,6 +13377,13 @@
           <w:docPartUnique/>
         </w:docPartObj>
       </w:sdtPr>
+      <w:sdtEndPr>
+        <w:rPr>
+          <w:b w:val="0"/>
+          <w:bCs w:val="0"/>
+          <w:smallCaps w:val="0"/>
+        </w:rPr>
+      </w:sdtEndPr>
       <w:sdtContent>
         <w:p>
           <w:pPr>
@@ -11260,7 +13392,7 @@
           <w:r>
             <w:t>References</w:t>
           </w:r>
-          <w:bookmarkEnd w:id="39"/>
+          <w:bookmarkEnd w:id="51"/>
         </w:p>
         <w:sdt>
           <w:sdtPr>
@@ -11579,6 +13711,7 @@
                 <w:rPr>
                   <w:noProof/>
                 </w:rPr>
+                <w:lastRenderedPageBreak/>
                 <w:t xml:space="preserve">Koenig, S., &amp; Likhachev, M. (2001). </w:t>
               </w:r>
               <w:r>
@@ -11608,7 +13741,6 @@
                 <w:rPr>
                   <w:noProof/>
                 </w:rPr>
-                <w:lastRenderedPageBreak/>
                 <w:t xml:space="preserve">Koenig, S., &amp; Likhachev, M. (2002). </w:t>
               </w:r>
               <w:r>
@@ -11942,7 +14074,14 @@
                 <w:rPr>
                   <w:noProof/>
                 </w:rPr>
-                <w:t xml:space="preserve"> Retrieved from https://files.thunderheadeng.com/support/documents/pathfinder-technical-reference-manual-2021-1.pdf</w:t>
+                <w:t xml:space="preserve"> Retrieved from </w:t>
+              </w:r>
+              <w:r>
+                <w:rPr>
+                  <w:noProof/>
+                </w:rPr>
+                <w:lastRenderedPageBreak/>
+                <w:t>https://files.thunderheadeng.com/support/documents/pathfinder-technical-reference-manual-2021-1.pdf</w:t>
               </w:r>
             </w:p>
             <w:p>
@@ -11957,7 +14096,6 @@
                 <w:rPr>
                   <w:noProof/>
                 </w:rPr>
-                <w:lastRenderedPageBreak/>
                 <w:t xml:space="preserve">University of California, Berkeley. (2025, December). </w:t>
               </w:r>
               <w:r>
@@ -12119,22 +14257,22 @@
       <w:pPr>
         <w:pStyle w:val="Heading1"/>
       </w:pPr>
-      <w:bookmarkStart w:id="40" w:name="_Toc223895426"/>
+      <w:bookmarkStart w:id="52" w:name="_Toc223914860"/>
       <w:r>
         <w:lastRenderedPageBreak/>
         <w:t>Table of Figures</w:t>
       </w:r>
-      <w:bookmarkEnd w:id="40"/>
+      <w:bookmarkEnd w:id="52"/>
     </w:p>
     <w:p>
       <w:pPr>
         <w:pStyle w:val="Heading2"/>
       </w:pPr>
-      <w:bookmarkStart w:id="41" w:name="_Toc223895427"/>
+      <w:bookmarkStart w:id="53" w:name="_Toc223914861"/>
       <w:r>
         <w:t>Figures</w:t>
       </w:r>
-      <w:bookmarkEnd w:id="41"/>
+      <w:bookmarkEnd w:id="53"/>
     </w:p>
     <w:p>
       <w:pPr>
@@ -12161,13 +14299,27 @@
       <w:r>
         <w:fldChar w:fldCharType="separate"/>
       </w:r>
-      <w:hyperlink w:anchor="_Toc223897626" w:history="1">
+      <w:hyperlink w:anchor="_Toc223906934" w:history="1">
         <w:r>
           <w:rPr>
             <w:rStyle w:val="Hyperlink"/>
             <w:noProof/>
           </w:rPr>
-          <w:t>Figure 1 Column chart of different types of respondents surveyed</w:t>
+          <w:t>Figure 1 Column chart of different types of respon</w:t>
+        </w:r>
+        <w:r>
+          <w:rPr>
+            <w:rStyle w:val="Hyperlink"/>
+            <w:noProof/>
+          </w:rPr>
+          <w:t>d</w:t>
+        </w:r>
+        <w:r>
+          <w:rPr>
+            <w:rStyle w:val="Hyperlink"/>
+            <w:noProof/>
+          </w:rPr>
+          <w:t>ents surveyed</w:t>
         </w:r>
         <w:r>
           <w:rPr>
@@ -12188,7 +14340,7 @@
             <w:noProof/>
             <w:webHidden/>
           </w:rPr>
-          <w:instrText xml:space="preserve"> PAGEREF _Toc223897626 \h </w:instrText>
+          <w:instrText xml:space="preserve"> PAGEREF _Toc223906934 \h </w:instrText>
         </w:r>
         <w:r>
           <w:rPr>
@@ -12235,7 +14387,7 @@
           <w14:ligatures w14:val="standardContextual"/>
         </w:rPr>
       </w:pPr>
-      <w:hyperlink w:anchor="_Toc223897627" w:history="1">
+      <w:hyperlink w:anchor="_Toc223906935" w:history="1">
         <w:r>
           <w:rPr>
             <w:rStyle w:val="Hyperlink"/>
@@ -12262,7 +14414,7 @@
             <w:noProof/>
             <w:webHidden/>
           </w:rPr>
-          <w:instrText xml:space="preserve"> PAGEREF _Toc223897627 \h </w:instrText>
+          <w:instrText xml:space="preserve"> PAGEREF _Toc223906935 \h </w:instrText>
         </w:r>
         <w:r>
           <w:rPr>
@@ -12309,7 +14461,7 @@
           <w14:ligatures w14:val="standardContextual"/>
         </w:rPr>
       </w:pPr>
-      <w:hyperlink w:anchor="_Toc223897628" w:history="1">
+      <w:hyperlink w:anchor="_Toc223906936" w:history="1">
         <w:r>
           <w:rPr>
             <w:rStyle w:val="Hyperlink"/>
@@ -12336,7 +14488,7 @@
             <w:noProof/>
             <w:webHidden/>
           </w:rPr>
-          <w:instrText xml:space="preserve"> PAGEREF _Toc223897628 \h </w:instrText>
+          <w:instrText xml:space="preserve"> PAGEREF _Toc223906936 \h </w:instrText>
         </w:r>
         <w:r>
           <w:rPr>
@@ -12383,7 +14535,7 @@
           <w14:ligatures w14:val="standardContextual"/>
         </w:rPr>
       </w:pPr>
-      <w:hyperlink w:anchor="_Toc223897629" w:history="1">
+      <w:hyperlink w:anchor="_Toc223906937" w:history="1">
         <w:r>
           <w:rPr>
             <w:rStyle w:val="Hyperlink"/>
@@ -12410,7 +14562,7 @@
             <w:noProof/>
             <w:webHidden/>
           </w:rPr>
-          <w:instrText xml:space="preserve"> PAGEREF _Toc223897629 \h </w:instrText>
+          <w:instrText xml:space="preserve"> PAGEREF _Toc223906937 \h </w:instrText>
         </w:r>
         <w:r>
           <w:rPr>
@@ -12457,7 +14609,7 @@
           <w14:ligatures w14:val="standardContextual"/>
         </w:rPr>
       </w:pPr>
-      <w:hyperlink w:anchor="_Toc223897630" w:history="1">
+      <w:hyperlink w:anchor="_Toc223906938" w:history="1">
         <w:r>
           <w:rPr>
             <w:rStyle w:val="Hyperlink"/>
@@ -12484,7 +14636,7 @@
             <w:noProof/>
             <w:webHidden/>
           </w:rPr>
-          <w:instrText xml:space="preserve"> PAGEREF _Toc223897630 \h </w:instrText>
+          <w:instrText xml:space="preserve"> PAGEREF _Toc223906938 \h </w:instrText>
         </w:r>
         <w:r>
           <w:rPr>
@@ -12531,7 +14683,7 @@
           <w14:ligatures w14:val="standardContextual"/>
         </w:rPr>
       </w:pPr>
-      <w:hyperlink w:anchor="_Toc223897631" w:history="1">
+      <w:hyperlink w:anchor="_Toc223906939" w:history="1">
         <w:r>
           <w:rPr>
             <w:rStyle w:val="Hyperlink"/>
@@ -12558,7 +14710,7 @@
             <w:noProof/>
             <w:webHidden/>
           </w:rPr>
-          <w:instrText xml:space="preserve"> PAGEREF _Toc223897631 \h </w:instrText>
+          <w:instrText xml:space="preserve"> PAGEREF _Toc223906939 \h </w:instrText>
         </w:r>
         <w:r>
           <w:rPr>
@@ -12605,7 +14757,7 @@
           <w14:ligatures w14:val="standardContextual"/>
         </w:rPr>
       </w:pPr>
-      <w:hyperlink w:anchor="_Toc223897632" w:history="1">
+      <w:hyperlink w:anchor="_Toc223906940" w:history="1">
         <w:r>
           <w:rPr>
             <w:rStyle w:val="Hyperlink"/>
@@ -12632,7 +14784,7 @@
             <w:noProof/>
             <w:webHidden/>
           </w:rPr>
-          <w:instrText xml:space="preserve"> PAGEREF _Toc223897632 \h </w:instrText>
+          <w:instrText xml:space="preserve"> PAGEREF _Toc223906940 \h </w:instrText>
         </w:r>
         <w:r>
           <w:rPr>
@@ -12679,7 +14831,7 @@
           <w14:ligatures w14:val="standardContextual"/>
         </w:rPr>
       </w:pPr>
-      <w:hyperlink w:anchor="_Toc223897633" w:history="1">
+      <w:hyperlink w:anchor="_Toc223906941" w:history="1">
         <w:r>
           <w:rPr>
             <w:rStyle w:val="Hyperlink"/>
@@ -12706,7 +14858,7 @@
             <w:noProof/>
             <w:webHidden/>
           </w:rPr>
-          <w:instrText xml:space="preserve"> PAGEREF _Toc223897633 \h </w:instrText>
+          <w:instrText xml:space="preserve"> PAGEREF _Toc223906941 \h </w:instrText>
         </w:r>
         <w:r>
           <w:rPr>
@@ -12753,7 +14905,7 @@
           <w14:ligatures w14:val="standardContextual"/>
         </w:rPr>
       </w:pPr>
-      <w:hyperlink w:anchor="_Toc223897634" w:history="1">
+      <w:hyperlink w:anchor="_Toc223906942" w:history="1">
         <w:r>
           <w:rPr>
             <w:rStyle w:val="Hyperlink"/>
@@ -12780,7 +14932,7 @@
             <w:noProof/>
             <w:webHidden/>
           </w:rPr>
-          <w:instrText xml:space="preserve"> PAGEREF _Toc223897634 \h </w:instrText>
+          <w:instrText xml:space="preserve"> PAGEREF _Toc223906942 \h </w:instrText>
         </w:r>
         <w:r>
           <w:rPr>
@@ -12818,11 +14970,11 @@
       <w:r>
         <w:fldChar w:fldCharType="end"/>
       </w:r>
-      <w:bookmarkStart w:id="42" w:name="_Toc223895428"/>
+      <w:bookmarkStart w:id="54" w:name="_Toc223914862"/>
       <w:r>
         <w:t>Tables</w:t>
       </w:r>
-      <w:bookmarkEnd w:id="42"/>
+      <w:bookmarkEnd w:id="54"/>
     </w:p>
     <w:p>
       <w:pPr>
@@ -12849,7 +15001,7 @@
       <w:r>
         <w:fldChar w:fldCharType="separate"/>
       </w:r>
-      <w:hyperlink w:anchor="_Toc223898115" w:history="1">
+      <w:hyperlink w:anchor="_Toc223906943" w:history="1">
         <w:r>
           <w:rPr>
             <w:rStyle w:val="Hyperlink"/>
@@ -12876,7 +15028,7 @@
             <w:noProof/>
             <w:webHidden/>
           </w:rPr>
-          <w:instrText xml:space="preserve"> PAGEREF _Toc223898115 \h </w:instrText>
+          <w:instrText xml:space="preserve"> PAGEREF _Toc223906943 \h </w:instrText>
         </w:r>
         <w:r>
           <w:rPr>
@@ -12923,7 +15075,7 @@
           <w14:ligatures w14:val="standardContextual"/>
         </w:rPr>
       </w:pPr>
-      <w:hyperlink w:anchor="_Toc223898116" w:history="1">
+      <w:hyperlink w:anchor="_Toc223906944" w:history="1">
         <w:r>
           <w:rPr>
             <w:rStyle w:val="Hyperlink"/>
@@ -12950,7 +15102,7 @@
             <w:noProof/>
             <w:webHidden/>
           </w:rPr>
-          <w:instrText xml:space="preserve"> PAGEREF _Toc223898116 \h </w:instrText>
+          <w:instrText xml:space="preserve"> PAGEREF _Toc223906944 \h </w:instrText>
         </w:r>
         <w:r>
           <w:rPr>
@@ -12997,7 +15149,7 @@
           <w14:ligatures w14:val="standardContextual"/>
         </w:rPr>
       </w:pPr>
-      <w:hyperlink w:anchor="_Toc223898117" w:history="1">
+      <w:hyperlink w:anchor="_Toc223906945" w:history="1">
         <w:r>
           <w:rPr>
             <w:rStyle w:val="Hyperlink"/>
@@ -13024,7 +15176,7 @@
             <w:noProof/>
             <w:webHidden/>
           </w:rPr>
-          <w:instrText xml:space="preserve"> PAGEREF _Toc223898117 \h </w:instrText>
+          <w:instrText xml:space="preserve"> PAGEREF _Toc223906945 \h </w:instrText>
         </w:r>
         <w:r>
           <w:rPr>
@@ -13071,7 +15223,7 @@
           <w14:ligatures w14:val="standardContextual"/>
         </w:rPr>
       </w:pPr>
-      <w:hyperlink w:anchor="_Toc223898118" w:history="1">
+      <w:hyperlink w:anchor="_Toc223906946" w:history="1">
         <w:r>
           <w:rPr>
             <w:rStyle w:val="Hyperlink"/>
@@ -13098,7 +15250,7 @@
             <w:noProof/>
             <w:webHidden/>
           </w:rPr>
-          <w:instrText xml:space="preserve"> PAGEREF _Toc223898118 \h </w:instrText>
+          <w:instrText xml:space="preserve"> PAGEREF _Toc223906946 \h </w:instrText>
         </w:r>
         <w:r>
           <w:rPr>
@@ -14131,6 +16283,44 @@
       </w:r>
     </w:p>
   </w:footnote>
+  <w:footnote w:id="1">
+    <w:p>
+      <w:pPr>
+        <w:pStyle w:val="FootnoteText"/>
+      </w:pPr>
+      <w:r>
+        <w:rPr>
+          <w:rStyle w:val="FootnoteReference"/>
+        </w:rPr>
+        <w:footnoteRef/>
+      </w:r>
+      <w:r>
+        <w:t xml:space="preserve"> One point to note, BFS can deal with weighted edges, however it will no longer guarantee a shortest path.</w:t>
+      </w:r>
+    </w:p>
+  </w:footnote>
+  <w:footnote w:id="2">
+    <w:p>
+      <w:pPr>
+        <w:pStyle w:val="FootnoteText"/>
+      </w:pPr>
+      <w:r>
+        <w:rPr>
+          <w:rStyle w:val="FootnoteReference"/>
+        </w:rPr>
+        <w:footnoteRef/>
+      </w:r>
+      <w:r>
+        <w:t xml:space="preserve"> </w:t>
+      </w:r>
+      <w:r>
+        <w:t xml:space="preserve">An admissible heuristic is a heuristic function that never overestimates the cost to reach the goal </w:t>
+      </w:r>
+      <w:r>
+        <w:t>from any given state.</w:t>
+      </w:r>
+    </w:p>
+  </w:footnote>
 </w:footnotes>
 </file>
 
@@ -14661,6 +16851,95 @@
     </w:lvl>
   </w:abstractNum>
   <w:abstractNum w:abstractNumId="4" w15:restartNumberingAfterBreak="0">
+    <w:nsid w:val="09746194"/>
+    <w:multiLevelType w:val="hybridMultilevel"/>
+    <w:tmpl w:val="54606C76"/>
+    <w:lvl w:ilvl="0" w:tplc="0809000F">
+      <w:start w:val="1"/>
+      <w:numFmt w:val="decimal"/>
+      <w:lvlText w:val="%1."/>
+      <w:lvlJc w:val="left"/>
+      <w:pPr>
+        <w:ind w:left="720" w:hanging="360"/>
+      </w:pPr>
+      <w:rPr>
+        <w:rFonts w:hint="default"/>
+      </w:rPr>
+    </w:lvl>
+    <w:lvl w:ilvl="1" w:tplc="08090019" w:tentative="1">
+      <w:start w:val="1"/>
+      <w:numFmt w:val="lowerLetter"/>
+      <w:lvlText w:val="%2."/>
+      <w:lvlJc w:val="left"/>
+      <w:pPr>
+        <w:ind w:left="1440" w:hanging="360"/>
+      </w:pPr>
+    </w:lvl>
+    <w:lvl w:ilvl="2" w:tplc="0809001B" w:tentative="1">
+      <w:start w:val="1"/>
+      <w:numFmt w:val="lowerRoman"/>
+      <w:lvlText w:val="%3."/>
+      <w:lvlJc w:val="right"/>
+      <w:pPr>
+        <w:ind w:left="2160" w:hanging="180"/>
+      </w:pPr>
+    </w:lvl>
+    <w:lvl w:ilvl="3" w:tplc="0809000F" w:tentative="1">
+      <w:start w:val="1"/>
+      <w:numFmt w:val="decimal"/>
+      <w:lvlText w:val="%4."/>
+      <w:lvlJc w:val="left"/>
+      <w:pPr>
+        <w:ind w:left="2880" w:hanging="360"/>
+      </w:pPr>
+    </w:lvl>
+    <w:lvl w:ilvl="4" w:tplc="08090019" w:tentative="1">
+      <w:start w:val="1"/>
+      <w:numFmt w:val="lowerLetter"/>
+      <w:lvlText w:val="%5."/>
+      <w:lvlJc w:val="left"/>
+      <w:pPr>
+        <w:ind w:left="3600" w:hanging="360"/>
+      </w:pPr>
+    </w:lvl>
+    <w:lvl w:ilvl="5" w:tplc="0809001B" w:tentative="1">
+      <w:start w:val="1"/>
+      <w:numFmt w:val="lowerRoman"/>
+      <w:lvlText w:val="%6."/>
+      <w:lvlJc w:val="right"/>
+      <w:pPr>
+        <w:ind w:left="4320" w:hanging="180"/>
+      </w:pPr>
+    </w:lvl>
+    <w:lvl w:ilvl="6" w:tplc="0809000F" w:tentative="1">
+      <w:start w:val="1"/>
+      <w:numFmt w:val="decimal"/>
+      <w:lvlText w:val="%7."/>
+      <w:lvlJc w:val="left"/>
+      <w:pPr>
+        <w:ind w:left="5040" w:hanging="360"/>
+      </w:pPr>
+    </w:lvl>
+    <w:lvl w:ilvl="7" w:tplc="08090019" w:tentative="1">
+      <w:start w:val="1"/>
+      <w:numFmt w:val="lowerLetter"/>
+      <w:lvlText w:val="%8."/>
+      <w:lvlJc w:val="left"/>
+      <w:pPr>
+        <w:ind w:left="5760" w:hanging="360"/>
+      </w:pPr>
+    </w:lvl>
+    <w:lvl w:ilvl="8" w:tplc="0809001B" w:tentative="1">
+      <w:start w:val="1"/>
+      <w:numFmt w:val="lowerRoman"/>
+      <w:lvlText w:val="%9."/>
+      <w:lvlJc w:val="right"/>
+      <w:pPr>
+        <w:ind w:left="6480" w:hanging="180"/>
+      </w:pPr>
+    </w:lvl>
+  </w:abstractNum>
+  <w:abstractNum w:abstractNumId="5" w15:restartNumberingAfterBreak="0">
     <w:nsid w:val="09F77F15"/>
     <w:multiLevelType w:val="hybridMultilevel"/>
     <w:tmpl w:val="BBB49E50"/>
@@ -14749,7 +17028,7 @@
       </w:pPr>
     </w:lvl>
   </w:abstractNum>
-  <w:abstractNum w:abstractNumId="5" w15:restartNumberingAfterBreak="0">
+  <w:abstractNum w:abstractNumId="6" w15:restartNumberingAfterBreak="0">
     <w:nsid w:val="0ECF600A"/>
     <w:multiLevelType w:val="hybridMultilevel"/>
     <w:tmpl w:val="5C20C25E"/>
@@ -14861,7 +17140,7 @@
       </w:rPr>
     </w:lvl>
   </w:abstractNum>
-  <w:abstractNum w:abstractNumId="6" w15:restartNumberingAfterBreak="0">
+  <w:abstractNum w:abstractNumId="7" w15:restartNumberingAfterBreak="0">
     <w:nsid w:val="0F026409"/>
     <w:multiLevelType w:val="hybridMultilevel"/>
     <w:tmpl w:val="E9A60840"/>
@@ -14947,7 +17226,7 @@
       </w:pPr>
     </w:lvl>
   </w:abstractNum>
-  <w:abstractNum w:abstractNumId="7" w15:restartNumberingAfterBreak="0">
+  <w:abstractNum w:abstractNumId="8" w15:restartNumberingAfterBreak="0">
     <w:nsid w:val="13637879"/>
     <w:multiLevelType w:val="hybridMultilevel"/>
     <w:tmpl w:val="230AA3FC"/>
@@ -15059,7 +17338,7 @@
       </w:rPr>
     </w:lvl>
   </w:abstractNum>
-  <w:abstractNum w:abstractNumId="8" w15:restartNumberingAfterBreak="0">
+  <w:abstractNum w:abstractNumId="9" w15:restartNumberingAfterBreak="0">
     <w:nsid w:val="14676E3F"/>
     <w:multiLevelType w:val="multilevel"/>
     <w:tmpl w:val="8A44F1BA"/>
@@ -15208,7 +17487,7 @@
       </w:rPr>
     </w:lvl>
   </w:abstractNum>
-  <w:abstractNum w:abstractNumId="9" w15:restartNumberingAfterBreak="0">
+  <w:abstractNum w:abstractNumId="10" w15:restartNumberingAfterBreak="0">
     <w:nsid w:val="1ACA68E9"/>
     <w:multiLevelType w:val="multilevel"/>
     <w:tmpl w:val="0C881550"/>
@@ -15357,7 +17636,7 @@
       </w:rPr>
     </w:lvl>
   </w:abstractNum>
-  <w:abstractNum w:abstractNumId="10" w15:restartNumberingAfterBreak="0">
+  <w:abstractNum w:abstractNumId="11" w15:restartNumberingAfterBreak="0">
     <w:nsid w:val="22497093"/>
     <w:multiLevelType w:val="hybridMultilevel"/>
     <w:tmpl w:val="2050097A"/>
@@ -15469,7 +17748,7 @@
       </w:rPr>
     </w:lvl>
   </w:abstractNum>
-  <w:abstractNum w:abstractNumId="11" w15:restartNumberingAfterBreak="0">
+  <w:abstractNum w:abstractNumId="12" w15:restartNumberingAfterBreak="0">
     <w:nsid w:val="22EE42C4"/>
     <w:multiLevelType w:val="hybridMultilevel"/>
     <w:tmpl w:val="24A2B96C"/>
@@ -15582,7 +17861,7 @@
       </w:rPr>
     </w:lvl>
   </w:abstractNum>
-  <w:abstractNum w:abstractNumId="12" w15:restartNumberingAfterBreak="0">
+  <w:abstractNum w:abstractNumId="13" w15:restartNumberingAfterBreak="0">
     <w:nsid w:val="28AC15F0"/>
     <w:multiLevelType w:val="hybridMultilevel"/>
     <w:tmpl w:val="9FA29186"/>
@@ -15694,7 +17973,7 @@
       </w:rPr>
     </w:lvl>
   </w:abstractNum>
-  <w:abstractNum w:abstractNumId="13" w15:restartNumberingAfterBreak="0">
+  <w:abstractNum w:abstractNumId="14" w15:restartNumberingAfterBreak="0">
     <w:nsid w:val="2A5009E4"/>
     <w:multiLevelType w:val="hybridMultilevel"/>
     <w:tmpl w:val="5C884668"/>
@@ -15807,7 +18086,7 @@
       </w:rPr>
     </w:lvl>
   </w:abstractNum>
-  <w:abstractNum w:abstractNumId="14" w15:restartNumberingAfterBreak="0">
+  <w:abstractNum w:abstractNumId="15" w15:restartNumberingAfterBreak="0">
     <w:nsid w:val="2ECE4495"/>
     <w:multiLevelType w:val="hybridMultilevel"/>
     <w:tmpl w:val="A20A0AA6"/>
@@ -15920,7 +18199,7 @@
       </w:rPr>
     </w:lvl>
   </w:abstractNum>
-  <w:abstractNum w:abstractNumId="15" w15:restartNumberingAfterBreak="0">
+  <w:abstractNum w:abstractNumId="16" w15:restartNumberingAfterBreak="0">
     <w:nsid w:val="328E2E9D"/>
     <w:multiLevelType w:val="hybridMultilevel"/>
     <w:tmpl w:val="5C5A541A"/>
@@ -16032,7 +18311,7 @@
       </w:rPr>
     </w:lvl>
   </w:abstractNum>
-  <w:abstractNum w:abstractNumId="16" w15:restartNumberingAfterBreak="0">
+  <w:abstractNum w:abstractNumId="17" w15:restartNumberingAfterBreak="0">
     <w:nsid w:val="36F876E2"/>
     <w:multiLevelType w:val="hybridMultilevel"/>
     <w:tmpl w:val="2E3E4C24"/>
@@ -16145,7 +18424,7 @@
       </w:rPr>
     </w:lvl>
   </w:abstractNum>
-  <w:abstractNum w:abstractNumId="17" w15:restartNumberingAfterBreak="0">
+  <w:abstractNum w:abstractNumId="18" w15:restartNumberingAfterBreak="0">
     <w:nsid w:val="389E449E"/>
     <w:multiLevelType w:val="multilevel"/>
     <w:tmpl w:val="4522AEA4"/>
@@ -16294,7 +18573,7 @@
       </w:rPr>
     </w:lvl>
   </w:abstractNum>
-  <w:abstractNum w:abstractNumId="18" w15:restartNumberingAfterBreak="0">
+  <w:abstractNum w:abstractNumId="19" w15:restartNumberingAfterBreak="0">
     <w:nsid w:val="39400CB1"/>
     <w:multiLevelType w:val="hybridMultilevel"/>
     <w:tmpl w:val="4C442D10"/>
@@ -16406,7 +18685,7 @@
       </w:rPr>
     </w:lvl>
   </w:abstractNum>
-  <w:abstractNum w:abstractNumId="19" w15:restartNumberingAfterBreak="0">
+  <w:abstractNum w:abstractNumId="20" w15:restartNumberingAfterBreak="0">
     <w:nsid w:val="3A8670A5"/>
     <w:multiLevelType w:val="hybridMultilevel"/>
     <w:tmpl w:val="B2DE7830"/>
@@ -16495,7 +18774,7 @@
       </w:pPr>
     </w:lvl>
   </w:abstractNum>
-  <w:abstractNum w:abstractNumId="20" w15:restartNumberingAfterBreak="0">
+  <w:abstractNum w:abstractNumId="21" w15:restartNumberingAfterBreak="0">
     <w:nsid w:val="3D4C4610"/>
     <w:multiLevelType w:val="hybridMultilevel"/>
     <w:tmpl w:val="AFC6ABD2"/>
@@ -16584,7 +18863,7 @@
       </w:pPr>
     </w:lvl>
   </w:abstractNum>
-  <w:abstractNum w:abstractNumId="21" w15:restartNumberingAfterBreak="0">
+  <w:abstractNum w:abstractNumId="22" w15:restartNumberingAfterBreak="0">
     <w:nsid w:val="4A2822B8"/>
     <w:multiLevelType w:val="hybridMultilevel"/>
     <w:tmpl w:val="DDC0C822"/>
@@ -16673,7 +18952,7 @@
       </w:pPr>
     </w:lvl>
   </w:abstractNum>
-  <w:abstractNum w:abstractNumId="22" w15:restartNumberingAfterBreak="0">
+  <w:abstractNum w:abstractNumId="23" w15:restartNumberingAfterBreak="0">
     <w:nsid w:val="4F925D47"/>
     <w:multiLevelType w:val="hybridMultilevel"/>
     <w:tmpl w:val="15060676"/>
@@ -16786,7 +19065,7 @@
       </w:rPr>
     </w:lvl>
   </w:abstractNum>
-  <w:abstractNum w:abstractNumId="23" w15:restartNumberingAfterBreak="0">
+  <w:abstractNum w:abstractNumId="24" w15:restartNumberingAfterBreak="0">
     <w:nsid w:val="53494EAF"/>
     <w:multiLevelType w:val="hybridMultilevel"/>
     <w:tmpl w:val="36A6EEA0"/>
@@ -16898,7 +19177,7 @@
       </w:rPr>
     </w:lvl>
   </w:abstractNum>
-  <w:abstractNum w:abstractNumId="24" w15:restartNumberingAfterBreak="0">
+  <w:abstractNum w:abstractNumId="25" w15:restartNumberingAfterBreak="0">
     <w:nsid w:val="55C11DAD"/>
     <w:multiLevelType w:val="multilevel"/>
     <w:tmpl w:val="53E26768"/>
@@ -17047,7 +19326,7 @@
       </w:rPr>
     </w:lvl>
   </w:abstractNum>
-  <w:abstractNum w:abstractNumId="25" w15:restartNumberingAfterBreak="0">
+  <w:abstractNum w:abstractNumId="26" w15:restartNumberingAfterBreak="0">
     <w:nsid w:val="57731A55"/>
     <w:multiLevelType w:val="hybridMultilevel"/>
     <w:tmpl w:val="6C22D1EC"/>
@@ -17136,7 +19415,7 @@
       </w:pPr>
     </w:lvl>
   </w:abstractNum>
-  <w:abstractNum w:abstractNumId="26" w15:restartNumberingAfterBreak="0">
+  <w:abstractNum w:abstractNumId="27" w15:restartNumberingAfterBreak="0">
     <w:nsid w:val="58324856"/>
     <w:multiLevelType w:val="multilevel"/>
     <w:tmpl w:val="7CBA8BEA"/>
@@ -17285,7 +19564,7 @@
       </w:rPr>
     </w:lvl>
   </w:abstractNum>
-  <w:abstractNum w:abstractNumId="27" w15:restartNumberingAfterBreak="0">
+  <w:abstractNum w:abstractNumId="28" w15:restartNumberingAfterBreak="0">
     <w:nsid w:val="5AE37F1F"/>
     <w:multiLevelType w:val="hybridMultilevel"/>
     <w:tmpl w:val="53B0DF1E"/>
@@ -17397,7 +19676,7 @@
       </w:rPr>
     </w:lvl>
   </w:abstractNum>
-  <w:abstractNum w:abstractNumId="28" w15:restartNumberingAfterBreak="0">
+  <w:abstractNum w:abstractNumId="29" w15:restartNumberingAfterBreak="0">
     <w:nsid w:val="5C363D5D"/>
     <w:multiLevelType w:val="hybridMultilevel"/>
     <w:tmpl w:val="8F02E77E"/>
@@ -17509,7 +19788,7 @@
       </w:rPr>
     </w:lvl>
   </w:abstractNum>
-  <w:abstractNum w:abstractNumId="29" w15:restartNumberingAfterBreak="0">
+  <w:abstractNum w:abstractNumId="30" w15:restartNumberingAfterBreak="0">
     <w:nsid w:val="5E0A6939"/>
     <w:multiLevelType w:val="hybridMultilevel"/>
     <w:tmpl w:val="DB54D198"/>
@@ -17622,7 +19901,7 @@
       </w:rPr>
     </w:lvl>
   </w:abstractNum>
-  <w:abstractNum w:abstractNumId="30" w15:restartNumberingAfterBreak="0">
+  <w:abstractNum w:abstractNumId="31" w15:restartNumberingAfterBreak="0">
     <w:nsid w:val="61F07C10"/>
     <w:multiLevelType w:val="hybridMultilevel"/>
     <w:tmpl w:val="89421372"/>
@@ -17734,7 +20013,7 @@
       </w:rPr>
     </w:lvl>
   </w:abstractNum>
-  <w:abstractNum w:abstractNumId="31" w15:restartNumberingAfterBreak="0">
+  <w:abstractNum w:abstractNumId="32" w15:restartNumberingAfterBreak="0">
     <w:nsid w:val="73CA5EBE"/>
     <w:multiLevelType w:val="hybridMultilevel"/>
     <w:tmpl w:val="D1F2EE14"/>
@@ -17846,7 +20125,7 @@
       </w:rPr>
     </w:lvl>
   </w:abstractNum>
-  <w:abstractNum w:abstractNumId="32" w15:restartNumberingAfterBreak="0">
+  <w:abstractNum w:abstractNumId="33" w15:restartNumberingAfterBreak="0">
     <w:nsid w:val="742F0C11"/>
     <w:multiLevelType w:val="hybridMultilevel"/>
     <w:tmpl w:val="2286DAD6"/>
@@ -17958,7 +20237,7 @@
       </w:rPr>
     </w:lvl>
   </w:abstractNum>
-  <w:abstractNum w:abstractNumId="33" w15:restartNumberingAfterBreak="0">
+  <w:abstractNum w:abstractNumId="34" w15:restartNumberingAfterBreak="0">
     <w:nsid w:val="744D7415"/>
     <w:multiLevelType w:val="hybridMultilevel"/>
     <w:tmpl w:val="9056A4DE"/>
@@ -18047,7 +20326,96 @@
       </w:pPr>
     </w:lvl>
   </w:abstractNum>
-  <w:abstractNum w:abstractNumId="34" w15:restartNumberingAfterBreak="0">
+  <w:abstractNum w:abstractNumId="35" w15:restartNumberingAfterBreak="0">
+    <w:nsid w:val="7BBF2FD7"/>
+    <w:multiLevelType w:val="multilevel"/>
+    <w:tmpl w:val="0809001F"/>
+    <w:lvl w:ilvl="0">
+      <w:start w:val="1"/>
+      <w:numFmt w:val="decimal"/>
+      <w:lvlText w:val="%1."/>
+      <w:lvlJc w:val="left"/>
+      <w:pPr>
+        <w:ind w:left="360" w:hanging="360"/>
+      </w:pPr>
+      <w:rPr>
+        <w:rFonts w:hint="default"/>
+      </w:rPr>
+    </w:lvl>
+    <w:lvl w:ilvl="1">
+      <w:start w:val="1"/>
+      <w:numFmt w:val="decimal"/>
+      <w:lvlText w:val="%1.%2."/>
+      <w:lvlJc w:val="left"/>
+      <w:pPr>
+        <w:ind w:left="792" w:hanging="432"/>
+      </w:pPr>
+    </w:lvl>
+    <w:lvl w:ilvl="2">
+      <w:start w:val="1"/>
+      <w:numFmt w:val="decimal"/>
+      <w:lvlText w:val="%1.%2.%3."/>
+      <w:lvlJc w:val="left"/>
+      <w:pPr>
+        <w:ind w:left="1224" w:hanging="504"/>
+      </w:pPr>
+    </w:lvl>
+    <w:lvl w:ilvl="3">
+      <w:start w:val="1"/>
+      <w:numFmt w:val="decimal"/>
+      <w:lvlText w:val="%1.%2.%3.%4."/>
+      <w:lvlJc w:val="left"/>
+      <w:pPr>
+        <w:ind w:left="1728" w:hanging="648"/>
+      </w:pPr>
+    </w:lvl>
+    <w:lvl w:ilvl="4">
+      <w:start w:val="1"/>
+      <w:numFmt w:val="decimal"/>
+      <w:lvlText w:val="%1.%2.%3.%4.%5."/>
+      <w:lvlJc w:val="left"/>
+      <w:pPr>
+        <w:ind w:left="2232" w:hanging="792"/>
+      </w:pPr>
+    </w:lvl>
+    <w:lvl w:ilvl="5">
+      <w:start w:val="1"/>
+      <w:numFmt w:val="decimal"/>
+      <w:lvlText w:val="%1.%2.%3.%4.%5.%6."/>
+      <w:lvlJc w:val="left"/>
+      <w:pPr>
+        <w:ind w:left="2736" w:hanging="936"/>
+      </w:pPr>
+    </w:lvl>
+    <w:lvl w:ilvl="6">
+      <w:start w:val="1"/>
+      <w:numFmt w:val="decimal"/>
+      <w:lvlText w:val="%1.%2.%3.%4.%5.%6.%7."/>
+      <w:lvlJc w:val="left"/>
+      <w:pPr>
+        <w:ind w:left="3240" w:hanging="1080"/>
+      </w:pPr>
+    </w:lvl>
+    <w:lvl w:ilvl="7">
+      <w:start w:val="1"/>
+      <w:numFmt w:val="decimal"/>
+      <w:lvlText w:val="%1.%2.%3.%4.%5.%6.%7.%8."/>
+      <w:lvlJc w:val="left"/>
+      <w:pPr>
+        <w:ind w:left="3744" w:hanging="1224"/>
+      </w:pPr>
+    </w:lvl>
+    <w:lvl w:ilvl="8">
+      <w:start w:val="1"/>
+      <w:numFmt w:val="decimal"/>
+      <w:lvlText w:val="%1.%2.%3.%4.%5.%6.%7.%8.%9."/>
+      <w:lvlJc w:val="left"/>
+      <w:pPr>
+        <w:ind w:left="4320" w:hanging="1440"/>
+      </w:pPr>
+    </w:lvl>
+  </w:abstractNum>
+  <w:abstractNum w:abstractNumId="36" w15:restartNumberingAfterBreak="0">
     <w:nsid w:val="7CB20988"/>
     <w:multiLevelType w:val="hybridMultilevel"/>
     <w:tmpl w:val="CDA83D7C"/>
@@ -18159,7 +20527,7 @@
       </w:rPr>
     </w:lvl>
   </w:abstractNum>
-  <w:abstractNum w:abstractNumId="35" w15:restartNumberingAfterBreak="0">
+  <w:abstractNum w:abstractNumId="37" w15:restartNumberingAfterBreak="0">
     <w:nsid w:val="7D53300E"/>
     <w:multiLevelType w:val="multilevel"/>
     <w:tmpl w:val="955C97B2"/>
@@ -18309,112 +20677,118 @@
     </w:lvl>
   </w:abstractNum>
   <w:num w:numId="1" w16cid:durableId="1840853912">
-    <w:abstractNumId w:val="23"/>
+    <w:abstractNumId w:val="24"/>
   </w:num>
   <w:num w:numId="2" w16cid:durableId="511725642">
+    <w:abstractNumId w:val="31"/>
+  </w:num>
+  <w:num w:numId="3" w16cid:durableId="142895473">
+    <w:abstractNumId w:val="32"/>
+  </w:num>
+  <w:num w:numId="4" w16cid:durableId="1588728674">
+    <w:abstractNumId w:val="29"/>
+  </w:num>
+  <w:num w:numId="5" w16cid:durableId="1831825105">
+    <w:abstractNumId w:val="6"/>
+  </w:num>
+  <w:num w:numId="6" w16cid:durableId="1742219373">
+    <w:abstractNumId w:val="11"/>
+  </w:num>
+  <w:num w:numId="7" w16cid:durableId="1320306920">
+    <w:abstractNumId w:val="13"/>
+  </w:num>
+  <w:num w:numId="8" w16cid:durableId="1398087037">
+    <w:abstractNumId w:val="33"/>
+  </w:num>
+  <w:num w:numId="9" w16cid:durableId="2129662423">
+    <w:abstractNumId w:val="8"/>
+  </w:num>
+  <w:num w:numId="10" w16cid:durableId="1233350494">
+    <w:abstractNumId w:val="19"/>
+  </w:num>
+  <w:num w:numId="11" w16cid:durableId="375160590">
+    <w:abstractNumId w:val="7"/>
+  </w:num>
+  <w:num w:numId="12" w16cid:durableId="810752444">
+    <w:abstractNumId w:val="36"/>
+  </w:num>
+  <w:num w:numId="13" w16cid:durableId="136993996">
+    <w:abstractNumId w:val="28"/>
+  </w:num>
+  <w:num w:numId="14" w16cid:durableId="1377925727">
+    <w:abstractNumId w:val="34"/>
+  </w:num>
+  <w:num w:numId="15" w16cid:durableId="2111005022">
+    <w:abstractNumId w:val="15"/>
+  </w:num>
+  <w:num w:numId="16" w16cid:durableId="10182370">
     <w:abstractNumId w:val="30"/>
   </w:num>
-  <w:num w:numId="3" w16cid:durableId="142895473">
-    <w:abstractNumId w:val="31"/>
-  </w:num>
-  <w:num w:numId="4" w16cid:durableId="1588728674">
-    <w:abstractNumId w:val="28"/>
-  </w:num>
-  <w:num w:numId="5" w16cid:durableId="1831825105">
-    <w:abstractNumId w:val="5"/>
-  </w:num>
-  <w:num w:numId="6" w16cid:durableId="1742219373">
-    <w:abstractNumId w:val="10"/>
-  </w:num>
-  <w:num w:numId="7" w16cid:durableId="1320306920">
+  <w:num w:numId="17" w16cid:durableId="1013261301">
     <w:abstractNumId w:val="12"/>
   </w:num>
-  <w:num w:numId="8" w16cid:durableId="1398087037">
-    <w:abstractNumId w:val="32"/>
+  <w:num w:numId="18" w16cid:durableId="1680159264">
+    <w:abstractNumId w:val="17"/>
   </w:num>
-  <w:num w:numId="9" w16cid:durableId="2129662423">
-    <w:abstractNumId w:val="7"/>
-  </w:num>
-  <w:num w:numId="10" w16cid:durableId="1233350494">
-    <w:abstractNumId w:val="18"/>
-  </w:num>
-  <w:num w:numId="11" w16cid:durableId="375160590">
-    <w:abstractNumId w:val="6"/>
-  </w:num>
-  <w:num w:numId="12" w16cid:durableId="810752444">
-    <w:abstractNumId w:val="34"/>
-  </w:num>
-  <w:num w:numId="13" w16cid:durableId="136993996">
-    <w:abstractNumId w:val="27"/>
-  </w:num>
-  <w:num w:numId="14" w16cid:durableId="1377925727">
-    <w:abstractNumId w:val="33"/>
-  </w:num>
-  <w:num w:numId="15" w16cid:durableId="2111005022">
+  <w:num w:numId="19" w16cid:durableId="1349798310">
     <w:abstractNumId w:val="14"/>
   </w:num>
-  <w:num w:numId="16" w16cid:durableId="10182370">
-    <w:abstractNumId w:val="29"/>
-  </w:num>
-  <w:num w:numId="17" w16cid:durableId="1013261301">
-    <w:abstractNumId w:val="11"/>
-  </w:num>
-  <w:num w:numId="18" w16cid:durableId="1680159264">
-    <w:abstractNumId w:val="16"/>
-  </w:num>
-  <w:num w:numId="19" w16cid:durableId="1349798310">
-    <w:abstractNumId w:val="13"/>
-  </w:num>
   <w:num w:numId="20" w16cid:durableId="1353260193">
-    <w:abstractNumId w:val="24"/>
+    <w:abstractNumId w:val="25"/>
   </w:num>
   <w:num w:numId="21" w16cid:durableId="2044205957">
-    <w:abstractNumId w:val="8"/>
+    <w:abstractNumId w:val="9"/>
   </w:num>
   <w:num w:numId="22" w16cid:durableId="1482694106">
     <w:abstractNumId w:val="0"/>
   </w:num>
   <w:num w:numId="23" w16cid:durableId="247815031">
-    <w:abstractNumId w:val="26"/>
+    <w:abstractNumId w:val="27"/>
   </w:num>
   <w:num w:numId="24" w16cid:durableId="2013483136">
-    <w:abstractNumId w:val="9"/>
+    <w:abstractNumId w:val="10"/>
   </w:num>
   <w:num w:numId="25" w16cid:durableId="111214901">
-    <w:abstractNumId w:val="35"/>
+    <w:abstractNumId w:val="37"/>
   </w:num>
   <w:num w:numId="26" w16cid:durableId="1923223186">
     <w:abstractNumId w:val="3"/>
   </w:num>
   <w:num w:numId="27" w16cid:durableId="524515118">
-    <w:abstractNumId w:val="17"/>
+    <w:abstractNumId w:val="18"/>
   </w:num>
   <w:num w:numId="28" w16cid:durableId="1144154787">
-    <w:abstractNumId w:val="15"/>
+    <w:abstractNumId w:val="16"/>
   </w:num>
   <w:num w:numId="29" w16cid:durableId="1082414444">
-    <w:abstractNumId w:val="4"/>
+    <w:abstractNumId w:val="5"/>
   </w:num>
   <w:num w:numId="30" w16cid:durableId="1230187937">
-    <w:abstractNumId w:val="25"/>
+    <w:abstractNumId w:val="26"/>
   </w:num>
   <w:num w:numId="31" w16cid:durableId="516039507">
-    <w:abstractNumId w:val="19"/>
+    <w:abstractNumId w:val="20"/>
   </w:num>
   <w:num w:numId="32" w16cid:durableId="138497769">
     <w:abstractNumId w:val="2"/>
   </w:num>
   <w:num w:numId="33" w16cid:durableId="257564362">
-    <w:abstractNumId w:val="21"/>
+    <w:abstractNumId w:val="22"/>
   </w:num>
   <w:num w:numId="34" w16cid:durableId="1421684546">
-    <w:abstractNumId w:val="22"/>
+    <w:abstractNumId w:val="23"/>
   </w:num>
   <w:num w:numId="35" w16cid:durableId="54856472">
-    <w:abstractNumId w:val="20"/>
+    <w:abstractNumId w:val="21"/>
   </w:num>
   <w:num w:numId="36" w16cid:durableId="1330014515">
     <w:abstractNumId w:val="1"/>
+  </w:num>
+  <w:num w:numId="37" w16cid:durableId="366756475">
+    <w:abstractNumId w:val="4"/>
+  </w:num>
+  <w:num w:numId="38" w16cid:durableId="833572215">
+    <w:abstractNumId w:val="35"/>
   </w:num>
 </w:numbering>
 </file>
@@ -18829,10 +21203,10 @@
     <w:link w:val="Heading1Char"/>
     <w:uiPriority w:val="9"/>
     <w:qFormat/>
-    <w:rsid w:val="00EE7D05"/>
+    <w:rsid w:val="000B421C"/>
     <w:pPr>
       <w:spacing w:before="300" w:after="40"/>
-      <w:jc w:val="left"/>
+      <w:jc w:val="center"/>
       <w:outlineLvl w:val="0"/>
     </w:pPr>
     <w:rPr>
@@ -18840,8 +21214,8 @@
       <w:bCs/>
       <w:smallCaps/>
       <w:spacing w:val="5"/>
-      <w:sz w:val="40"/>
-      <w:szCs w:val="40"/>
+      <w:sz w:val="96"/>
+      <w:szCs w:val="96"/>
     </w:rPr>
   </w:style>
   <w:style w:type="paragraph" w:styleId="Heading2">
@@ -19061,14 +21435,14 @@
     <w:basedOn w:val="DefaultParagraphFont"/>
     <w:link w:val="Heading1"/>
     <w:uiPriority w:val="9"/>
-    <w:rsid w:val="00EE7D05"/>
+    <w:rsid w:val="000B421C"/>
     <w:rPr>
       <w:b/>
       <w:bCs/>
       <w:smallCaps/>
       <w:spacing w:val="5"/>
-      <w:sz w:val="40"/>
-      <w:szCs w:val="40"/>
+      <w:sz w:val="96"/>
+      <w:szCs w:val="96"/>
     </w:rPr>
   </w:style>
   <w:style w:type="character" w:customStyle="1" w:styleId="Heading2Char">
@@ -19817,6 +22191,18 @@
     <w:rsid w:val="002D78E5"/>
     <w:rPr>
       <w:vertAlign w:val="superscript"/>
+    </w:rPr>
+  </w:style>
+  <w:style w:type="character" w:styleId="FollowedHyperlink">
+    <w:name w:val="FollowedHyperlink"/>
+    <w:basedOn w:val="DefaultParagraphFont"/>
+    <w:uiPriority w:val="99"/>
+    <w:semiHidden/>
+    <w:unhideWhenUsed/>
+    <w:rsid w:val="00E7160E"/>
+    <w:rPr>
+      <w:color w:val="977B2D" w:themeColor="followedHyperlink"/>
+      <w:u w:val="single"/>
     </w:rPr>
   </w:style>
 </w:styles>

</xml_diff>

<commit_message>
feat: add zoom and pan to grid panel; feat: add drag placement
</commit_message>
<xml_diff>
--- a/Project Report.docx
+++ b/Project Report.docx
@@ -241,7 +241,7 @@
           <w:r>
             <w:fldChar w:fldCharType="separate"/>
           </w:r>
-          <w:hyperlink w:anchor="_Toc224063971" w:history="1">
+          <w:hyperlink w:anchor="_Toc224288343" w:history="1">
             <w:r>
               <w:rPr>
                 <w:rStyle w:val="Hyperlink"/>
@@ -268,7 +268,7 @@
                 <w:noProof/>
                 <w:webHidden/>
               </w:rPr>
-              <w:instrText xml:space="preserve"> PAGEREF _Toc224063971 \h </w:instrText>
+              <w:instrText xml:space="preserve"> PAGEREF _Toc224288343 \h </w:instrText>
             </w:r>
             <w:r>
               <w:rPr>
@@ -312,7 +312,7 @@
               <w14:ligatures w14:val="standardContextual"/>
             </w:rPr>
           </w:pPr>
-          <w:hyperlink w:anchor="_Toc224063972" w:history="1">
+          <w:hyperlink w:anchor="_Toc224288344" w:history="1">
             <w:r>
               <w:rPr>
                 <w:rStyle w:val="Hyperlink"/>
@@ -339,7 +339,7 @@
                 <w:noProof/>
                 <w:webHidden/>
               </w:rPr>
-              <w:instrText xml:space="preserve"> PAGEREF _Toc224063972 \h </w:instrText>
+              <w:instrText xml:space="preserve"> PAGEREF _Toc224288344 \h </w:instrText>
             </w:r>
             <w:r>
               <w:rPr>
@@ -383,7 +383,7 @@
               <w14:ligatures w14:val="standardContextual"/>
             </w:rPr>
           </w:pPr>
-          <w:hyperlink w:anchor="_Toc224063973" w:history="1">
+          <w:hyperlink w:anchor="_Toc224288345" w:history="1">
             <w:r>
               <w:rPr>
                 <w:rStyle w:val="Hyperlink"/>
@@ -410,7 +410,7 @@
                 <w:noProof/>
                 <w:webHidden/>
               </w:rPr>
-              <w:instrText xml:space="preserve"> PAGEREF _Toc224063973 \h </w:instrText>
+              <w:instrText xml:space="preserve"> PAGEREF _Toc224288345 \h </w:instrText>
             </w:r>
             <w:r>
               <w:rPr>
@@ -454,7 +454,7 @@
               <w14:ligatures w14:val="standardContextual"/>
             </w:rPr>
           </w:pPr>
-          <w:hyperlink w:anchor="_Toc224063974" w:history="1">
+          <w:hyperlink w:anchor="_Toc224288346" w:history="1">
             <w:r>
               <w:rPr>
                 <w:rStyle w:val="Hyperlink"/>
@@ -481,7 +481,7 @@
                 <w:noProof/>
                 <w:webHidden/>
               </w:rPr>
-              <w:instrText xml:space="preserve"> PAGEREF _Toc224063974 \h </w:instrText>
+              <w:instrText xml:space="preserve"> PAGEREF _Toc224288346 \h </w:instrText>
             </w:r>
             <w:r>
               <w:rPr>
@@ -525,7 +525,7 @@
               <w14:ligatures w14:val="standardContextual"/>
             </w:rPr>
           </w:pPr>
-          <w:hyperlink w:anchor="_Toc224063975" w:history="1">
+          <w:hyperlink w:anchor="_Toc224288347" w:history="1">
             <w:r>
               <w:rPr>
                 <w:rStyle w:val="Hyperlink"/>
@@ -552,7 +552,7 @@
                 <w:noProof/>
                 <w:webHidden/>
               </w:rPr>
-              <w:instrText xml:space="preserve"> PAGEREF _Toc224063975 \h </w:instrText>
+              <w:instrText xml:space="preserve"> PAGEREF _Toc224288347 \h </w:instrText>
             </w:r>
             <w:r>
               <w:rPr>
@@ -596,7 +596,7 @@
               <w14:ligatures w14:val="standardContextual"/>
             </w:rPr>
           </w:pPr>
-          <w:hyperlink w:anchor="_Toc224063976" w:history="1">
+          <w:hyperlink w:anchor="_Toc224288348" w:history="1">
             <w:r>
               <w:rPr>
                 <w:rStyle w:val="Hyperlink"/>
@@ -623,7 +623,7 @@
                 <w:noProof/>
                 <w:webHidden/>
               </w:rPr>
-              <w:instrText xml:space="preserve"> PAGEREF _Toc224063976 \h </w:instrText>
+              <w:instrText xml:space="preserve"> PAGEREF _Toc224288348 \h </w:instrText>
             </w:r>
             <w:r>
               <w:rPr>
@@ -667,7 +667,7 @@
               <w14:ligatures w14:val="standardContextual"/>
             </w:rPr>
           </w:pPr>
-          <w:hyperlink w:anchor="_Toc224063977" w:history="1">
+          <w:hyperlink w:anchor="_Toc224288349" w:history="1">
             <w:r>
               <w:rPr>
                 <w:rStyle w:val="Hyperlink"/>
@@ -694,7 +694,7 @@
                 <w:noProof/>
                 <w:webHidden/>
               </w:rPr>
-              <w:instrText xml:space="preserve"> PAGEREF _Toc224063977 \h </w:instrText>
+              <w:instrText xml:space="preserve"> PAGEREF _Toc224288349 \h </w:instrText>
             </w:r>
             <w:r>
               <w:rPr>
@@ -738,7 +738,7 @@
               <w14:ligatures w14:val="standardContextual"/>
             </w:rPr>
           </w:pPr>
-          <w:hyperlink w:anchor="_Toc224063978" w:history="1">
+          <w:hyperlink w:anchor="_Toc224288350" w:history="1">
             <w:r>
               <w:rPr>
                 <w:rStyle w:val="Hyperlink"/>
@@ -765,7 +765,7 @@
                 <w:noProof/>
                 <w:webHidden/>
               </w:rPr>
-              <w:instrText xml:space="preserve"> PAGEREF _Toc224063978 \h </w:instrText>
+              <w:instrText xml:space="preserve"> PAGEREF _Toc224288350 \h </w:instrText>
             </w:r>
             <w:r>
               <w:rPr>
@@ -809,7 +809,7 @@
               <w14:ligatures w14:val="standardContextual"/>
             </w:rPr>
           </w:pPr>
-          <w:hyperlink w:anchor="_Toc224063979" w:history="1">
+          <w:hyperlink w:anchor="_Toc224288351" w:history="1">
             <w:r>
               <w:rPr>
                 <w:rStyle w:val="Hyperlink"/>
@@ -836,7 +836,7 @@
                 <w:noProof/>
                 <w:webHidden/>
               </w:rPr>
-              <w:instrText xml:space="preserve"> PAGEREF _Toc224063979 \h </w:instrText>
+              <w:instrText xml:space="preserve"> PAGEREF _Toc224288351 \h </w:instrText>
             </w:r>
             <w:r>
               <w:rPr>
@@ -880,7 +880,7 @@
               <w14:ligatures w14:val="standardContextual"/>
             </w:rPr>
           </w:pPr>
-          <w:hyperlink w:anchor="_Toc224063980" w:history="1">
+          <w:hyperlink w:anchor="_Toc224288352" w:history="1">
             <w:r>
               <w:rPr>
                 <w:rStyle w:val="Hyperlink"/>
@@ -907,7 +907,7 @@
                 <w:noProof/>
                 <w:webHidden/>
               </w:rPr>
-              <w:instrText xml:space="preserve"> PAGEREF _Toc224063980 \h </w:instrText>
+              <w:instrText xml:space="preserve"> PAGEREF _Toc224288352 \h </w:instrText>
             </w:r>
             <w:r>
               <w:rPr>
@@ -951,7 +951,7 @@
               <w14:ligatures w14:val="standardContextual"/>
             </w:rPr>
           </w:pPr>
-          <w:hyperlink w:anchor="_Toc224063981" w:history="1">
+          <w:hyperlink w:anchor="_Toc224288353" w:history="1">
             <w:r>
               <w:rPr>
                 <w:rStyle w:val="Hyperlink"/>
@@ -978,7 +978,7 @@
                 <w:noProof/>
                 <w:webHidden/>
               </w:rPr>
-              <w:instrText xml:space="preserve"> PAGEREF _Toc224063981 \h </w:instrText>
+              <w:instrText xml:space="preserve"> PAGEREF _Toc224288353 \h </w:instrText>
             </w:r>
             <w:r>
               <w:rPr>
@@ -1022,7 +1022,7 @@
               <w14:ligatures w14:val="standardContextual"/>
             </w:rPr>
           </w:pPr>
-          <w:hyperlink w:anchor="_Toc224063982" w:history="1">
+          <w:hyperlink w:anchor="_Toc224288354" w:history="1">
             <w:r>
               <w:rPr>
                 <w:rStyle w:val="Hyperlink"/>
@@ -1049,7 +1049,7 @@
                 <w:noProof/>
                 <w:webHidden/>
               </w:rPr>
-              <w:instrText xml:space="preserve"> PAGEREF _Toc224063982 \h </w:instrText>
+              <w:instrText xml:space="preserve"> PAGEREF _Toc224288354 \h </w:instrText>
             </w:r>
             <w:r>
               <w:rPr>
@@ -1093,7 +1093,7 @@
               <w14:ligatures w14:val="standardContextual"/>
             </w:rPr>
           </w:pPr>
-          <w:hyperlink w:anchor="_Toc224063983" w:history="1">
+          <w:hyperlink w:anchor="_Toc224288355" w:history="1">
             <w:r>
               <w:rPr>
                 <w:rStyle w:val="Hyperlink"/>
@@ -1120,7 +1120,7 @@
                 <w:noProof/>
                 <w:webHidden/>
               </w:rPr>
-              <w:instrText xml:space="preserve"> PAGEREF _Toc224063983 \h </w:instrText>
+              <w:instrText xml:space="preserve"> PAGEREF _Toc224288355 \h </w:instrText>
             </w:r>
             <w:r>
               <w:rPr>
@@ -1164,7 +1164,7 @@
               <w14:ligatures w14:val="standardContextual"/>
             </w:rPr>
           </w:pPr>
-          <w:hyperlink w:anchor="_Toc224063984" w:history="1">
+          <w:hyperlink w:anchor="_Toc224288356" w:history="1">
             <w:r>
               <w:rPr>
                 <w:rStyle w:val="Hyperlink"/>
@@ -1191,7 +1191,7 @@
                 <w:noProof/>
                 <w:webHidden/>
               </w:rPr>
-              <w:instrText xml:space="preserve"> PAGEREF _Toc224063984 \h </w:instrText>
+              <w:instrText xml:space="preserve"> PAGEREF _Toc224288356 \h </w:instrText>
             </w:r>
             <w:r>
               <w:rPr>
@@ -1235,7 +1235,7 @@
               <w14:ligatures w14:val="standardContextual"/>
             </w:rPr>
           </w:pPr>
-          <w:hyperlink w:anchor="_Toc224063985" w:history="1">
+          <w:hyperlink w:anchor="_Toc224288357" w:history="1">
             <w:r>
               <w:rPr>
                 <w:rStyle w:val="Hyperlink"/>
@@ -1262,7 +1262,7 @@
                 <w:noProof/>
                 <w:webHidden/>
               </w:rPr>
-              <w:instrText xml:space="preserve"> PAGEREF _Toc224063985 \h </w:instrText>
+              <w:instrText xml:space="preserve"> PAGEREF _Toc224288357 \h </w:instrText>
             </w:r>
             <w:r>
               <w:rPr>
@@ -1306,7 +1306,7 @@
               <w14:ligatures w14:val="standardContextual"/>
             </w:rPr>
           </w:pPr>
-          <w:hyperlink w:anchor="_Toc224063986" w:history="1">
+          <w:hyperlink w:anchor="_Toc224288358" w:history="1">
             <w:r>
               <w:rPr>
                 <w:rStyle w:val="Hyperlink"/>
@@ -1333,7 +1333,7 @@
                 <w:noProof/>
                 <w:webHidden/>
               </w:rPr>
-              <w:instrText xml:space="preserve"> PAGEREF _Toc224063986 \h </w:instrText>
+              <w:instrText xml:space="preserve"> PAGEREF _Toc224288358 \h </w:instrText>
             </w:r>
             <w:r>
               <w:rPr>
@@ -1377,7 +1377,7 @@
               <w14:ligatures w14:val="standardContextual"/>
             </w:rPr>
           </w:pPr>
-          <w:hyperlink w:anchor="_Toc224063987" w:history="1">
+          <w:hyperlink w:anchor="_Toc224288359" w:history="1">
             <w:r>
               <w:rPr>
                 <w:rStyle w:val="Hyperlink"/>
@@ -1404,7 +1404,7 @@
                 <w:noProof/>
                 <w:webHidden/>
               </w:rPr>
-              <w:instrText xml:space="preserve"> PAGEREF _Toc224063987 \h </w:instrText>
+              <w:instrText xml:space="preserve"> PAGEREF _Toc224288359 \h </w:instrText>
             </w:r>
             <w:r>
               <w:rPr>
@@ -1448,7 +1448,7 @@
               <w14:ligatures w14:val="standardContextual"/>
             </w:rPr>
           </w:pPr>
-          <w:hyperlink w:anchor="_Toc224063988" w:history="1">
+          <w:hyperlink w:anchor="_Toc224288360" w:history="1">
             <w:r>
               <w:rPr>
                 <w:rStyle w:val="Hyperlink"/>
@@ -1475,7 +1475,7 @@
                 <w:noProof/>
                 <w:webHidden/>
               </w:rPr>
-              <w:instrText xml:space="preserve"> PAGEREF _Toc224063988 \h </w:instrText>
+              <w:instrText xml:space="preserve"> PAGEREF _Toc224288360 \h </w:instrText>
             </w:r>
             <w:r>
               <w:rPr>
@@ -1519,7 +1519,7 @@
               <w14:ligatures w14:val="standardContextual"/>
             </w:rPr>
           </w:pPr>
-          <w:hyperlink w:anchor="_Toc224063989" w:history="1">
+          <w:hyperlink w:anchor="_Toc224288361" w:history="1">
             <w:r>
               <w:rPr>
                 <w:rStyle w:val="Hyperlink"/>
@@ -1546,7 +1546,7 @@
                 <w:noProof/>
                 <w:webHidden/>
               </w:rPr>
-              <w:instrText xml:space="preserve"> PAGEREF _Toc224063989 \h </w:instrText>
+              <w:instrText xml:space="preserve"> PAGEREF _Toc224288361 \h </w:instrText>
             </w:r>
             <w:r>
               <w:rPr>
@@ -1590,7 +1590,7 @@
               <w14:ligatures w14:val="standardContextual"/>
             </w:rPr>
           </w:pPr>
-          <w:hyperlink w:anchor="_Toc224063990" w:history="1">
+          <w:hyperlink w:anchor="_Toc224288362" w:history="1">
             <w:r>
               <w:rPr>
                 <w:rStyle w:val="Hyperlink"/>
@@ -1617,7 +1617,7 @@
                 <w:noProof/>
                 <w:webHidden/>
               </w:rPr>
-              <w:instrText xml:space="preserve"> PAGEREF _Toc224063990 \h </w:instrText>
+              <w:instrText xml:space="preserve"> PAGEREF _Toc224288362 \h </w:instrText>
             </w:r>
             <w:r>
               <w:rPr>
@@ -1661,7 +1661,7 @@
               <w14:ligatures w14:val="standardContextual"/>
             </w:rPr>
           </w:pPr>
-          <w:hyperlink w:anchor="_Toc224063991" w:history="1">
+          <w:hyperlink w:anchor="_Toc224288363" w:history="1">
             <w:r>
               <w:rPr>
                 <w:rStyle w:val="Hyperlink"/>
@@ -1688,7 +1688,7 @@
                 <w:noProof/>
                 <w:webHidden/>
               </w:rPr>
-              <w:instrText xml:space="preserve"> PAGEREF _Toc224063991 \h </w:instrText>
+              <w:instrText xml:space="preserve"> PAGEREF _Toc224288363 \h </w:instrText>
             </w:r>
             <w:r>
               <w:rPr>
@@ -1732,7 +1732,7 @@
               <w14:ligatures w14:val="standardContextual"/>
             </w:rPr>
           </w:pPr>
-          <w:hyperlink w:anchor="_Toc224063992" w:history="1">
+          <w:hyperlink w:anchor="_Toc224288364" w:history="1">
             <w:r>
               <w:rPr>
                 <w:rStyle w:val="Hyperlink"/>
@@ -1759,7 +1759,7 @@
                 <w:noProof/>
                 <w:webHidden/>
               </w:rPr>
-              <w:instrText xml:space="preserve"> PAGEREF _Toc224063992 \h </w:instrText>
+              <w:instrText xml:space="preserve"> PAGEREF _Toc224288364 \h </w:instrText>
             </w:r>
             <w:r>
               <w:rPr>
@@ -1803,7 +1803,7 @@
               <w14:ligatures w14:val="standardContextual"/>
             </w:rPr>
           </w:pPr>
-          <w:hyperlink w:anchor="_Toc224063993" w:history="1">
+          <w:hyperlink w:anchor="_Toc224288365" w:history="1">
             <w:r>
               <w:rPr>
                 <w:rStyle w:val="Hyperlink"/>
@@ -1830,7 +1830,7 @@
                 <w:noProof/>
                 <w:webHidden/>
               </w:rPr>
-              <w:instrText xml:space="preserve"> PAGEREF _Toc224063993 \h </w:instrText>
+              <w:instrText xml:space="preserve"> PAGEREF _Toc224288365 \h </w:instrText>
             </w:r>
             <w:r>
               <w:rPr>
@@ -1874,7 +1874,7 @@
               <w14:ligatures w14:val="standardContextual"/>
             </w:rPr>
           </w:pPr>
-          <w:hyperlink w:anchor="_Toc224063994" w:history="1">
+          <w:hyperlink w:anchor="_Toc224288366" w:history="1">
             <w:r>
               <w:rPr>
                 <w:rStyle w:val="Hyperlink"/>
@@ -1901,7 +1901,7 @@
                 <w:noProof/>
                 <w:webHidden/>
               </w:rPr>
-              <w:instrText xml:space="preserve"> PAGEREF _Toc224063994 \h </w:instrText>
+              <w:instrText xml:space="preserve"> PAGEREF _Toc224288366 \h </w:instrText>
             </w:r>
             <w:r>
               <w:rPr>
@@ -1945,7 +1945,7 @@
               <w14:ligatures w14:val="standardContextual"/>
             </w:rPr>
           </w:pPr>
-          <w:hyperlink w:anchor="_Toc224063995" w:history="1">
+          <w:hyperlink w:anchor="_Toc224288367" w:history="1">
             <w:r>
               <w:rPr>
                 <w:rStyle w:val="Hyperlink"/>
@@ -1972,7 +1972,7 @@
                 <w:noProof/>
                 <w:webHidden/>
               </w:rPr>
-              <w:instrText xml:space="preserve"> PAGEREF _Toc224063995 \h </w:instrText>
+              <w:instrText xml:space="preserve"> PAGEREF _Toc224288367 \h </w:instrText>
             </w:r>
             <w:r>
               <w:rPr>
@@ -2016,7 +2016,7 @@
               <w14:ligatures w14:val="standardContextual"/>
             </w:rPr>
           </w:pPr>
-          <w:hyperlink w:anchor="_Toc224063996" w:history="1">
+          <w:hyperlink w:anchor="_Toc224288368" w:history="1">
             <w:r>
               <w:rPr>
                 <w:rStyle w:val="Hyperlink"/>
@@ -2043,7 +2043,7 @@
                 <w:noProof/>
                 <w:webHidden/>
               </w:rPr>
-              <w:instrText xml:space="preserve"> PAGEREF _Toc224063996 \h </w:instrText>
+              <w:instrText xml:space="preserve"> PAGEREF _Toc224288368 \h </w:instrText>
             </w:r>
             <w:r>
               <w:rPr>
@@ -2087,7 +2087,7 @@
               <w14:ligatures w14:val="standardContextual"/>
             </w:rPr>
           </w:pPr>
-          <w:hyperlink w:anchor="_Toc224063997" w:history="1">
+          <w:hyperlink w:anchor="_Toc224288369" w:history="1">
             <w:r>
               <w:rPr>
                 <w:rStyle w:val="Hyperlink"/>
@@ -2114,7 +2114,7 @@
                 <w:noProof/>
                 <w:webHidden/>
               </w:rPr>
-              <w:instrText xml:space="preserve"> PAGEREF _Toc224063997 \h </w:instrText>
+              <w:instrText xml:space="preserve"> PAGEREF _Toc224288369 \h </w:instrText>
             </w:r>
             <w:r>
               <w:rPr>
@@ -2158,7 +2158,7 @@
               <w14:ligatures w14:val="standardContextual"/>
             </w:rPr>
           </w:pPr>
-          <w:hyperlink w:anchor="_Toc224063998" w:history="1">
+          <w:hyperlink w:anchor="_Toc224288370" w:history="1">
             <w:r>
               <w:rPr>
                 <w:rStyle w:val="Hyperlink"/>
@@ -2185,7 +2185,7 @@
                 <w:noProof/>
                 <w:webHidden/>
               </w:rPr>
-              <w:instrText xml:space="preserve"> PAGEREF _Toc224063998 \h </w:instrText>
+              <w:instrText xml:space="preserve"> PAGEREF _Toc224288370 \h </w:instrText>
             </w:r>
             <w:r>
               <w:rPr>
@@ -2229,7 +2229,7 @@
               <w14:ligatures w14:val="standardContextual"/>
             </w:rPr>
           </w:pPr>
-          <w:hyperlink w:anchor="_Toc224063999" w:history="1">
+          <w:hyperlink w:anchor="_Toc224288371" w:history="1">
             <w:r>
               <w:rPr>
                 <w:rStyle w:val="Hyperlink"/>
@@ -2256,7 +2256,7 @@
                 <w:noProof/>
                 <w:webHidden/>
               </w:rPr>
-              <w:instrText xml:space="preserve"> PAGEREF _Toc224063999 \h </w:instrText>
+              <w:instrText xml:space="preserve"> PAGEREF _Toc224288371 \h </w:instrText>
             </w:r>
             <w:r>
               <w:rPr>
@@ -2300,7 +2300,7 @@
               <w14:ligatures w14:val="standardContextual"/>
             </w:rPr>
           </w:pPr>
-          <w:hyperlink w:anchor="_Toc224064000" w:history="1">
+          <w:hyperlink w:anchor="_Toc224288372" w:history="1">
             <w:r>
               <w:rPr>
                 <w:rStyle w:val="Hyperlink"/>
@@ -2327,7 +2327,7 @@
                 <w:noProof/>
                 <w:webHidden/>
               </w:rPr>
-              <w:instrText xml:space="preserve"> PAGEREF _Toc224064000 \h </w:instrText>
+              <w:instrText xml:space="preserve"> PAGEREF _Toc224288372 \h </w:instrText>
             </w:r>
             <w:r>
               <w:rPr>
@@ -2371,7 +2371,7 @@
               <w14:ligatures w14:val="standardContextual"/>
             </w:rPr>
           </w:pPr>
-          <w:hyperlink w:anchor="_Toc224064001" w:history="1">
+          <w:hyperlink w:anchor="_Toc224288373" w:history="1">
             <w:r>
               <w:rPr>
                 <w:rStyle w:val="Hyperlink"/>
@@ -2398,7 +2398,7 @@
                 <w:noProof/>
                 <w:webHidden/>
               </w:rPr>
-              <w:instrText xml:space="preserve"> PAGEREF _Toc224064001 \h </w:instrText>
+              <w:instrText xml:space="preserve"> PAGEREF _Toc224288373 \h </w:instrText>
             </w:r>
             <w:r>
               <w:rPr>
@@ -2442,7 +2442,7 @@
               <w14:ligatures w14:val="standardContextual"/>
             </w:rPr>
           </w:pPr>
-          <w:hyperlink w:anchor="_Toc224064002" w:history="1">
+          <w:hyperlink w:anchor="_Toc224288374" w:history="1">
             <w:r>
               <w:rPr>
                 <w:rStyle w:val="Hyperlink"/>
@@ -2469,7 +2469,7 @@
                 <w:noProof/>
                 <w:webHidden/>
               </w:rPr>
-              <w:instrText xml:space="preserve"> PAGEREF _Toc224064002 \h </w:instrText>
+              <w:instrText xml:space="preserve"> PAGEREF _Toc224288374 \h </w:instrText>
             </w:r>
             <w:r>
               <w:rPr>
@@ -2513,7 +2513,7 @@
               <w14:ligatures w14:val="standardContextual"/>
             </w:rPr>
           </w:pPr>
-          <w:hyperlink w:anchor="_Toc224064003" w:history="1">
+          <w:hyperlink w:anchor="_Toc224288375" w:history="1">
             <w:r>
               <w:rPr>
                 <w:rStyle w:val="Hyperlink"/>
@@ -2540,7 +2540,7 @@
                 <w:noProof/>
                 <w:webHidden/>
               </w:rPr>
-              <w:instrText xml:space="preserve"> PAGEREF _Toc224064003 \h </w:instrText>
+              <w:instrText xml:space="preserve"> PAGEREF _Toc224288375 \h </w:instrText>
             </w:r>
             <w:r>
               <w:rPr>
@@ -2584,7 +2584,7 @@
               <w14:ligatures w14:val="standardContextual"/>
             </w:rPr>
           </w:pPr>
-          <w:hyperlink w:anchor="_Toc224064004" w:history="1">
+          <w:hyperlink w:anchor="_Toc224288376" w:history="1">
             <w:r>
               <w:rPr>
                 <w:rStyle w:val="Hyperlink"/>
@@ -2611,7 +2611,7 @@
                 <w:noProof/>
                 <w:webHidden/>
               </w:rPr>
-              <w:instrText xml:space="preserve"> PAGEREF _Toc224064004 \h </w:instrText>
+              <w:instrText xml:space="preserve"> PAGEREF _Toc224288376 \h </w:instrText>
             </w:r>
             <w:r>
               <w:rPr>
@@ -2655,7 +2655,7 @@
               <w14:ligatures w14:val="standardContextual"/>
             </w:rPr>
           </w:pPr>
-          <w:hyperlink w:anchor="_Toc224064005" w:history="1">
+          <w:hyperlink w:anchor="_Toc224288377" w:history="1">
             <w:r>
               <w:rPr>
                 <w:rStyle w:val="Hyperlink"/>
@@ -2682,7 +2682,7 @@
                 <w:noProof/>
                 <w:webHidden/>
               </w:rPr>
-              <w:instrText xml:space="preserve"> PAGEREF _Toc224064005 \h </w:instrText>
+              <w:instrText xml:space="preserve"> PAGEREF _Toc224288377 \h </w:instrText>
             </w:r>
             <w:r>
               <w:rPr>
@@ -2726,7 +2726,7 @@
               <w14:ligatures w14:val="standardContextual"/>
             </w:rPr>
           </w:pPr>
-          <w:hyperlink w:anchor="_Toc224064006" w:history="1">
+          <w:hyperlink w:anchor="_Toc224288378" w:history="1">
             <w:r>
               <w:rPr>
                 <w:rStyle w:val="Hyperlink"/>
@@ -2753,7 +2753,7 @@
                 <w:noProof/>
                 <w:webHidden/>
               </w:rPr>
-              <w:instrText xml:space="preserve"> PAGEREF _Toc224064006 \h </w:instrText>
+              <w:instrText xml:space="preserve"> PAGEREF _Toc224288378 \h </w:instrText>
             </w:r>
             <w:r>
               <w:rPr>
@@ -2797,7 +2797,7 @@
               <w14:ligatures w14:val="standardContextual"/>
             </w:rPr>
           </w:pPr>
-          <w:hyperlink w:anchor="_Toc224064007" w:history="1">
+          <w:hyperlink w:anchor="_Toc224288379" w:history="1">
             <w:r>
               <w:rPr>
                 <w:rStyle w:val="Hyperlink"/>
@@ -2824,7 +2824,7 @@
                 <w:noProof/>
                 <w:webHidden/>
               </w:rPr>
-              <w:instrText xml:space="preserve"> PAGEREF _Toc224064007 \h </w:instrText>
+              <w:instrText xml:space="preserve"> PAGEREF _Toc224288379 \h </w:instrText>
             </w:r>
             <w:r>
               <w:rPr>
@@ -2868,7 +2868,7 @@
               <w14:ligatures w14:val="standardContextual"/>
             </w:rPr>
           </w:pPr>
-          <w:hyperlink w:anchor="_Toc224064008" w:history="1">
+          <w:hyperlink w:anchor="_Toc224288380" w:history="1">
             <w:r>
               <w:rPr>
                 <w:rStyle w:val="Hyperlink"/>
@@ -2895,7 +2895,7 @@
                 <w:noProof/>
                 <w:webHidden/>
               </w:rPr>
-              <w:instrText xml:space="preserve"> PAGEREF _Toc224064008 \h </w:instrText>
+              <w:instrText xml:space="preserve"> PAGEREF _Toc224288380 \h </w:instrText>
             </w:r>
             <w:r>
               <w:rPr>
@@ -2939,7 +2939,7 @@
               <w14:ligatures w14:val="standardContextual"/>
             </w:rPr>
           </w:pPr>
-          <w:hyperlink w:anchor="_Toc224064009" w:history="1">
+          <w:hyperlink w:anchor="_Toc224288381" w:history="1">
             <w:r>
               <w:rPr>
                 <w:rStyle w:val="Hyperlink"/>
@@ -2966,7 +2966,7 @@
                 <w:noProof/>
                 <w:webHidden/>
               </w:rPr>
-              <w:instrText xml:space="preserve"> PAGEREF _Toc224064009 \h </w:instrText>
+              <w:instrText xml:space="preserve"> PAGEREF _Toc224288381 \h </w:instrText>
             </w:r>
             <w:r>
               <w:rPr>
@@ -3010,7 +3010,7 @@
               <w14:ligatures w14:val="standardContextual"/>
             </w:rPr>
           </w:pPr>
-          <w:hyperlink w:anchor="_Toc224064010" w:history="1">
+          <w:hyperlink w:anchor="_Toc224288382" w:history="1">
             <w:r>
               <w:rPr>
                 <w:rStyle w:val="Hyperlink"/>
@@ -3037,7 +3037,7 @@
                 <w:noProof/>
                 <w:webHidden/>
               </w:rPr>
-              <w:instrText xml:space="preserve"> PAGEREF _Toc224064010 \h </w:instrText>
+              <w:instrText xml:space="preserve"> PAGEREF _Toc224288382 \h </w:instrText>
             </w:r>
             <w:r>
               <w:rPr>
@@ -3081,7 +3081,7 @@
               <w14:ligatures w14:val="standardContextual"/>
             </w:rPr>
           </w:pPr>
-          <w:hyperlink w:anchor="_Toc224064011" w:history="1">
+          <w:hyperlink w:anchor="_Toc224288383" w:history="1">
             <w:r>
               <w:rPr>
                 <w:rStyle w:val="Hyperlink"/>
@@ -3108,7 +3108,7 @@
                 <w:noProof/>
                 <w:webHidden/>
               </w:rPr>
-              <w:instrText xml:space="preserve"> PAGEREF _Toc224064011 \h </w:instrText>
+              <w:instrText xml:space="preserve"> PAGEREF _Toc224288383 \h </w:instrText>
             </w:r>
             <w:r>
               <w:rPr>
@@ -3152,7 +3152,7 @@
               <w14:ligatures w14:val="standardContextual"/>
             </w:rPr>
           </w:pPr>
-          <w:hyperlink w:anchor="_Toc224064012" w:history="1">
+          <w:hyperlink w:anchor="_Toc224288384" w:history="1">
             <w:r>
               <w:rPr>
                 <w:rStyle w:val="Hyperlink"/>
@@ -3179,7 +3179,7 @@
                 <w:noProof/>
                 <w:webHidden/>
               </w:rPr>
-              <w:instrText xml:space="preserve"> PAGEREF _Toc224064012 \h </w:instrText>
+              <w:instrText xml:space="preserve"> PAGEREF _Toc224288384 \h </w:instrText>
             </w:r>
             <w:r>
               <w:rPr>
@@ -3223,7 +3223,7 @@
               <w14:ligatures w14:val="standardContextual"/>
             </w:rPr>
           </w:pPr>
-          <w:hyperlink w:anchor="_Toc224064013" w:history="1">
+          <w:hyperlink w:anchor="_Toc224288385" w:history="1">
             <w:r>
               <w:rPr>
                 <w:rStyle w:val="Hyperlink"/>
@@ -3250,7 +3250,7 @@
                 <w:noProof/>
                 <w:webHidden/>
               </w:rPr>
-              <w:instrText xml:space="preserve"> PAGEREF _Toc224064013 \h </w:instrText>
+              <w:instrText xml:space="preserve"> PAGEREF _Toc224288385 \h </w:instrText>
             </w:r>
             <w:r>
               <w:rPr>
@@ -3294,7 +3294,7 @@
               <w14:ligatures w14:val="standardContextual"/>
             </w:rPr>
           </w:pPr>
-          <w:hyperlink w:anchor="_Toc224064014" w:history="1">
+          <w:hyperlink w:anchor="_Toc224288386" w:history="1">
             <w:r>
               <w:rPr>
                 <w:rStyle w:val="Hyperlink"/>
@@ -3321,7 +3321,7 @@
                 <w:noProof/>
                 <w:webHidden/>
               </w:rPr>
-              <w:instrText xml:space="preserve"> PAGEREF _Toc224064014 \h </w:instrText>
+              <w:instrText xml:space="preserve"> PAGEREF _Toc224288386 \h </w:instrText>
             </w:r>
             <w:r>
               <w:rPr>
@@ -3365,7 +3365,7 @@
               <w14:ligatures w14:val="standardContextual"/>
             </w:rPr>
           </w:pPr>
-          <w:hyperlink w:anchor="_Toc224064015" w:history="1">
+          <w:hyperlink w:anchor="_Toc224288387" w:history="1">
             <w:r>
               <w:rPr>
                 <w:rStyle w:val="Hyperlink"/>
@@ -3392,7 +3392,7 @@
                 <w:noProof/>
                 <w:webHidden/>
               </w:rPr>
-              <w:instrText xml:space="preserve"> PAGEREF _Toc224064015 \h </w:instrText>
+              <w:instrText xml:space="preserve"> PAGEREF _Toc224288387 \h </w:instrText>
             </w:r>
             <w:r>
               <w:rPr>
@@ -3436,7 +3436,7 @@
               <w14:ligatures w14:val="standardContextual"/>
             </w:rPr>
           </w:pPr>
-          <w:hyperlink w:anchor="_Toc224064016" w:history="1">
+          <w:hyperlink w:anchor="_Toc224288388" w:history="1">
             <w:r>
               <w:rPr>
                 <w:rStyle w:val="Hyperlink"/>
@@ -3463,7 +3463,7 @@
                 <w:noProof/>
                 <w:webHidden/>
               </w:rPr>
-              <w:instrText xml:space="preserve"> PAGEREF _Toc224064016 \h </w:instrText>
+              <w:instrText xml:space="preserve"> PAGEREF _Toc224288388 \h </w:instrText>
             </w:r>
             <w:r>
               <w:rPr>
@@ -3507,7 +3507,7 @@
               <w14:ligatures w14:val="standardContextual"/>
             </w:rPr>
           </w:pPr>
-          <w:hyperlink w:anchor="_Toc224064017" w:history="1">
+          <w:hyperlink w:anchor="_Toc224288389" w:history="1">
             <w:r>
               <w:rPr>
                 <w:rStyle w:val="Hyperlink"/>
@@ -3534,7 +3534,7 @@
                 <w:noProof/>
                 <w:webHidden/>
               </w:rPr>
-              <w:instrText xml:space="preserve"> PAGEREF _Toc224064017 \h </w:instrText>
+              <w:instrText xml:space="preserve"> PAGEREF _Toc224288389 \h </w:instrText>
             </w:r>
             <w:r>
               <w:rPr>
@@ -3578,7 +3578,7 @@
               <w14:ligatures w14:val="standardContextual"/>
             </w:rPr>
           </w:pPr>
-          <w:hyperlink w:anchor="_Toc224064018" w:history="1">
+          <w:hyperlink w:anchor="_Toc224288390" w:history="1">
             <w:r>
               <w:rPr>
                 <w:rStyle w:val="Hyperlink"/>
@@ -3605,7 +3605,7 @@
                 <w:noProof/>
                 <w:webHidden/>
               </w:rPr>
-              <w:instrText xml:space="preserve"> PAGEREF _Toc224064018 \h </w:instrText>
+              <w:instrText xml:space="preserve"> PAGEREF _Toc224288390 \h </w:instrText>
             </w:r>
             <w:r>
               <w:rPr>
@@ -3649,7 +3649,7 @@
               <w14:ligatures w14:val="standardContextual"/>
             </w:rPr>
           </w:pPr>
-          <w:hyperlink w:anchor="_Toc224064019" w:history="1">
+          <w:hyperlink w:anchor="_Toc224288391" w:history="1">
             <w:r>
               <w:rPr>
                 <w:rStyle w:val="Hyperlink"/>
@@ -3676,7 +3676,7 @@
                 <w:noProof/>
                 <w:webHidden/>
               </w:rPr>
-              <w:instrText xml:space="preserve"> PAGEREF _Toc224064019 \h </w:instrText>
+              <w:instrText xml:space="preserve"> PAGEREF _Toc224288391 \h </w:instrText>
             </w:r>
             <w:r>
               <w:rPr>
@@ -3720,7 +3720,7 @@
               <w14:ligatures w14:val="standardContextual"/>
             </w:rPr>
           </w:pPr>
-          <w:hyperlink w:anchor="_Toc224064020" w:history="1">
+          <w:hyperlink w:anchor="_Toc224288392" w:history="1">
             <w:r>
               <w:rPr>
                 <w:rStyle w:val="Hyperlink"/>
@@ -3747,7 +3747,7 @@
                 <w:noProof/>
                 <w:webHidden/>
               </w:rPr>
-              <w:instrText xml:space="preserve"> PAGEREF _Toc224064020 \h </w:instrText>
+              <w:instrText xml:space="preserve"> PAGEREF _Toc224288392 \h </w:instrText>
             </w:r>
             <w:r>
               <w:rPr>
@@ -3791,7 +3791,7 @@
               <w14:ligatures w14:val="standardContextual"/>
             </w:rPr>
           </w:pPr>
-          <w:hyperlink w:anchor="_Toc224064021" w:history="1">
+          <w:hyperlink w:anchor="_Toc224288393" w:history="1">
             <w:r>
               <w:rPr>
                 <w:rStyle w:val="Hyperlink"/>
@@ -3818,7 +3818,7 @@
                 <w:noProof/>
                 <w:webHidden/>
               </w:rPr>
-              <w:instrText xml:space="preserve"> PAGEREF _Toc224064021 \h </w:instrText>
+              <w:instrText xml:space="preserve"> PAGEREF _Toc224288393 \h </w:instrText>
             </w:r>
             <w:r>
               <w:rPr>
@@ -3862,7 +3862,7 @@
               <w14:ligatures w14:val="standardContextual"/>
             </w:rPr>
           </w:pPr>
-          <w:hyperlink w:anchor="_Toc224064022" w:history="1">
+          <w:hyperlink w:anchor="_Toc224288394" w:history="1">
             <w:r>
               <w:rPr>
                 <w:rStyle w:val="Hyperlink"/>
@@ -3889,7 +3889,7 @@
                 <w:noProof/>
                 <w:webHidden/>
               </w:rPr>
-              <w:instrText xml:space="preserve"> PAGEREF _Toc224064022 \h </w:instrText>
+              <w:instrText xml:space="preserve"> PAGEREF _Toc224288394 \h </w:instrText>
             </w:r>
             <w:r>
               <w:rPr>
@@ -3982,7 +3982,7 @@
           <w:docGrid w:linePitch="360"/>
         </w:sectPr>
       </w:pPr>
-      <w:bookmarkStart w:id="0" w:name="_Toc224063971"/>
+      <w:bookmarkStart w:id="0" w:name="_Toc224288343"/>
       <w:r>
         <w:t>Analysis</w:t>
       </w:r>
@@ -3992,7 +3992,7 @@
       <w:pPr>
         <w:pStyle w:val="Heading2"/>
       </w:pPr>
-      <w:bookmarkStart w:id="1" w:name="_Toc224063972"/>
+      <w:bookmarkStart w:id="1" w:name="_Toc224288344"/>
       <w:r>
         <w:lastRenderedPageBreak/>
         <w:t>Problem Description</w:t>
@@ -4127,7 +4127,7 @@
       <w:pPr>
         <w:pStyle w:val="Heading2"/>
       </w:pPr>
-      <w:bookmarkStart w:id="2" w:name="_Toc224063973"/>
+      <w:bookmarkStart w:id="2" w:name="_Toc224288345"/>
       <w:r>
         <w:lastRenderedPageBreak/>
         <w:t>Research</w:t>
@@ -4138,7 +4138,7 @@
       <w:pPr>
         <w:pStyle w:val="Heading3"/>
       </w:pPr>
-      <w:bookmarkStart w:id="3" w:name="_Toc224063974"/>
+      <w:bookmarkStart w:id="3" w:name="_Toc224288346"/>
       <w:r>
         <w:t>Evacuation Modelling Approach</w:t>
       </w:r>
@@ -4248,7 +4248,7 @@
       <w:pPr>
         <w:pStyle w:val="Heading3"/>
       </w:pPr>
-      <w:bookmarkStart w:id="4" w:name="_Toc224063975"/>
+      <w:bookmarkStart w:id="4" w:name="_Toc224288347"/>
       <w:r>
         <w:t>Multi-Agent Movement and Congestion/Conflict Resolution</w:t>
       </w:r>
@@ -4455,7 +4455,7 @@
       <w:pPr>
         <w:pStyle w:val="Heading3"/>
       </w:pPr>
-      <w:bookmarkStart w:id="5" w:name="_Toc224063976"/>
+      <w:bookmarkStart w:id="5" w:name="_Toc224288348"/>
       <w:r>
         <w:lastRenderedPageBreak/>
         <w:t>Hazard Representation</w:t>
@@ -4514,7 +4514,7 @@
       <w:pPr>
         <w:pStyle w:val="Heading3"/>
       </w:pPr>
-      <w:bookmarkStart w:id="6" w:name="_Toc224063977"/>
+      <w:bookmarkStart w:id="6" w:name="_Toc224288349"/>
       <w:r>
         <w:t>Pathfinding Algorithm</w:t>
       </w:r>
@@ -7175,27 +7175,14 @@
       <w:r>
         <w:t xml:space="preserve">Table </w:t>
       </w:r>
-      <w:r>
-        <w:fldChar w:fldCharType="begin"/>
-      </w:r>
-      <w:r>
-        <w:instrText xml:space="preserve"> SEQ Table \* ARABIC </w:instrText>
-      </w:r>
-      <w:r>
-        <w:fldChar w:fldCharType="separate"/>
-      </w:r>
-      <w:r>
-        <w:rPr>
-          <w:noProof/>
-        </w:rPr>
-        <w:t>1</w:t>
-      </w:r>
-      <w:r>
-        <w:rPr>
-          <w:noProof/>
-        </w:rPr>
-        <w:fldChar w:fldCharType="end"/>
-      </w:r>
+      <w:fldSimple w:instr=" SEQ Table \* ARABIC ">
+        <w:r>
+          <w:rPr>
+            <w:noProof/>
+          </w:rPr>
+          <w:t>1</w:t>
+        </w:r>
+      </w:fldSimple>
       <w:r>
         <w:t xml:space="preserve"> </w:t>
       </w:r>
@@ -7891,7 +7878,7 @@
       <w:pPr>
         <w:pStyle w:val="Heading3"/>
       </w:pPr>
-      <w:bookmarkStart w:id="9" w:name="_Toc224063978"/>
+      <w:bookmarkStart w:id="9" w:name="_Toc224288350"/>
       <w:r>
         <w:lastRenderedPageBreak/>
         <w:t>Evaluation Metrics for Evacuation Outcomes and Algorithm Performance</w:t>
@@ -8928,27 +8915,14 @@
       <w:r>
         <w:t xml:space="preserve">Table </w:t>
       </w:r>
-      <w:r>
-        <w:fldChar w:fldCharType="begin"/>
-      </w:r>
-      <w:r>
-        <w:instrText xml:space="preserve"> SEQ Table \* ARABIC </w:instrText>
-      </w:r>
-      <w:r>
-        <w:fldChar w:fldCharType="separate"/>
-      </w:r>
-      <w:r>
-        <w:rPr>
-          <w:noProof/>
-        </w:rPr>
-        <w:t>2</w:t>
-      </w:r>
-      <w:r>
-        <w:rPr>
-          <w:noProof/>
-        </w:rPr>
-        <w:fldChar w:fldCharType="end"/>
-      </w:r>
+      <w:fldSimple w:instr=" SEQ Table \* ARABIC ">
+        <w:r>
+          <w:rPr>
+            <w:noProof/>
+          </w:rPr>
+          <w:t>2</w:t>
+        </w:r>
+      </w:fldSimple>
       <w:r>
         <w:t xml:space="preserve"> </w:t>
       </w:r>
@@ -9180,7 +9154,7 @@
       <w:pPr>
         <w:pStyle w:val="Heading3"/>
       </w:pPr>
-      <w:bookmarkStart w:id="11" w:name="_Toc224063979"/>
+      <w:bookmarkStart w:id="11" w:name="_Toc224288351"/>
       <w:r>
         <w:lastRenderedPageBreak/>
         <w:t>Machine-Learning (ML) Algorithms</w:t>
@@ -10436,27 +10410,14 @@
       <w:r>
         <w:t xml:space="preserve">Table </w:t>
       </w:r>
-      <w:r>
-        <w:fldChar w:fldCharType="begin"/>
-      </w:r>
-      <w:r>
-        <w:instrText xml:space="preserve"> SEQ Table \* ARABIC </w:instrText>
-      </w:r>
-      <w:r>
-        <w:fldChar w:fldCharType="separate"/>
-      </w:r>
-      <w:r>
-        <w:rPr>
-          <w:noProof/>
-        </w:rPr>
-        <w:t>3</w:t>
-      </w:r>
-      <w:r>
-        <w:rPr>
-          <w:noProof/>
-        </w:rPr>
-        <w:fldChar w:fldCharType="end"/>
-      </w:r>
+      <w:fldSimple w:instr=" SEQ Table \* ARABIC ">
+        <w:r>
+          <w:rPr>
+            <w:noProof/>
+          </w:rPr>
+          <w:t>3</w:t>
+        </w:r>
+      </w:fldSimple>
       <w:r>
         <w:t xml:space="preserve"> </w:t>
       </w:r>
@@ -10782,7 +10743,7 @@
       <w:pPr>
         <w:pStyle w:val="Heading2"/>
       </w:pPr>
-      <w:bookmarkStart w:id="13" w:name="_Toc224063980"/>
+      <w:bookmarkStart w:id="13" w:name="_Toc224288352"/>
       <w:r>
         <w:lastRenderedPageBreak/>
         <w:t>Current Systems</w:t>
@@ -10793,7 +10754,7 @@
       <w:pPr>
         <w:pStyle w:val="Heading3"/>
       </w:pPr>
-      <w:bookmarkStart w:id="14" w:name="_Toc224063981"/>
+      <w:bookmarkStart w:id="14" w:name="_Toc224288353"/>
       <w:r>
         <w:t>Pathfinder</w:t>
       </w:r>
@@ -10864,7 +10825,7 @@
       <w:pPr>
         <w:pStyle w:val="Heading3"/>
       </w:pPr>
-      <w:bookmarkStart w:id="15" w:name="_Toc224063982"/>
+      <w:bookmarkStart w:id="15" w:name="_Toc224288354"/>
       <w:r>
         <w:t>FDS / Smokeview and FDS+Evac (NIST)</w:t>
       </w:r>
@@ -10915,7 +10876,7 @@
       <w:pPr>
         <w:pStyle w:val="Heading3"/>
       </w:pPr>
-      <w:bookmarkStart w:id="16" w:name="_Toc224063983"/>
+      <w:bookmarkStart w:id="16" w:name="_Toc224288355"/>
       <w:r>
         <w:t>Pathfinding Visualizer (</w:t>
       </w:r>
@@ -10981,7 +10942,7 @@
       <w:pPr>
         <w:pStyle w:val="Heading2"/>
       </w:pPr>
-      <w:bookmarkStart w:id="17" w:name="_Toc224063984"/>
+      <w:bookmarkStart w:id="17" w:name="_Toc224288356"/>
       <w:r>
         <w:lastRenderedPageBreak/>
         <w:t>User Identification</w:t>
@@ -11003,7 +10964,7 @@
       <w:pPr>
         <w:pStyle w:val="Heading3"/>
       </w:pPr>
-      <w:bookmarkStart w:id="18" w:name="_Toc224063985"/>
+      <w:bookmarkStart w:id="18" w:name="_Toc224288357"/>
       <w:r>
         <w:t>Gathering User Requirements</w:t>
       </w:r>
@@ -11160,27 +11121,14 @@
                             <w:r>
                               <w:t xml:space="preserve">Figure </w:t>
                             </w:r>
-                            <w:r>
-                              <w:fldChar w:fldCharType="begin"/>
-                            </w:r>
-                            <w:r>
-                              <w:instrText xml:space="preserve"> SEQ Figure \* ARABIC </w:instrText>
-                            </w:r>
-                            <w:r>
-                              <w:fldChar w:fldCharType="separate"/>
-                            </w:r>
-                            <w:r>
-                              <w:rPr>
-                                <w:noProof/>
-                              </w:rPr>
-                              <w:t>1</w:t>
-                            </w:r>
-                            <w:r>
-                              <w:rPr>
-                                <w:noProof/>
-                              </w:rPr>
-                              <w:fldChar w:fldCharType="end"/>
-                            </w:r>
+                            <w:fldSimple w:instr=" SEQ Figure \* ARABIC ">
+                              <w:r>
+                                <w:rPr>
+                                  <w:noProof/>
+                                </w:rPr>
+                                <w:t>1</w:t>
+                              </w:r>
+                            </w:fldSimple>
                             <w:r>
                               <w:t xml:space="preserve"> </w:t>
                             </w:r>
@@ -11235,27 +11183,14 @@
                       <w:r>
                         <w:t xml:space="preserve">Figure </w:t>
                       </w:r>
-                      <w:r>
-                        <w:fldChar w:fldCharType="begin"/>
-                      </w:r>
-                      <w:r>
-                        <w:instrText xml:space="preserve"> SEQ Figure \* ARABIC </w:instrText>
-                      </w:r>
-                      <w:r>
-                        <w:fldChar w:fldCharType="separate"/>
-                      </w:r>
-                      <w:r>
-                        <w:rPr>
-                          <w:noProof/>
-                        </w:rPr>
-                        <w:t>1</w:t>
-                      </w:r>
-                      <w:r>
-                        <w:rPr>
-                          <w:noProof/>
-                        </w:rPr>
-                        <w:fldChar w:fldCharType="end"/>
-                      </w:r>
+                      <w:fldSimple w:instr=" SEQ Figure \* ARABIC ">
+                        <w:r>
+                          <w:rPr>
+                            <w:noProof/>
+                          </w:rPr>
+                          <w:t>1</w:t>
+                        </w:r>
+                      </w:fldSimple>
                       <w:r>
                         <w:t xml:space="preserve"> </w:t>
                       </w:r>
@@ -11382,27 +11317,14 @@
                             <w:r>
                               <w:t xml:space="preserve">Figure </w:t>
                             </w:r>
-                            <w:r>
-                              <w:fldChar w:fldCharType="begin"/>
-                            </w:r>
-                            <w:r>
-                              <w:instrText xml:space="preserve"> SEQ Figure \* ARABIC </w:instrText>
-                            </w:r>
-                            <w:r>
-                              <w:fldChar w:fldCharType="separate"/>
-                            </w:r>
-                            <w:r>
-                              <w:rPr>
-                                <w:noProof/>
-                              </w:rPr>
-                              <w:t>2</w:t>
-                            </w:r>
-                            <w:r>
-                              <w:rPr>
-                                <w:noProof/>
-                              </w:rPr>
-                              <w:fldChar w:fldCharType="end"/>
-                            </w:r>
+                            <w:fldSimple w:instr=" SEQ Figure \* ARABIC ">
+                              <w:r>
+                                <w:rPr>
+                                  <w:noProof/>
+                                </w:rPr>
+                                <w:t>2</w:t>
+                              </w:r>
+                            </w:fldSimple>
                             <w:r>
                               <w:t xml:space="preserve"> </w:t>
                             </w:r>
@@ -11453,27 +11375,14 @@
                       <w:r>
                         <w:t xml:space="preserve">Figure </w:t>
                       </w:r>
-                      <w:r>
-                        <w:fldChar w:fldCharType="begin"/>
-                      </w:r>
-                      <w:r>
-                        <w:instrText xml:space="preserve"> SEQ Figure \* ARABIC </w:instrText>
-                      </w:r>
-                      <w:r>
-                        <w:fldChar w:fldCharType="separate"/>
-                      </w:r>
-                      <w:r>
-                        <w:rPr>
-                          <w:noProof/>
-                        </w:rPr>
-                        <w:t>2</w:t>
-                      </w:r>
-                      <w:r>
-                        <w:rPr>
-                          <w:noProof/>
-                        </w:rPr>
-                        <w:fldChar w:fldCharType="end"/>
-                      </w:r>
+                      <w:fldSimple w:instr=" SEQ Figure \* ARABIC ">
+                        <w:r>
+                          <w:rPr>
+                            <w:noProof/>
+                          </w:rPr>
+                          <w:t>2</w:t>
+                        </w:r>
+                      </w:fldSimple>
                       <w:r>
                         <w:t xml:space="preserve"> </w:t>
                       </w:r>
@@ -11793,27 +11702,14 @@
                             <w:r>
                               <w:t xml:space="preserve">Figure </w:t>
                             </w:r>
-                            <w:r>
-                              <w:fldChar w:fldCharType="begin"/>
-                            </w:r>
-                            <w:r>
-                              <w:instrText xml:space="preserve"> SEQ Figure \* ARABIC </w:instrText>
-                            </w:r>
-                            <w:r>
-                              <w:fldChar w:fldCharType="separate"/>
-                            </w:r>
-                            <w:r>
-                              <w:rPr>
-                                <w:noProof/>
-                              </w:rPr>
-                              <w:t>3</w:t>
-                            </w:r>
-                            <w:r>
-                              <w:rPr>
-                                <w:noProof/>
-                              </w:rPr>
-                              <w:fldChar w:fldCharType="end"/>
-                            </w:r>
+                            <w:fldSimple w:instr=" SEQ Figure \* ARABIC ">
+                              <w:r>
+                                <w:rPr>
+                                  <w:noProof/>
+                                </w:rPr>
+                                <w:t>3</w:t>
+                              </w:r>
+                            </w:fldSimple>
                             <w:bookmarkEnd w:id="23"/>
                             <w:r>
                               <w:t xml:space="preserve"> </w:t>
@@ -11858,27 +11754,14 @@
                       <w:r>
                         <w:t xml:space="preserve">Figure </w:t>
                       </w:r>
-                      <w:r>
-                        <w:fldChar w:fldCharType="begin"/>
-                      </w:r>
-                      <w:r>
-                        <w:instrText xml:space="preserve"> SEQ Figure \* ARABIC </w:instrText>
-                      </w:r>
-                      <w:r>
-                        <w:fldChar w:fldCharType="separate"/>
-                      </w:r>
-                      <w:r>
-                        <w:rPr>
-                          <w:noProof/>
-                        </w:rPr>
-                        <w:t>3</w:t>
-                      </w:r>
-                      <w:r>
-                        <w:rPr>
-                          <w:noProof/>
-                        </w:rPr>
-                        <w:fldChar w:fldCharType="end"/>
-                      </w:r>
+                      <w:fldSimple w:instr=" SEQ Figure \* ARABIC ">
+                        <w:r>
+                          <w:rPr>
+                            <w:noProof/>
+                          </w:rPr>
+                          <w:t>3</w:t>
+                        </w:r>
+                      </w:fldSimple>
                       <w:bookmarkEnd w:id="25"/>
                       <w:r>
                         <w:t xml:space="preserve"> </w:t>
@@ -12116,27 +11999,14 @@
       <w:r>
         <w:t xml:space="preserve">Figure </w:t>
       </w:r>
-      <w:r>
-        <w:fldChar w:fldCharType="begin"/>
-      </w:r>
-      <w:r>
-        <w:instrText xml:space="preserve"> SEQ Figure \* ARABIC </w:instrText>
-      </w:r>
-      <w:r>
-        <w:fldChar w:fldCharType="separate"/>
-      </w:r>
-      <w:r>
-        <w:rPr>
-          <w:noProof/>
-        </w:rPr>
-        <w:t>4</w:t>
-      </w:r>
-      <w:r>
-        <w:rPr>
-          <w:noProof/>
-        </w:rPr>
-        <w:fldChar w:fldCharType="end"/>
-      </w:r>
+      <w:fldSimple w:instr=" SEQ Figure \* ARABIC ">
+        <w:r>
+          <w:rPr>
+            <w:noProof/>
+          </w:rPr>
+          <w:t>4</w:t>
+        </w:r>
+      </w:fldSimple>
       <w:bookmarkEnd w:id="27"/>
       <w:r>
         <w:t xml:space="preserve"> </w:t>
@@ -12232,27 +12102,14 @@
                             <w:r>
                               <w:t xml:space="preserve">Figure </w:t>
                             </w:r>
-                            <w:r>
-                              <w:fldChar w:fldCharType="begin"/>
-                            </w:r>
-                            <w:r>
-                              <w:instrText xml:space="preserve"> SEQ Figure \* ARABIC </w:instrText>
-                            </w:r>
-                            <w:r>
-                              <w:fldChar w:fldCharType="separate"/>
-                            </w:r>
-                            <w:r>
-                              <w:rPr>
-                                <w:noProof/>
-                              </w:rPr>
-                              <w:t>5</w:t>
-                            </w:r>
-                            <w:r>
-                              <w:rPr>
-                                <w:noProof/>
-                              </w:rPr>
-                              <w:fldChar w:fldCharType="end"/>
-                            </w:r>
+                            <w:fldSimple w:instr=" SEQ Figure \* ARABIC ">
+                              <w:r>
+                                <w:rPr>
+                                  <w:noProof/>
+                                </w:rPr>
+                                <w:t>5</w:t>
+                              </w:r>
+                            </w:fldSimple>
                             <w:r>
                               <w:t xml:space="preserve"> </w:t>
                             </w:r>
@@ -12313,27 +12170,14 @@
                       <w:r>
                         <w:t xml:space="preserve">Figure </w:t>
                       </w:r>
-                      <w:r>
-                        <w:fldChar w:fldCharType="begin"/>
-                      </w:r>
-                      <w:r>
-                        <w:instrText xml:space="preserve"> SEQ Figure \* ARABIC </w:instrText>
-                      </w:r>
-                      <w:r>
-                        <w:fldChar w:fldCharType="separate"/>
-                      </w:r>
-                      <w:r>
-                        <w:rPr>
-                          <w:noProof/>
-                        </w:rPr>
-                        <w:t>5</w:t>
-                      </w:r>
-                      <w:r>
-                        <w:rPr>
-                          <w:noProof/>
-                        </w:rPr>
-                        <w:fldChar w:fldCharType="end"/>
-                      </w:r>
+                      <w:fldSimple w:instr=" SEQ Figure \* ARABIC ">
+                        <w:r>
+                          <w:rPr>
+                            <w:noProof/>
+                          </w:rPr>
+                          <w:t>5</w:t>
+                        </w:r>
+                      </w:fldSimple>
                       <w:r>
                         <w:t xml:space="preserve"> </w:t>
                       </w:r>
@@ -12491,27 +12335,14 @@
                             <w:r>
                               <w:t xml:space="preserve">Figure </w:t>
                             </w:r>
-                            <w:r>
-                              <w:fldChar w:fldCharType="begin"/>
-                            </w:r>
-                            <w:r>
-                              <w:instrText xml:space="preserve"> SEQ Figure \* ARABIC </w:instrText>
-                            </w:r>
-                            <w:r>
-                              <w:fldChar w:fldCharType="separate"/>
-                            </w:r>
-                            <w:r>
-                              <w:rPr>
-                                <w:noProof/>
-                              </w:rPr>
-                              <w:t>6</w:t>
-                            </w:r>
-                            <w:r>
-                              <w:rPr>
-                                <w:noProof/>
-                              </w:rPr>
-                              <w:fldChar w:fldCharType="end"/>
-                            </w:r>
+                            <w:fldSimple w:instr=" SEQ Figure \* ARABIC ">
+                              <w:r>
+                                <w:rPr>
+                                  <w:noProof/>
+                                </w:rPr>
+                                <w:t>6</w:t>
+                              </w:r>
+                            </w:fldSimple>
                             <w:r>
                               <w:t xml:space="preserve"> </w:t>
                             </w:r>
@@ -12565,27 +12396,14 @@
                       <w:r>
                         <w:t xml:space="preserve">Figure </w:t>
                       </w:r>
-                      <w:r>
-                        <w:fldChar w:fldCharType="begin"/>
-                      </w:r>
-                      <w:r>
-                        <w:instrText xml:space="preserve"> SEQ Figure \* ARABIC </w:instrText>
-                      </w:r>
-                      <w:r>
-                        <w:fldChar w:fldCharType="separate"/>
-                      </w:r>
-                      <w:r>
-                        <w:rPr>
-                          <w:noProof/>
-                        </w:rPr>
-                        <w:t>6</w:t>
-                      </w:r>
-                      <w:r>
-                        <w:rPr>
-                          <w:noProof/>
-                        </w:rPr>
-                        <w:fldChar w:fldCharType="end"/>
-                      </w:r>
+                      <w:fldSimple w:instr=" SEQ Figure \* ARABIC ">
+                        <w:r>
+                          <w:rPr>
+                            <w:noProof/>
+                          </w:rPr>
+                          <w:t>6</w:t>
+                        </w:r>
+                      </w:fldSimple>
                       <w:r>
                         <w:t xml:space="preserve"> </w:t>
                       </w:r>
@@ -12825,27 +12643,14 @@
       <w:r>
         <w:t xml:space="preserve">Figure </w:t>
       </w:r>
-      <w:r>
-        <w:fldChar w:fldCharType="begin"/>
-      </w:r>
-      <w:r>
-        <w:instrText xml:space="preserve"> SEQ Figure \* ARABIC </w:instrText>
-      </w:r>
-      <w:r>
-        <w:fldChar w:fldCharType="separate"/>
-      </w:r>
-      <w:r>
-        <w:rPr>
-          <w:noProof/>
-        </w:rPr>
-        <w:t>7</w:t>
-      </w:r>
-      <w:r>
-        <w:rPr>
-          <w:noProof/>
-        </w:rPr>
-        <w:fldChar w:fldCharType="end"/>
-      </w:r>
+      <w:fldSimple w:instr=" SEQ Figure \* ARABIC ">
+        <w:r>
+          <w:rPr>
+            <w:noProof/>
+          </w:rPr>
+          <w:t>7</w:t>
+        </w:r>
+      </w:fldSimple>
       <w:r>
         <w:t xml:space="preserve"> </w:t>
       </w:r>
@@ -12953,27 +12758,14 @@
       <w:r>
         <w:t xml:space="preserve">Figure </w:t>
       </w:r>
-      <w:r>
-        <w:fldChar w:fldCharType="begin"/>
-      </w:r>
-      <w:r>
-        <w:instrText xml:space="preserve"> SEQ Figure \* ARABIC </w:instrText>
-      </w:r>
-      <w:r>
-        <w:fldChar w:fldCharType="separate"/>
-      </w:r>
-      <w:r>
-        <w:rPr>
-          <w:noProof/>
-        </w:rPr>
-        <w:t>8</w:t>
-      </w:r>
-      <w:r>
-        <w:rPr>
-          <w:noProof/>
-        </w:rPr>
-        <w:fldChar w:fldCharType="end"/>
-      </w:r>
+      <w:fldSimple w:instr=" SEQ Figure \* ARABIC ">
+        <w:r>
+          <w:rPr>
+            <w:noProof/>
+          </w:rPr>
+          <w:t>8</w:t>
+        </w:r>
+      </w:fldSimple>
       <w:r>
         <w:t xml:space="preserve"> </w:t>
       </w:r>
@@ -13060,27 +12852,14 @@
                             <w:r>
                               <w:t xml:space="preserve">Figure </w:t>
                             </w:r>
-                            <w:r>
-                              <w:fldChar w:fldCharType="begin"/>
-                            </w:r>
-                            <w:r>
-                              <w:instrText xml:space="preserve"> SEQ Figure \* ARABIC </w:instrText>
-                            </w:r>
-                            <w:r>
-                              <w:fldChar w:fldCharType="separate"/>
-                            </w:r>
-                            <w:r>
-                              <w:rPr>
-                                <w:noProof/>
-                              </w:rPr>
-                              <w:t>9</w:t>
-                            </w:r>
-                            <w:r>
-                              <w:rPr>
-                                <w:noProof/>
-                              </w:rPr>
-                              <w:fldChar w:fldCharType="end"/>
-                            </w:r>
+                            <w:fldSimple w:instr=" SEQ Figure \* ARABIC ">
+                              <w:r>
+                                <w:rPr>
+                                  <w:noProof/>
+                                </w:rPr>
+                                <w:t>9</w:t>
+                              </w:r>
+                            </w:fldSimple>
                             <w:r>
                               <w:t xml:space="preserve"> </w:t>
                             </w:r>
@@ -13134,27 +12913,14 @@
                       <w:r>
                         <w:t xml:space="preserve">Figure </w:t>
                       </w:r>
-                      <w:r>
-                        <w:fldChar w:fldCharType="begin"/>
-                      </w:r>
-                      <w:r>
-                        <w:instrText xml:space="preserve"> SEQ Figure \* ARABIC </w:instrText>
-                      </w:r>
-                      <w:r>
-                        <w:fldChar w:fldCharType="separate"/>
-                      </w:r>
-                      <w:r>
-                        <w:rPr>
-                          <w:noProof/>
-                        </w:rPr>
-                        <w:t>9</w:t>
-                      </w:r>
-                      <w:r>
-                        <w:rPr>
-                          <w:noProof/>
-                        </w:rPr>
-                        <w:fldChar w:fldCharType="end"/>
-                      </w:r>
+                      <w:fldSimple w:instr=" SEQ Figure \* ARABIC ">
+                        <w:r>
+                          <w:rPr>
+                            <w:noProof/>
+                          </w:rPr>
+                          <w:t>9</w:t>
+                        </w:r>
+                      </w:fldSimple>
                       <w:r>
                         <w:t xml:space="preserve"> </w:t>
                       </w:r>
@@ -13695,27 +13461,14 @@
       <w:r>
         <w:t xml:space="preserve">Table </w:t>
       </w:r>
-      <w:r>
-        <w:fldChar w:fldCharType="begin"/>
-      </w:r>
-      <w:r>
-        <w:instrText xml:space="preserve"> SEQ Table \* ARABIC </w:instrText>
-      </w:r>
-      <w:r>
-        <w:fldChar w:fldCharType="separate"/>
-      </w:r>
-      <w:r>
-        <w:rPr>
-          <w:noProof/>
-        </w:rPr>
-        <w:t>4</w:t>
-      </w:r>
-      <w:r>
-        <w:rPr>
-          <w:noProof/>
-        </w:rPr>
-        <w:fldChar w:fldCharType="end"/>
-      </w:r>
+      <w:fldSimple w:instr=" SEQ Table \* ARABIC ">
+        <w:r>
+          <w:rPr>
+            <w:noProof/>
+          </w:rPr>
+          <w:t>4</w:t>
+        </w:r>
+      </w:fldSimple>
       <w:bookmarkEnd w:id="37"/>
       <w:r>
         <w:t xml:space="preserve"> </w:t>
@@ -13753,7 +13506,7 @@
       <w:pPr>
         <w:pStyle w:val="Heading2"/>
       </w:pPr>
-      <w:bookmarkStart w:id="39" w:name="_Toc224063986"/>
+      <w:bookmarkStart w:id="39" w:name="_Toc224288358"/>
       <w:r>
         <w:lastRenderedPageBreak/>
         <w:t>Justification of Design Choices and Limitations</w:t>
@@ -13764,7 +13517,7 @@
       <w:pPr>
         <w:pStyle w:val="Heading3"/>
       </w:pPr>
-      <w:bookmarkStart w:id="40" w:name="_Toc224063987"/>
+      <w:bookmarkStart w:id="40" w:name="_Toc224288359"/>
       <w:r>
         <w:t>Machine Learning</w:t>
       </w:r>
@@ -13791,7 +13544,7 @@
       <w:pPr>
         <w:pStyle w:val="Heading3"/>
       </w:pPr>
-      <w:bookmarkStart w:id="41" w:name="_Toc224063988"/>
+      <w:bookmarkStart w:id="41" w:name="_Toc224288360"/>
       <w:r>
         <w:t>Pathfinding / Traversal Algorithms</w:t>
       </w:r>
@@ -13971,7 +13724,7 @@
       <w:pPr>
         <w:pStyle w:val="Heading2"/>
       </w:pPr>
-      <w:bookmarkStart w:id="42" w:name="_Toc224063989"/>
+      <w:bookmarkStart w:id="42" w:name="_Toc224288361"/>
       <w:r>
         <w:lastRenderedPageBreak/>
         <w:t>Project Objectives</w:t>
@@ -14854,7 +14607,7 @@
           <w:docGrid w:linePitch="360"/>
         </w:sectPr>
       </w:pPr>
-      <w:bookmarkStart w:id="43" w:name="_Toc224063990"/>
+      <w:bookmarkStart w:id="43" w:name="_Toc224288362"/>
       <w:r>
         <w:t>Design</w:t>
       </w:r>
@@ -14864,7 +14617,7 @@
       <w:pPr>
         <w:pStyle w:val="Heading2"/>
       </w:pPr>
-      <w:bookmarkStart w:id="44" w:name="_Toc224063991"/>
+      <w:bookmarkStart w:id="44" w:name="_Toc224288363"/>
       <w:r>
         <w:lastRenderedPageBreak/>
         <w:t>Description</w:t>
@@ -14901,7 +14654,7 @@
       <w:pPr>
         <w:pStyle w:val="Heading2"/>
       </w:pPr>
-      <w:bookmarkStart w:id="45" w:name="_Toc224063992"/>
+      <w:bookmarkStart w:id="45" w:name="_Toc224288364"/>
       <w:r>
         <w:lastRenderedPageBreak/>
         <w:t>Data Design</w:t>
@@ -14912,7 +14665,7 @@
       <w:pPr>
         <w:pStyle w:val="Heading3"/>
       </w:pPr>
-      <w:bookmarkStart w:id="46" w:name="_Toc224063993"/>
+      <w:bookmarkStart w:id="46" w:name="_Toc224288365"/>
       <w:r>
         <w:t>Grid Representation</w:t>
       </w:r>
@@ -14947,7 +14700,7 @@
       <w:pPr>
         <w:pStyle w:val="Heading3"/>
       </w:pPr>
-      <w:bookmarkStart w:id="47" w:name="_Toc224063994"/>
+      <w:bookmarkStart w:id="47" w:name="_Toc224288366"/>
       <w:r>
         <w:t>Agent Representation</w:t>
       </w:r>
@@ -14965,7 +14718,7 @@
       <w:pPr>
         <w:pStyle w:val="Heading3"/>
       </w:pPr>
-      <w:bookmarkStart w:id="48" w:name="_Toc224063995"/>
+      <w:bookmarkStart w:id="48" w:name="_Toc224288367"/>
       <w:r>
         <w:t>Hazard Representation</w:t>
       </w:r>
@@ -14980,7 +14733,7 @@
       <w:pPr>
         <w:pStyle w:val="Heading3"/>
       </w:pPr>
-      <w:bookmarkStart w:id="49" w:name="_Toc224063996"/>
+      <w:bookmarkStart w:id="49" w:name="_Toc224288368"/>
       <w:r>
         <w:t>Simulation State and Metrics</w:t>
       </w:r>
@@ -15003,7 +14756,7 @@
       <w:pPr>
         <w:pStyle w:val="Heading2"/>
       </w:pPr>
-      <w:bookmarkStart w:id="50" w:name="_Toc224063997"/>
+      <w:bookmarkStart w:id="50" w:name="_Toc224288369"/>
       <w:r>
         <w:lastRenderedPageBreak/>
         <w:t>Simulation Design</w:t>
@@ -15064,7 +14817,7 @@
       <w:pPr>
         <w:pStyle w:val="Heading2"/>
       </w:pPr>
-      <w:bookmarkStart w:id="51" w:name="_Toc224063998"/>
+      <w:bookmarkStart w:id="51" w:name="_Toc224288370"/>
       <w:r>
         <w:lastRenderedPageBreak/>
         <w:t>Interface Design</w:t>
@@ -15104,7 +14857,7 @@
       <w:pPr>
         <w:pStyle w:val="Heading3"/>
       </w:pPr>
-      <w:bookmarkStart w:id="52" w:name="_Toc224063999"/>
+      <w:bookmarkStart w:id="52" w:name="_Toc224288371"/>
       <w:r>
         <w:t>Interface Sketch</w:t>
       </w:r>
@@ -15165,27 +14918,14 @@
       <w:r>
         <w:t xml:space="preserve">Figure </w:t>
       </w:r>
-      <w:r>
-        <w:fldChar w:fldCharType="begin"/>
-      </w:r>
-      <w:r>
-        <w:instrText xml:space="preserve"> SEQ Figure \* ARABIC </w:instrText>
-      </w:r>
-      <w:r>
-        <w:fldChar w:fldCharType="separate"/>
-      </w:r>
-      <w:r>
-        <w:rPr>
-          <w:noProof/>
-        </w:rPr>
-        <w:t>10</w:t>
-      </w:r>
-      <w:r>
-        <w:rPr>
-          <w:noProof/>
-        </w:rPr>
-        <w:fldChar w:fldCharType="end"/>
-      </w:r>
+      <w:fldSimple w:instr=" SEQ Figure \* ARABIC ">
+        <w:r>
+          <w:rPr>
+            <w:noProof/>
+          </w:rPr>
+          <w:t>10</w:t>
+        </w:r>
+      </w:fldSimple>
       <w:r>
         <w:t xml:space="preserve"> </w:t>
       </w:r>
@@ -15347,27 +15087,14 @@
       <w:r>
         <w:t xml:space="preserve">Figure </w:t>
       </w:r>
-      <w:r>
-        <w:fldChar w:fldCharType="begin"/>
-      </w:r>
-      <w:r>
-        <w:instrText xml:space="preserve"> SEQ Figure \* ARABIC </w:instrText>
-      </w:r>
-      <w:r>
-        <w:fldChar w:fldCharType="separate"/>
-      </w:r>
-      <w:r>
-        <w:rPr>
-          <w:noProof/>
-        </w:rPr>
-        <w:t>11</w:t>
-      </w:r>
-      <w:r>
-        <w:rPr>
-          <w:noProof/>
-        </w:rPr>
-        <w:fldChar w:fldCharType="end"/>
-      </w:r>
+      <w:fldSimple w:instr=" SEQ Figure \* ARABIC ">
+        <w:r>
+          <w:rPr>
+            <w:noProof/>
+          </w:rPr>
+          <w:t>11</w:t>
+        </w:r>
+      </w:fldSimple>
       <w:bookmarkEnd w:id="54"/>
       <w:r>
         <w:t xml:space="preserve"> </w:t>
@@ -15436,7 +15163,7 @@
       <w:pPr>
         <w:pStyle w:val="Heading2"/>
       </w:pPr>
-      <w:bookmarkStart w:id="56" w:name="_Toc224064000"/>
+      <w:bookmarkStart w:id="56" w:name="_Toc224288372"/>
       <w:r>
         <w:lastRenderedPageBreak/>
         <w:t>System Architecture</w:t>
@@ -15447,7 +15174,7 @@
       <w:pPr>
         <w:pStyle w:val="Heading3"/>
       </w:pPr>
-      <w:bookmarkStart w:id="57" w:name="_Toc224064001"/>
+      <w:bookmarkStart w:id="57" w:name="_Toc224288373"/>
       <w:r>
         <w:t>Top-Down Design</w:t>
       </w:r>
@@ -15513,27 +15240,14 @@
       <w:r>
         <w:t xml:space="preserve">Figure </w:t>
       </w:r>
-      <w:r>
-        <w:fldChar w:fldCharType="begin"/>
-      </w:r>
-      <w:r>
-        <w:instrText xml:space="preserve"> SEQ Figure \* ARABIC </w:instrText>
-      </w:r>
-      <w:r>
-        <w:fldChar w:fldCharType="separate"/>
-      </w:r>
-      <w:r>
-        <w:rPr>
-          <w:noProof/>
-        </w:rPr>
-        <w:t>12</w:t>
-      </w:r>
-      <w:r>
-        <w:rPr>
-          <w:noProof/>
-        </w:rPr>
-        <w:fldChar w:fldCharType="end"/>
-      </w:r>
+      <w:fldSimple w:instr=" SEQ Figure \* ARABIC ">
+        <w:r>
+          <w:rPr>
+            <w:noProof/>
+          </w:rPr>
+          <w:t>12</w:t>
+        </w:r>
+      </w:fldSimple>
       <w:r>
         <w:t xml:space="preserve"> </w:t>
       </w:r>
@@ -15550,7 +15264,7 @@
       <w:pPr>
         <w:pStyle w:val="Heading2"/>
       </w:pPr>
-      <w:bookmarkStart w:id="59" w:name="_Toc224064002"/>
+      <w:bookmarkStart w:id="59" w:name="_Toc224288374"/>
       <w:r>
         <w:lastRenderedPageBreak/>
         <w:t>Full UML Class Diagram</w:t>
@@ -15634,27 +15348,14 @@
       <w:r>
         <w:t xml:space="preserve">Figure </w:t>
       </w:r>
-      <w:r>
-        <w:fldChar w:fldCharType="begin"/>
-      </w:r>
-      <w:r>
-        <w:instrText xml:space="preserve"> SEQ Figure \* ARABIC </w:instrText>
-      </w:r>
-      <w:r>
-        <w:fldChar w:fldCharType="separate"/>
-      </w:r>
-      <w:r>
-        <w:rPr>
-          <w:noProof/>
-        </w:rPr>
-        <w:t>13</w:t>
-      </w:r>
-      <w:r>
-        <w:rPr>
-          <w:noProof/>
-        </w:rPr>
-        <w:fldChar w:fldCharType="end"/>
-      </w:r>
+      <w:fldSimple w:instr=" SEQ Figure \* ARABIC ">
+        <w:r>
+          <w:rPr>
+            <w:noProof/>
+          </w:rPr>
+          <w:t>13</w:t>
+        </w:r>
+      </w:fldSimple>
       <w:r>
         <w:t xml:space="preserve"> </w:t>
       </w:r>
@@ -15671,7 +15372,7 @@
       <w:pPr>
         <w:pStyle w:val="Heading2"/>
       </w:pPr>
-      <w:bookmarkStart w:id="61" w:name="_Toc224064003"/>
+      <w:bookmarkStart w:id="61" w:name="_Toc224288375"/>
       <w:r>
         <w:lastRenderedPageBreak/>
         <w:t>Algorithm Design</w:t>
@@ -15687,7 +15388,7 @@
       <w:pPr>
         <w:pStyle w:val="Heading3"/>
       </w:pPr>
-      <w:bookmarkStart w:id="62" w:name="_Toc224064004"/>
+      <w:bookmarkStart w:id="62" w:name="_Toc224288376"/>
       <w:r>
         <w:t>Simulation Class</w:t>
       </w:r>
@@ -16448,7 +16149,7 @@
       <w:pPr>
         <w:pStyle w:val="Heading3"/>
       </w:pPr>
-      <w:bookmarkStart w:id="63" w:name="_Toc224064005"/>
+      <w:bookmarkStart w:id="63" w:name="_Toc224288377"/>
       <w:r>
         <w:t>Pathfinder Class</w:t>
       </w:r>
@@ -17720,7 +17421,7 @@
       <w:pPr>
         <w:pStyle w:val="Heading3"/>
       </w:pPr>
-      <w:bookmarkStart w:id="64" w:name="_Toc224064006"/>
+      <w:bookmarkStart w:id="64" w:name="_Toc224288378"/>
       <w:r>
         <w:t>Agent Class</w:t>
       </w:r>
@@ -18071,7 +17772,7 @@
       <w:pPr>
         <w:pStyle w:val="Heading3"/>
       </w:pPr>
-      <w:bookmarkStart w:id="65" w:name="_Toc224064007"/>
+      <w:bookmarkStart w:id="65" w:name="_Toc224288379"/>
       <w:r>
         <w:t>Hazard Class</w:t>
       </w:r>
@@ -18168,7 +17869,7 @@
       <w:pPr>
         <w:pStyle w:val="Heading3"/>
       </w:pPr>
-      <w:bookmarkStart w:id="66" w:name="_Toc224064008"/>
+      <w:bookmarkStart w:id="66" w:name="_Toc224288380"/>
       <w:r>
         <w:t>SimulationMetrics Class</w:t>
       </w:r>
@@ -18743,7 +18444,7 @@
       <w:pPr>
         <w:pStyle w:val="Heading3"/>
       </w:pPr>
-      <w:bookmarkStart w:id="67" w:name="_Toc224064009"/>
+      <w:bookmarkStart w:id="67" w:name="_Toc224288381"/>
       <w:r>
         <w:t>Grid Class</w:t>
       </w:r>
@@ -19082,7 +18783,7 @@
       <w:pPr>
         <w:pStyle w:val="Heading3"/>
       </w:pPr>
-      <w:bookmarkStart w:id="68" w:name="_Toc224064010"/>
+      <w:bookmarkStart w:id="68" w:name="_Toc224288382"/>
       <w:r>
         <w:t>ScenarioManager Class</w:t>
       </w:r>
@@ -19272,7 +18973,7 @@
       <w:pPr>
         <w:pStyle w:val="Heading3"/>
       </w:pPr>
-      <w:bookmarkStart w:id="69" w:name="_Toc224064011"/>
+      <w:bookmarkStart w:id="69" w:name="_Toc224288383"/>
       <w:r>
         <w:t>RecommendationEngine Class</w:t>
       </w:r>
@@ -20304,7 +20005,7 @@
         </w:sectPr>
       </w:pPr>
     </w:p>
-    <w:bookmarkStart w:id="70" w:name="_Toc224064012" w:displacedByCustomXml="next"/>
+    <w:bookmarkStart w:id="70" w:name="_Toc224288384" w:displacedByCustomXml="next"/>
     <w:sdt>
       <w:sdtPr>
         <w:rPr>
@@ -21206,7 +20907,7 @@
       <w:pPr>
         <w:pStyle w:val="Heading1"/>
       </w:pPr>
-      <w:bookmarkStart w:id="71" w:name="_Toc224064013"/>
+      <w:bookmarkStart w:id="71" w:name="_Toc224288385"/>
       <w:r>
         <w:lastRenderedPageBreak/>
         <w:t>Appendix</w:t>
@@ -21217,7 +20918,7 @@
       <w:pPr>
         <w:pStyle w:val="Heading2"/>
       </w:pPr>
-      <w:bookmarkStart w:id="72" w:name="_Toc224064014"/>
+      <w:bookmarkStart w:id="72" w:name="_Toc224288386"/>
       <w:r>
         <w:t>Appendix A – Supporting Pseudocode</w:t>
       </w:r>
@@ -21227,7 +20928,7 @@
       <w:pPr>
         <w:pStyle w:val="Heading3"/>
       </w:pPr>
-      <w:bookmarkStart w:id="73" w:name="_Toc224064015"/>
+      <w:bookmarkStart w:id="73" w:name="_Toc224288387"/>
       <w:r>
         <w:t>A.1 Simulation Helper Methods</w:t>
       </w:r>
@@ -22051,7 +21752,7 @@
       <w:pPr>
         <w:pStyle w:val="Heading3"/>
       </w:pPr>
-      <w:bookmarkStart w:id="74" w:name="_Toc224064016"/>
+      <w:bookmarkStart w:id="74" w:name="_Toc224288388"/>
       <w:r>
         <w:t>A.2 Additional pathfinding helper methods</w:t>
       </w:r>
@@ -22715,7 +22416,7 @@
       <w:pPr>
         <w:pStyle w:val="Heading3"/>
       </w:pPr>
-      <w:bookmarkStart w:id="75" w:name="_Toc224064017"/>
+      <w:bookmarkStart w:id="75" w:name="_Toc224288389"/>
       <w:r>
         <w:t>A.3 Supporting Agent Methods</w:t>
       </w:r>
@@ -22844,7 +22545,7 @@
       <w:pPr>
         <w:pStyle w:val="Heading3"/>
       </w:pPr>
-      <w:bookmarkStart w:id="76" w:name="_Toc224064018"/>
+      <w:bookmarkStart w:id="76" w:name="_Toc224288390"/>
       <w:r>
         <w:t>A.4 Hazard/Metrics/Grid Helper Methods</w:t>
       </w:r>
@@ -23431,7 +23132,7 @@
       <w:pPr>
         <w:pStyle w:val="Heading3"/>
       </w:pPr>
-      <w:bookmarkStart w:id="77" w:name="_Toc224064019"/>
+      <w:bookmarkStart w:id="77" w:name="_Toc224288391"/>
       <w:r>
         <w:t>A.5 Basic Scenario Management Methods</w:t>
       </w:r>
@@ -23844,7 +23545,7 @@
       <w:pPr>
         <w:pStyle w:val="Heading1"/>
       </w:pPr>
-      <w:bookmarkStart w:id="78" w:name="_Toc224064020"/>
+      <w:bookmarkStart w:id="78" w:name="_Toc224288392"/>
       <w:r>
         <w:lastRenderedPageBreak/>
         <w:t>Table of Figures</w:t>
@@ -23855,7 +23556,7 @@
       <w:pPr>
         <w:pStyle w:val="Heading2"/>
       </w:pPr>
-      <w:bookmarkStart w:id="79" w:name="_Toc224064021"/>
+      <w:bookmarkStart w:id="79" w:name="_Toc224288393"/>
       <w:r>
         <w:t>Figures</w:t>
       </w:r>
@@ -24839,7 +24540,7 @@
       <w:r>
         <w:fldChar w:fldCharType="end"/>
       </w:r>
-      <w:bookmarkStart w:id="80" w:name="_Toc224064022"/>
+      <w:bookmarkStart w:id="80" w:name="_Toc224288394"/>
       <w:r>
         <w:t>Tables</w:t>
       </w:r>
@@ -32438,6 +32139,126 @@
       <w:rFonts w:ascii="Consolas" w:hAnsi="Consolas"/>
       <w:sz w:val="24"/>
       <w:szCs w:val="24"/>
+    </w:rPr>
+  </w:style>
+  <w:style w:type="paragraph" w:styleId="TOC4">
+    <w:name w:val="toc 4"/>
+    <w:basedOn w:val="Normal"/>
+    <w:next w:val="Normal"/>
+    <w:autoRedefine/>
+    <w:uiPriority w:val="39"/>
+    <w:unhideWhenUsed/>
+    <w:rsid w:val="007B1821"/>
+    <w:pPr>
+      <w:spacing w:after="100"/>
+      <w:ind w:left="720"/>
+    </w:pPr>
+  </w:style>
+  <w:style w:type="paragraph" w:styleId="TOC5">
+    <w:name w:val="toc 5"/>
+    <w:basedOn w:val="Normal"/>
+    <w:next w:val="Normal"/>
+    <w:autoRedefine/>
+    <w:uiPriority w:val="39"/>
+    <w:unhideWhenUsed/>
+    <w:rsid w:val="007B1821"/>
+    <w:pPr>
+      <w:spacing w:after="100" w:line="278" w:lineRule="auto"/>
+      <w:ind w:left="960"/>
+      <w:jc w:val="left"/>
+    </w:pPr>
+    <w:rPr>
+      <w:kern w:val="2"/>
+      <w:lang w:eastAsia="en-GB"/>
+      <w14:ligatures w14:val="standardContextual"/>
+    </w:rPr>
+  </w:style>
+  <w:style w:type="paragraph" w:styleId="TOC6">
+    <w:name w:val="toc 6"/>
+    <w:basedOn w:val="Normal"/>
+    <w:next w:val="Normal"/>
+    <w:autoRedefine/>
+    <w:uiPriority w:val="39"/>
+    <w:unhideWhenUsed/>
+    <w:rsid w:val="007B1821"/>
+    <w:pPr>
+      <w:spacing w:after="100" w:line="278" w:lineRule="auto"/>
+      <w:ind w:left="1200"/>
+      <w:jc w:val="left"/>
+    </w:pPr>
+    <w:rPr>
+      <w:kern w:val="2"/>
+      <w:lang w:eastAsia="en-GB"/>
+      <w14:ligatures w14:val="standardContextual"/>
+    </w:rPr>
+  </w:style>
+  <w:style w:type="paragraph" w:styleId="TOC7">
+    <w:name w:val="toc 7"/>
+    <w:basedOn w:val="Normal"/>
+    <w:next w:val="Normal"/>
+    <w:autoRedefine/>
+    <w:uiPriority w:val="39"/>
+    <w:unhideWhenUsed/>
+    <w:rsid w:val="007B1821"/>
+    <w:pPr>
+      <w:spacing w:after="100" w:line="278" w:lineRule="auto"/>
+      <w:ind w:left="1440"/>
+      <w:jc w:val="left"/>
+    </w:pPr>
+    <w:rPr>
+      <w:kern w:val="2"/>
+      <w:lang w:eastAsia="en-GB"/>
+      <w14:ligatures w14:val="standardContextual"/>
+    </w:rPr>
+  </w:style>
+  <w:style w:type="paragraph" w:styleId="TOC8">
+    <w:name w:val="toc 8"/>
+    <w:basedOn w:val="Normal"/>
+    <w:next w:val="Normal"/>
+    <w:autoRedefine/>
+    <w:uiPriority w:val="39"/>
+    <w:unhideWhenUsed/>
+    <w:rsid w:val="007B1821"/>
+    <w:pPr>
+      <w:spacing w:after="100" w:line="278" w:lineRule="auto"/>
+      <w:ind w:left="1680"/>
+      <w:jc w:val="left"/>
+    </w:pPr>
+    <w:rPr>
+      <w:kern w:val="2"/>
+      <w:lang w:eastAsia="en-GB"/>
+      <w14:ligatures w14:val="standardContextual"/>
+    </w:rPr>
+  </w:style>
+  <w:style w:type="paragraph" w:styleId="TOC9">
+    <w:name w:val="toc 9"/>
+    <w:basedOn w:val="Normal"/>
+    <w:next w:val="Normal"/>
+    <w:autoRedefine/>
+    <w:uiPriority w:val="39"/>
+    <w:unhideWhenUsed/>
+    <w:rsid w:val="007B1821"/>
+    <w:pPr>
+      <w:spacing w:after="100" w:line="278" w:lineRule="auto"/>
+      <w:ind w:left="1920"/>
+      <w:jc w:val="left"/>
+    </w:pPr>
+    <w:rPr>
+      <w:kern w:val="2"/>
+      <w:lang w:eastAsia="en-GB"/>
+      <w14:ligatures w14:val="standardContextual"/>
+    </w:rPr>
+  </w:style>
+  <w:style w:type="character" w:styleId="UnresolvedMention">
+    <w:name w:val="Unresolved Mention"/>
+    <w:basedOn w:val="DefaultParagraphFont"/>
+    <w:uiPriority w:val="99"/>
+    <w:semiHidden/>
+    <w:unhideWhenUsed/>
+    <w:rsid w:val="007B1821"/>
+    <w:rPr>
+      <w:color w:val="605E5C"/>
+      <w:shd w:val="clear" w:color="auto" w:fill="E1DFDD"/>
     </w:rPr>
   </w:style>
 </w:styles>
@@ -41450,12 +41271,11 @@
 </file>
 
 <file path=customXml/item2.xml><?xml version="1.0" encoding="utf-8"?>
-<?mso-contentType ?>
-<FormTemplates xmlns="http://schemas.microsoft.com/sharepoint/v3/contenttype/forms">
-  <Display>DocumentLibraryForm</Display>
-  <Edit>DocumentLibraryForm</Edit>
-  <New>DocumentLibraryForm</New>
-</FormTemplates>
+<p:properties xmlns:p="http://schemas.microsoft.com/office/2006/metadata/properties" xmlns:xsi="http://www.w3.org/2001/XMLSchema-instance" xmlns:pc="http://schemas.microsoft.com/office/infopath/2007/PartnerControls">
+  <documentManagement>
+    <_activity xmlns="5f4a01da-b34a-4766-b768-c35ceb02cbc3" xsi:nil="true"/>
+  </documentManagement>
+</p:properties>
 </file>
 
 <file path=customXml/item3.xml><?xml version="1.0" encoding="utf-8"?>
@@ -42047,11 +41867,12 @@
 </file>
 
 <file path=customXml/item4.xml><?xml version="1.0" encoding="utf-8"?>
-<p:properties xmlns:p="http://schemas.microsoft.com/office/2006/metadata/properties" xmlns:xsi="http://www.w3.org/2001/XMLSchema-instance" xmlns:pc="http://schemas.microsoft.com/office/infopath/2007/PartnerControls">
-  <documentManagement>
-    <_activity xmlns="5f4a01da-b34a-4766-b768-c35ceb02cbc3" xsi:nil="true"/>
-  </documentManagement>
-</p:properties>
+<?mso-contentType ?>
+<FormTemplates xmlns="http://schemas.microsoft.com/sharepoint/v3/contenttype/forms">
+  <Display>DocumentLibraryForm</Display>
+  <Edit>DocumentLibraryForm</Edit>
+  <New>DocumentLibraryForm</New>
+</FormTemplates>
 </file>
 
 <file path=customXml/itemProps1.xml><?xml version="1.0" encoding="utf-8"?>
@@ -42074,9 +41895,11 @@
 </file>
 
 <file path=customXml/itemProps2.xml><?xml version="1.0" encoding="utf-8"?>
-<ds:datastoreItem xmlns:ds="http://schemas.openxmlformats.org/officeDocument/2006/customXml" ds:itemID="{915FD409-9B20-470D-AC90-3D4035788ECE}">
+<ds:datastoreItem xmlns:ds="http://schemas.openxmlformats.org/officeDocument/2006/customXml" ds:itemID="{42527EE8-AF54-48EF-AE79-A35F49790338}">
   <ds:schemaRefs>
-    <ds:schemaRef ds:uri="http://schemas.microsoft.com/sharepoint/v3/contenttype/forms"/>
+    <ds:schemaRef ds:uri="http://schemas.microsoft.com/office/2006/metadata/properties"/>
+    <ds:schemaRef ds:uri="http://schemas.microsoft.com/office/infopath/2007/PartnerControls"/>
+    <ds:schemaRef ds:uri="5f4a01da-b34a-4766-b768-c35ceb02cbc3"/>
   </ds:schemaRefs>
 </ds:datastoreItem>
 </file>
@@ -42090,11 +41913,9 @@
 </file>
 
 <file path=customXml/itemProps4.xml><?xml version="1.0" encoding="utf-8"?>
-<ds:datastoreItem xmlns:ds="http://schemas.openxmlformats.org/officeDocument/2006/customXml" ds:itemID="{42527EE8-AF54-48EF-AE79-A35F49790338}">
+<ds:datastoreItem xmlns:ds="http://schemas.openxmlformats.org/officeDocument/2006/customXml" ds:itemID="{915FD409-9B20-470D-AC90-3D4035788ECE}">
   <ds:schemaRefs>
-    <ds:schemaRef ds:uri="http://schemas.microsoft.com/office/2006/metadata/properties"/>
-    <ds:schemaRef ds:uri="http://schemas.microsoft.com/office/infopath/2007/PartnerControls"/>
-    <ds:schemaRef ds:uri="5f4a01da-b34a-4766-b768-c35ceb02cbc3"/>
+    <ds:schemaRef ds:uri="http://schemas.microsoft.com/sharepoint/v3/contenttype/forms"/>
   </ds:schemaRefs>
 </ds:datastoreItem>
 </file>
</xml_diff>